<commit_message>
Docs (DB refactor step 14): design and architecture 0.7 -- databases, publish step, sources, decisions A-D, cron, freshness table
Co-Authored-By: Claude Opus 5.5 <noreply@anthropic.com>
</commit_message>
<xml_diff>
--- a/0_documentation/designAndArchitecture_0.4.docx
+++ b/0_documentation/designAndArchitecture_0.4.docx
@@ -204,7 +204,7 @@
                 <w:rFonts w:eastAsia="Courier New"/>
                 <w:highlight w:val="yellow"/>
               </w:rPr>
-              <w:t>0.6</w:t>
+              <w:t>0.7</w:t>
             </w:r>
           </w:p>
         </w:tc>
@@ -250,7 +250,7 @@
               <w:rPr>
                 <w:rFonts w:eastAsia="Courier New"/>
               </w:rPr>
-              <w:t>2026-10-09</w:t>
+              <w:t>2026-10-22</w:t>
             </w:r>
           </w:p>
         </w:tc>
@@ -2525,7 +2525,7 @@
           <w:b/>
           <w:bCs/>
         </w:rPr>
-        <w:t>SQLite (via Python’s built-in sqlite3 module) — Zero-ops embedded database already in use for space_news.db; comfortably handles current and expected ingestion volumes (TLEs, news, weather snapshots) without the operational overhead of running a separate database server.</w:t>
+        <w:t>SQLite (via Python’s built-in sqlite3 module) — Zero-ops embedded database used for every database in the project (databases/); comfortably handles current and expected ingestion volumes (orbital elements, news, weather snapshots) without the operational overhead of running a separate database server.</w:t>
       </w:r>
     </w:p>
     <w:p>
@@ -2626,10 +2626,7 @@
           <w:b/>
           <w:bCs/>
         </w:rPr>
-        <w:t>satellite.js</w:t>
-      </w:r>
-      <w:r>
-        <w:t xml:space="preserve"> — The standard JavaScript port of the SGP4/SDP4 orbit propagator; runs entirely client-side against the TLE data already pulled from CelesTrak, and covers ground tracks, the overhead-now predictor, GEO-belt density and sensor cones without any server round-trip.</w:t>
+        <w:t>satellite.js — The standard JavaScript port of the SGP4/SDP4 orbit propagator; runs entirely client-side against the orbital elements already pulled from the NORAD satellite catalogue (via Space-Track), and covers ground tracks, the overhead-now predictor, GEO-belt density and sensor cones without any server round-trip.</w:t>
       </w:r>
     </w:p>
     <w:p>
@@ -2799,7 +2796,7 @@
         <w:rPr>
           <w:highlight w:val="yellow"/>
         </w:rPr>
-        <w:t>assets/onOrbitPanel.js — Scaffold; the ON-ORBIT overview section (what is on orbit by nationality, sector, orbital inclination and altitude): its own control area and main-area placeholder so far, lazy-loaded by openOnOrbitSection(). Its data is to come from GCAT (gcat.db) joined to orbitalObjects.db by NORAD number.</w:t>
+        <w:t>assets/onOrbitPanel.js — Scaffold; the ON-ORBIT overview section (what is on orbit by nationality, sector, orbital inclination and altitude): its own control area and main-area placeholder so far, lazy-loaded by openOnOrbitSection(). Its data comes from siteOrbital.db: GCAT joined to the NORAD catalogue by NORAD number (see On-Orbit Overview).</w:t>
       </w:r>
     </w:p>
     <w:p>
@@ -2865,7 +2862,7 @@
         </w:numPr>
       </w:pPr>
       <w:r>
-        <w:t>One short-lived script per data domain, rather than a single shared process — The API server (server.py) serves the endpoints the client calls; each data-ingestion job runs as its own script on its own cron schedule — news and the orbital-object pipeline so far, with space weather, launches and Earth observation imagery to follow. This keeps each script’s code and responsibilities simple, and a failed or slow run in one job can’t stall the API server or any other job. The orbital pipeline’s four steps (ingestOrbitalData, ingestSatcat, enrichEirp, ingestSatnogsRf) run in order within one cron job, scripts/runPipeline.sh, since the later steps enrich rows the first creates.</w:t>
+        <w:t>One short-lived script per data source, rather than a single shared process — The API server (server.py) serves the endpoints the client calls; each data source is ingested by its own script on its own cron schedule (Space-Track, SatNOGS, CelesTrak, GCAT and news so far, with space weather, launches and Earth observation imagery to follow). This keeps each script’s code and responsibilities simple, and a failed or slow run in one job can’t stall the API server or any other job. Since the October 2026 database refactor, an ingestion run that changed something ends by publishing the website databases built from that source (see Server-Side Databases and Scheduled Jobs). The pre-refactor orbital pipeline, scripts/runPipeline.sh (ingestOrbitalData, ingestSatcat, enrichEirp, ingestSatnogsRf in order), is legacy: no longer scheduled, and kept only until the refactor’s clean-up step.</w:t>
       </w:r>
     </w:p>
     <w:p>
@@ -2876,7 +2873,7 @@
         </w:numPr>
       </w:pPr>
       <w:r>
-        <w:t>All processes hosted on the same machine — The GoDaddy cPanel shared host; the server and the ingestion scripts communicate only indirectly, via the separate database files described below, not via direct inter-process calls.</w:t>
+        <w:t>All processes hosted on the same machine — The GoDaddy cPanel shared host; the server and the ingestion scripts communicate only indirectly, via the database files described below, not via direct inter-process calls.</w:t>
       </w:r>
     </w:p>
     <w:p>
@@ -2908,7 +2905,7 @@
         </w:numPr>
       </w:pPr>
       <w:r>
-        <w:t>The API server is supervised by Passenger; ingestion needs no supervisor — Passenger starts server.py on demand and restarts it after a crash (touching tmp/restart.txt in the app directory forces a reload after a deploy). Ingestion scripts exit after every run, so a failed run simply waits for cron’s next tick, and flock -n stops a slow orbital pipeline run overlapping the next one. Long-running background processes are deliberately avoided, since the host reaps unregistered ones.</w:t>
+        <w:t>The API server is supervised by Passenger; ingestion needs no supervisor — Passenger starts server.py on demand and restarts it after a crash (touching tmp/restart.txt in the app directory forces a reload after a deploy). Ingestion scripts exit after every run, so a failed run simply waits for cron’s next tick, and a shared writers’ lock (databases/.writers.lock, taken by scripts/runIngestion.py) makes every ingestion and publish wait for the one before it. Long-running background processes are deliberately avoided, since the host reaps unregistered ones.</w:t>
       </w:r>
     </w:p>
     <w:p>
@@ -2919,7 +2916,7 @@
         </w:numPr>
       </w:pPr>
       <w:r>
-        <w:t>Per-process failure isolation — Because each ingestion process owns exactly one database file and has no direct dependency on the others, one script failing has no effect on the API server or the other ingestion jobs, beyond that one dataset being briefly stale until its next scheduled run.</w:t>
+        <w:t>Per-process failure isolation — Each ingestion process owns exactly one database file and has no direct dependency on the others, so one script failing has no effect on the API server or the other ingestion jobs. The website databases are rebuilt from every source’s last good data, so a failed or stale source only means that source’s part of the site is briefly stale until its next successful run; the landing page’s freshness table shows it.</w:t>
       </w:r>
     </w:p>
     <w:p>
@@ -3016,7 +3013,388 @@
         </w:numPr>
       </w:pPr>
       <w:r>
-        <w:t>One SQLite database per data domain, each owned by exactly one ingestion process — Splitting by domain keeps each schema simple, lets a new prototype dataset be added as its own file without touching any live database, and means only one process ever writes to a given file, avoiding the write-lock contention that would occur if multiple ingestion processes shared one file; the API server process connects to all of them, but only ever reads.</w:t>
+        <w:t>Three kinds of SQLite database, each with exactly one writer (database and source refactor, agreed and carried out 2026-10-21; the full record is 0_documentation/dbRefactorPlan.md). All live in databases/, which replaced ingestionDBs/ on 2026-10-21. Every path and name is defined once, in scripts/dbPaths.py (with the map from each website database to the ingestion databases it is built from); scripts, server.py and 0_tools/bugs.py all build paths with its dbPath(). One writer per file avoids write-lock contention; whole-file atomic swaps of the website databases mean a reader never sees half a file.</w:t>
+      </w:r>
+    </w:p>
+    <w:p>
+      <w:pPr>
+        <w:numPr>
+          <w:ilvl w:val="0"/>
+          <w:numId w:val="11"/>
+        </w:numPr>
+      </w:pPr>
+      <w:r>
+        <w:t>ingestion&lt;Source&gt;.db — one per external source, holding what that source said, written only by that source’s ingestion script (upserts, so incremental) and read only by the publish step:</w:t>
+      </w:r>
+    </w:p>
+    <w:p>
+      <w:pPr>
+        <w:pStyle w:val="ListParagraph"/>
+      </w:pPr>
+      <w:r>
+        <w:t>ingestionSpaceTrack.db — table gp: the NORAD catalogue’s GP element sets and catalogue fields (all fields except the TLE lines, camelCase columns, plus fetchedAt and lastSeenFull), from scripts/ingestionSpaceTrack.py. A row is replaced only by a newer epoch, or the same epoch with changed metadata. Objects that leave the catalogue keep their row; lastSeenFull shows the publish step they were not in the latest full pass.</w:t>
+      </w:r>
+    </w:p>
+    <w:p>
+      <w:pPr>
+        <w:pStyle w:val="ListParagraph"/>
+      </w:pPr>
+      <w:r>
+        <w:t>ingestionCelesTrak.db — groupMembers (groupName, noradID, objectName) for all 47 CelesTrak groups, groupFetches (lastAttempt, lastSuccess, members, note) per group, and satcatRcs, the radar cross-section figures kept for good once known; from scripts/ingestionCelesTrak.py. No orbital elements.</w:t>
+      </w:r>
+    </w:p>
+    <w:p>
+      <w:pPr>
+        <w:pStyle w:val="ListParagraph"/>
+      </w:pPr>
+      <w:r>
+        <w:t>ingestionSatNOGS.db — transmitters (every SatNOGS transmitter record, keyed by uuid, replaced wholesale) and tle, an ID crosswalk only: one row per SatNOGS number with the catalogue number and international designator from its TLE line. No elements are decoded; from scripts/ingestionSatNOGS.py.</w:t>
+      </w:r>
+    </w:p>
+    <w:p>
+      <w:pPr>
+        <w:pStyle w:val="ListParagraph"/>
+      </w:pPr>
+      <w:r>
+        <w:t>ingestionGCAT.db — GCAT’s tables (gcatObjects, gcatPayloads, gcatOrgs, gcatLaunches and the build-only ones), from scripts/ingestGcat.py (was gcat.db).</w:t>
+      </w:r>
+    </w:p>
+    <w:p>
+      <w:pPr>
+        <w:pStyle w:val="ListParagraph"/>
+      </w:pPr>
+      <w:r>
+        <w:t>ingestionNews.db — the news articles, their topics and the per-topic counts, from scripts/readNews.py (was space_news.db; snake_case columns kept).</w:t>
+      </w:r>
+    </w:p>
+    <w:p>
+      <w:pPr>
+        <w:pStyle w:val="ListParagraph"/>
+      </w:pPr>
+      <w:r>
+        <w:t>ingestionGroundSegment.db and ingestionSkyCatalogue.db — the two reference databases, which have no online feed: built on the laptop by scripts/ingestionGroundSegment.py (from Al’s grndSgmntAssets_master.xlsx, read-only) and scripts/buildSkyCatalogue.py, committed to git and carried to the server by the deploy (decision D below).</w:t>
+      </w:r>
+    </w:p>
+    <w:p>
+      <w:pPr>
+        <w:numPr>
+          <w:ilvl w:val="0"/>
+          <w:numId w:val="11"/>
+        </w:numPr>
+      </w:pPr>
+      <w:r>
+        <w:t>site&lt;Type&gt;.db — what the website reads, one per type of data, written only by scripts/publishSite.py and rebuilt whole on every publish (see Publish Step below):</w:t>
+      </w:r>
+    </w:p>
+    <w:tbl>
+      <w:tblPr>
+        <w:tblStyle w:val="GridTable1Light"/>
+        <w:tblW w:w="9072" w:type="dxa"/>
+        <w:tblLayout w:type="fixed"/>
+        <w:tblLook w:val="04A0" w:firstRow="1" w:lastRow="0" w:firstColumn="1" w:lastColumn="0" w:noHBand="0" w:noVBand="1"/>
+      </w:tblPr>
+      <w:tblGrid>
+        <w:gridCol w:w="1413"/>
+        <w:gridCol w:w="1134"/>
+        <w:gridCol w:w="6525"/>
+      </w:tblGrid>
+      <w:tr>
+        <w:trPr>
+          <w:cnfStyle w:val="100000000000" w:firstRow="1" w:lastRow="0" w:firstColumn="0" w:lastColumn="0" w:oddVBand="0" w:evenVBand="0" w:oddHBand="0" w:evenHBand="0" w:firstRowFirstColumn="0" w:firstRowLastColumn="0" w:lastRowFirstColumn="0" w:lastRowLastColumn="0"/>
+        </w:trPr>
+        <w:tc>
+          <w:tcPr>
+            <w:cnfStyle w:val="001000000000" w:firstRow="0" w:lastRow="0" w:firstColumn="1" w:lastColumn="0" w:oddVBand="0" w:evenVBand="0" w:oddHBand="0" w:evenHBand="0" w:firstRowFirstColumn="0" w:firstRowLastColumn="0" w:lastRowFirstColumn="0" w:lastRowLastColumn="0"/>
+            <w:tcW w:w="1413" w:type="dxa"/>
+            <w:hideMark/>
+          </w:tcPr>
+          <w:p>
+            <w:pPr>
+              <w:spacing w:after="0" w:line="240" w:lineRule="auto"/>
+            </w:pPr>
+            <w:r>
+              <w:t>File</w:t>
+            </w:r>
+          </w:p>
+        </w:tc>
+        <w:tc>
+          <w:tcPr>
+            <w:tcW w:w="1134" w:type="dxa"/>
+            <w:hideMark/>
+          </w:tcPr>
+          <w:p>
+            <w:pPr>
+              <w:spacing w:after="0" w:line="240" w:lineRule="auto"/>
+              <w:cnfStyle w:val="100000000000" w:firstRow="1" w:lastRow="0" w:firstColumn="0" w:lastColumn="0" w:oddVBand="0" w:evenVBand="0" w:oddHBand="0" w:evenHBand="0" w:firstRowFirstColumn="0" w:firstRowLastColumn="0" w:lastRowFirstColumn="0" w:lastRowLastColumn="0"/>
+            </w:pPr>
+            <w:r>
+              <w:t>Contents</w:t>
+            </w:r>
+          </w:p>
+        </w:tc>
+        <w:tc>
+          <w:tcPr>
+            <w:tcW w:w="6525" w:type="dxa"/>
+            <w:hideMark/>
+          </w:tcPr>
+          <w:p>
+            <w:pPr>
+              <w:spacing w:after="0" w:line="240" w:lineRule="auto"/>
+              <w:cnfStyle w:val="100000000000" w:firstRow="1" w:lastRow="0" w:firstColumn="0" w:lastColumn="0" w:oddVBand="0" w:evenVBand="0" w:oddHBand="0" w:evenHBand="0" w:firstRowFirstColumn="0" w:firstRowLastColumn="0" w:lastRowFirstColumn="0" w:lastRowLastColumn="0"/>
+            </w:pPr>
+            <w:r>
+              <w:t>Built from</w:t>
+            </w:r>
+          </w:p>
+        </w:tc>
+      </w:tr>
+      <w:tr>
+        <w:tc>
+          <w:tcPr>
+            <w:cnfStyle w:val="001000000000" w:firstRow="0" w:lastRow="0" w:firstColumn="1" w:lastColumn="0" w:oddVBand="0" w:evenVBand="0" w:oddHBand="0" w:evenHBand="0" w:firstRowFirstColumn="0" w:firstRowLastColumn="0" w:lastRowFirstColumn="0" w:lastRowLastColumn="0"/>
+            <w:tcW w:w="1413" w:type="dxa"/>
+            <w:hideMark/>
+          </w:tcPr>
+          <w:p>
+            <w:pPr>
+              <w:spacing w:after="0" w:line="240" w:lineRule="auto"/>
+            </w:pPr>
+            <w:r>
+              <w:rPr>
+                <w:b w:val="0"/>
+                <w:bCs w:val="0"/>
+              </w:rPr>
+              <w:t>siteOrbital.db (~25 MB)</w:t>
+            </w:r>
+          </w:p>
+        </w:tc>
+        <w:tc>
+          <w:tcPr>
+            <w:tcW w:w="1134" w:type="dxa"/>
+            <w:hideMark/>
+          </w:tcPr>
+          <w:p>
+            <w:pPr>
+              <w:spacing w:after="0" w:line="240" w:lineRule="auto"/>
+              <w:cnfStyle w:val="000000000000" w:firstRow="0" w:lastRow="0" w:firstColumn="0" w:lastColumn="0" w:oddVBand="0" w:evenVBand="0" w:oddHBand="0" w:evenHBand="0" w:firstRowFirstColumn="0" w:firstRowLastColumn="0" w:lastRowFirstColumn="0" w:lastRowLastColumn="0"/>
+            </w:pPr>
+            <w:r>
+              <w:t>orbital_objects (with radio, EIRP and G/T columns filled), orbital_object_groups, the GCAT tables and columns the site reads (gcatLaunches, gcatOrgs, trimmed gcatObjects), gcatBrightness, the ON-ORBIT and LAUNCHES stats tables, and every source’s ingestionRuns</w:t>
+            </w:r>
+          </w:p>
+        </w:tc>
+        <w:tc>
+          <w:tcPr>
+            <w:tcW w:w="6525" w:type="dxa"/>
+            <w:hideMark/>
+          </w:tcPr>
+          <w:p>
+            <w:pPr>
+              <w:spacing w:after="0" w:line="240" w:lineRule="auto"/>
+              <w:cnfStyle w:val="000000000000" w:firstRow="0" w:lastRow="0" w:firstColumn="0" w:lastColumn="0" w:oddVBand="0" w:evenVBand="0" w:oddHBand="0" w:evenHBand="0" w:firstRowFirstColumn="0" w:firstRowLastColumn="0" w:lastRowFirstColumn="0" w:lastRowLastColumn="0"/>
+            </w:pPr>
+            <w:r>
+              <w:t>ingestionSpaceTrack, ingestionCelesTrak, ingestionSatNOGS, ingestionGCAT</w:t>
+            </w:r>
+          </w:p>
+        </w:tc>
+      </w:tr>
+      <w:tr>
+        <w:tc>
+          <w:tcPr>
+            <w:cnfStyle w:val="001000000000" w:firstRow="0" w:lastRow="0" w:firstColumn="1" w:lastColumn="0" w:oddVBand="0" w:evenVBand="0" w:oddHBand="0" w:evenHBand="0" w:firstRowFirstColumn="0" w:firstRowLastColumn="0" w:lastRowFirstColumn="0" w:lastRowLastColumn="0"/>
+            <w:tcW w:w="1413" w:type="dxa"/>
+            <w:hideMark/>
+          </w:tcPr>
+          <w:p>
+            <w:pPr>
+              <w:spacing w:after="0" w:line="240" w:lineRule="auto"/>
+            </w:pPr>
+            <w:r>
+              <w:rPr>
+                <w:b w:val="0"/>
+                <w:bCs w:val="0"/>
+              </w:rPr>
+              <w:t>siteNews.db (~2 MB)</w:t>
+            </w:r>
+          </w:p>
+        </w:tc>
+        <w:tc>
+          <w:tcPr>
+            <w:tcW w:w="1134" w:type="dxa"/>
+            <w:hideMark/>
+          </w:tcPr>
+          <w:p>
+            <w:pPr>
+              <w:spacing w:after="0" w:line="240" w:lineRule="auto"/>
+              <w:cnfStyle w:val="000000000000" w:firstRow="0" w:lastRow="0" w:firstColumn="0" w:lastColumn="0" w:oddVBand="0" w:evenVBand="0" w:oddHBand="0" w:evenHBand="0" w:firstRowFirstColumn="0" w:firstRowLastColumn="0" w:lastRowFirstColumn="0" w:lastRowLastColumn="0"/>
+            </w:pPr>
+            <w:r>
+              <w:t>articles, articleTopics, newsTopicCounts, and the news runs</w:t>
+            </w:r>
+          </w:p>
+        </w:tc>
+        <w:tc>
+          <w:tcPr>
+            <w:tcW w:w="6525" w:type="dxa"/>
+            <w:hideMark/>
+          </w:tcPr>
+          <w:p>
+            <w:pPr>
+              <w:spacing w:after="0" w:line="240" w:lineRule="auto"/>
+              <w:cnfStyle w:val="000000000000" w:firstRow="0" w:lastRow="0" w:firstColumn="0" w:lastColumn="0" w:oddVBand="0" w:evenVBand="0" w:oddHBand="0" w:evenHBand="0" w:firstRowFirstColumn="0" w:firstRowLastColumn="0" w:lastRowFirstColumn="0" w:lastRowLastColumn="0"/>
+            </w:pPr>
+            <w:r>
+              <w:t>ingestionNews</w:t>
+            </w:r>
+          </w:p>
+        </w:tc>
+      </w:tr>
+      <w:tr>
+        <w:tc>
+          <w:tcPr>
+            <w:cnfStyle w:val="001000000000" w:firstRow="0" w:lastRow="0" w:firstColumn="1" w:lastColumn="0" w:oddVBand="0" w:evenVBand="0" w:oddHBand="0" w:evenHBand="0" w:firstRowFirstColumn="0" w:firstRowLastColumn="0" w:lastRowFirstColumn="0" w:lastRowLastColumn="0"/>
+            <w:tcW w:w="1413" w:type="dxa"/>
+            <w:hideMark/>
+          </w:tcPr>
+          <w:p>
+            <w:pPr>
+              <w:spacing w:after="0" w:line="240" w:lineRule="auto"/>
+            </w:pPr>
+            <w:r>
+              <w:rPr>
+                <w:b w:val="0"/>
+                <w:bCs w:val="0"/>
+              </w:rPr>
+              <w:t>siteSky.db (~0.4 MB)</w:t>
+            </w:r>
+          </w:p>
+        </w:tc>
+        <w:tc>
+          <w:tcPr>
+            <w:tcW w:w="1134" w:type="dxa"/>
+            <w:hideMark/>
+          </w:tcPr>
+          <w:p>
+            <w:pPr>
+              <w:spacing w:after="0" w:line="240" w:lineRule="auto"/>
+              <w:cnfStyle w:val="000000000000" w:firstRow="0" w:lastRow="0" w:firstColumn="0" w:lastColumn="0" w:oddVBand="0" w:evenVBand="0" w:oddHBand="0" w:evenHBand="0" w:firstRowFirstColumn="0" w:firstRowLastColumn="0" w:lastRowFirstColumn="0" w:lastRowLastColumn="0"/>
+            </w:pPr>
+            <w:r>
+              <w:t>stars, star names, constellations and their lines, Milky Way, deep-sky objects</w:t>
+            </w:r>
+          </w:p>
+        </w:tc>
+        <w:tc>
+          <w:tcPr>
+            <w:tcW w:w="6525" w:type="dxa"/>
+            <w:hideMark/>
+          </w:tcPr>
+          <w:p>
+            <w:pPr>
+              <w:spacing w:after="0" w:line="240" w:lineRule="auto"/>
+              <w:cnfStyle w:val="000000000000" w:firstRow="0" w:lastRow="0" w:firstColumn="0" w:lastColumn="0" w:oddVBand="0" w:evenVBand="0" w:oddHBand="0" w:evenHBand="0" w:firstRowFirstColumn="0" w:firstRowLastColumn="0" w:lastRowFirstColumn="0" w:lastRowLastColumn="0"/>
+            </w:pPr>
+            <w:r>
+              <w:t>ingestionSkyCatalogue</w:t>
+            </w:r>
+          </w:p>
+        </w:tc>
+      </w:tr>
+      <w:tr>
+        <w:tc>
+          <w:tcPr>
+            <w:cnfStyle w:val="001000000000" w:firstRow="0" w:lastRow="0" w:firstColumn="1" w:lastColumn="0" w:oddVBand="0" w:evenVBand="0" w:oddHBand="0" w:evenHBand="0" w:firstRowFirstColumn="0" w:firstRowLastColumn="0" w:lastRowFirstColumn="0" w:lastRowLastColumn="0"/>
+            <w:tcW w:w="1413" w:type="dxa"/>
+            <w:hideMark/>
+          </w:tcPr>
+          <w:p>
+            <w:pPr>
+              <w:spacing w:after="0" w:line="240" w:lineRule="auto"/>
+            </w:pPr>
+            <w:r>
+              <w:rPr>
+                <w:b w:val="0"/>
+                <w:bCs w:val="0"/>
+              </w:rPr>
+              <w:t>siteGroundSegment.db (~0.1 MB)</w:t>
+            </w:r>
+          </w:p>
+        </w:tc>
+        <w:tc>
+          <w:tcPr>
+            <w:tcW w:w="1134" w:type="dxa"/>
+            <w:hideMark/>
+          </w:tcPr>
+          <w:p>
+            <w:pPr>
+              <w:spacing w:after="0" w:line="240" w:lineRule="auto"/>
+              <w:cnfStyle w:val="000000000000" w:firstRow="0" w:lastRow="0" w:firstColumn="0" w:lastColumn="0" w:oddVBand="0" w:evenVBand="0" w:oddHBand="0" w:evenHBand="0" w:firstRowFirstColumn="0" w:firstRowLastColumn="0" w:lastRowFirstColumn="0" w:lastRowLastColumn="0"/>
+            </w:pPr>
+            <w:r>
+              <w:t>ground_segment_assets</w:t>
+            </w:r>
+          </w:p>
+        </w:tc>
+        <w:tc>
+          <w:tcPr>
+            <w:tcW w:w="6525" w:type="dxa"/>
+            <w:hideMark/>
+          </w:tcPr>
+          <w:p>
+            <w:pPr>
+              <w:spacing w:after="0" w:line="240" w:lineRule="auto"/>
+              <w:cnfStyle w:val="000000000000" w:firstRow="0" w:lastRow="0" w:firstColumn="0" w:lastColumn="0" w:oddVBand="0" w:evenVBand="0" w:oddHBand="0" w:evenHBand="0" w:firstRowFirstColumn="0" w:firstRowLastColumn="0" w:lastRowFirstColumn="0" w:lastRowLastColumn="0"/>
+            </w:pPr>
+            <w:r>
+              <w:t>ingestionGroundSegment</w:t>
+            </w:r>
+          </w:p>
+        </w:tc>
+      </w:tr>
+    </w:tbl>
+    <w:p>
+      <w:pPr>
+        <w:numPr>
+          <w:ilvl w:val="0"/>
+          <w:numId w:val="11"/>
+        </w:numPr>
+      </w:pPr>
+      <w:r>
+        <w:t>Decision B — one website database per type of data (decided 2026-10-21). A single shared file only pays off for data that is joined or must stay mutually consistent, which applies only within the orbital data. The raw ingestion data, the GCAT tables used only for building (gcatPayloads, gcatParents, gcatDecays, gcatDebrisYears, gcatFiles) and bug reports are in no site file.</w:t>
+      </w:r>
+    </w:p>
+    <w:p>
+      <w:pPr>
+        <w:numPr>
+          <w:ilvl w:val="0"/>
+          <w:numId w:val="11"/>
+        </w:numPr>
+      </w:pPr>
+      <w:r>
+        <w:t>inbox&lt;Name&gt;.db — what the website writes to: inboxBugReports.db, the BUG REPORT form’s submissions (was bugReports.db), read by python 0_tools/bugs.py import-reports.</w:t>
+      </w:r>
+    </w:p>
+    <w:p>
+      <w:pPr>
+        <w:numPr>
+          <w:ilvl w:val="0"/>
+          <w:numId w:val="11"/>
+        </w:numPr>
+      </w:pPr>
+      <w:r>
+        <w:t>How the website reads them — server.py’s site_db(kind) (kind is orbital, news, sky or groundSegment) hands out a read-only connection, one per thread, and reopens it whenever the site file’s inode, modification time or size changes, so each publish is picked up on the next request and a long-lived connection never keeps reading the old file after the swap. gcat_db() and stats_db() both return the orbital connection. On Windows (the DEV laptop) each thread’s connections are closed after every request (release_site_dbs()), since an open file there would stop publishSite.py replacing it; on Linux they stay open.</w:t>
+      </w:r>
+    </w:p>
+    <w:p>
+      <w:pPr>
+        <w:numPr>
+          <w:ilvl w:val="0"/>
+          <w:numId w:val="11"/>
+        </w:numPr>
+      </w:pPr>
+      <w:r>
+        <w:t>Legacy fallback — a kind whose site file doesn’t exist is served from the pre-refactor databases instead (LEGACY_FILES in server.py): for orbital, orbitalObjects.db opened with onOrbitStats.db and the GCAT database attached, so the same table names resolve. Likewise scripts/dbPaths.py falls back to ingestionDBs/ with the old file names (LEGACY_NAMES) wherever only that folder exists. Both kept master deployable to the live server before its migration; both, and the old orbitalObjects.db, onOrbitStats.db and gcat.db.bak still in the live databases/, are legacy and are removed at the refactor’s clean-up step.</w:t>
       </w:r>
     </w:p>
     <w:p>
@@ -3027,7 +3405,7 @@
         </w:numPr>
       </w:pPr>
       <w:r>
-        <w:t>space_news.db (SQLite) — Implemented; written by the news ingestion process, storing news articles from the RSS feed list with filler and duplicates removed, the topics each article is filed under, and per-topic article counts; articles older than six months are deleted on every run. See News below.</w:t>
+        <w:t>merged_100pc.sqlite (SQLite) — Already built via buildStarDB/merge.py; the merged Hipparcos/Gaia star catalogue for stars within 100pc, static rather than continuously ingested, served to the client for star-chart rendering.</w:t>
       </w:r>
     </w:p>
     <w:p>
@@ -3038,7 +3416,7 @@
         </w:numPr>
       </w:pPr>
       <w:r>
-        <w:t>ingestionDBs/gcat.db (SQLite) — Implemented; written weekly by scripts/ingestGcat.py from Jonathan McDowell’s GCAT: every catalogued object, each payload’s own class (A academic, B commercial, C civil government, D defence), organisations and the launch log. Serves the Launches section and the ON-ORBIT overview. Not committed to git -- it is rebuilt from GCAT.</w:t>
+        <w:t>A space-weather time-series store (SQLite) — New; to follow the same convention (an ingestion&lt;Source&gt;.db, published into a site file); written by the space-weather ingestion process, retaining Kp-index, solar wind and CME/flare event history over time rather than just the latest value, needed for the historical dashboards in the software requirements.</w:t>
       </w:r>
     </w:p>
     <w:p>
@@ -3049,7 +3427,7 @@
         </w:numPr>
       </w:pPr>
       <w:r>
-        <w:t>merged_100pc.sqlite (SQLite) — Already built via buildStarDB/merge.py; the merged Hipparcos/Gaia star catalogue for stars within 100pc, static rather than continuously ingested, served to the client for star-chart rendering.</w:t>
+        <w:t>A launches database (SQLite) — New; to follow the same convention (an ingestion&lt;Source&gt;.db, published into a site file); written by the launches ingestion process, storing launch records pulled from Launch Library 2, supporting the heat-map, time-series, by-organisation and by-vehicle views.</w:t>
       </w:r>
     </w:p>
     <w:p>
@@ -3060,10 +3438,8 @@
         </w:numPr>
       </w:pPr>
       <w:r>
-        <w:rPr>
-          <w:highlight w:val="yellow"/>
-        </w:rPr>
-        <w:t>ingestionDBs/groundSegmentAssets.db (SQLite) — Implemented; built by rschGrdSgmt/build_ground_segment_db.py from the hand-maintained GroundSegmentAssets_master.xlsx, following the same one-database-per-domain convention; served read-only via GET /api/ground-segment-assets.</w:t>
+        <w:lastRenderedPageBreak/>
+        <w:t>An organisations/reference-data store (SQLite or a simple config file) — New; hand-maintained rather than written by an ingestion process, holding content with no API source, such as the organisations directory, glossary entries and CubeSat spotlights.</w:t>
       </w:r>
     </w:p>
     <w:p>
@@ -3074,52 +3450,284 @@
         </w:numPr>
       </w:pPr>
       <w:r>
-        <w:t>An orbital-data cache (SQLite) — Implemented as ingestionDBs/orbitalObjects.db; written by the TLE ingestion process (scripts/ingestOrbitalData.py) and enriched by a companion SATCAT job (scripts/ingestSatcat.py), storing the latest TLE sets pulled from CelesTrak/Space-Track/SatNOGS with a per-record last-refreshed timestamp, so the client isn't re-fetching from the third-party source on every request.</w:t>
-      </w:r>
+        <w:t>WAL (Write-Ahead Logging) mode enabled once per ingestion database — Each ingestion process sets PRAGMA journal_mode = WAL; the first time it opens its own database file; because the setting is stored permanently in the file itself, and each file has exactly one writer, this needs no ongoing management. The site files need none: they are opened read-only and replaced, never written in place.</w:t>
+      </w:r>
+    </w:p>
+    <w:p>
+      <w:pPr>
+        <w:pStyle w:val="Heading2"/>
+      </w:pPr>
+      <w:bookmarkStart w:id="10" w:name="_Toc239257551"/>
+      <w:r>
+        <w:t>Publish Step</w:t>
+      </w:r>
+      <w:bookmarkEnd w:id="10"/>
     </w:p>
     <w:p>
       <w:pPr>
         <w:numPr>
           <w:ilvl w:val="0"/>
-          <w:numId w:val="15"/>
+          <w:numId w:val="11"/>
         </w:numPr>
       </w:pPr>
       <w:r>
-        <w:t>A space-weather time-series store (SQLite) — New; written by the space-weather ingestion process, retaining Kp-index, solar wind and CME/flare event history over time rather than just the latest value, needed for the historical dashboards in the software requirements.</w:t>
+        <w:t>Ingestion vs publish — ingestion fetches from a source and stores what it said, incrementally; publishing turns the latest ingested data into what the website shows. python scripts/publishSite.py orbital|news|sky|groundSegment|all, for each type:</w:t>
+      </w:r>
+    </w:p>
+    <w:p>
+      <w:pPr>
+        <w:pStyle w:val="ListParagraph"/>
+      </w:pPr>
+      <w:r>
+        <w:t>1. Read its ingestion databases, ATTACHed read-only.</w:t>
+      </w:r>
+    </w:p>
+    <w:p>
+      <w:pPr>
+        <w:pStyle w:val="ListParagraph"/>
+      </w:pPr>
+      <w:r>
+        <w:t>2. Build site&lt;Type&gt;.db.tmp beside the live file — always from scratch, never patched: the files are small, the stats and the source merge depend on every object anyway, the same inputs give the same output, decayed or dropped objects disappear without deletion logic, schema changes need no migrations, and the next run corrects a bad one.</w:t>
+      </w:r>
+    </w:p>
+    <w:p>
+      <w:pPr>
+        <w:pStyle w:val="ListParagraph"/>
+      </w:pPr>
+      <w:r>
+        <w:t>3. Check it: PRAGMA integrity_check, no empty key table, and a sanity check that refuses to publish when a key table (orbital_objects, onOrbitObjects, gcatLaunches; articles; skyStars; ground_segment_assets) would shrink by more than MAX_DROP (10%) against the file it replaces. --force overrides the sanity check.</w:t>
+      </w:r>
+    </w:p>
+    <w:p>
+      <w:pPr>
+        <w:pStyle w:val="ListParagraph"/>
+      </w:pPr>
+      <w:r>
+        <w:t>4. Record the publish itself as a run (publishOrbital and so on) in the file’s ingestionRuns, then copy the live file to site&lt;Type&gt;.db.prev and os.replace the .tmp into place — atomic, so the website only ever sees a whole file. server.py notices and reconnects.</w:t>
       </w:r>
     </w:p>
     <w:p>
       <w:pPr>
         <w:numPr>
           <w:ilvl w:val="0"/>
-          <w:numId w:val="15"/>
+          <w:numId w:val="11"/>
         </w:numPr>
       </w:pPr>
       <w:r>
-        <w:t>A launches database (SQLite) — New; written by the launches ingestion process, storing launch records pulled from Launch Library 2, supporting the heat-map, time-series, by-organisation and by-vehicle views.</w:t>
+        <w:t>If any step fails, nothing is swapped, the command prints REFUSED and exits 1, and the website keeps serving the previous version. .prev is a one-step undo: copying it back over the live file restores the previous publish.</w:t>
       </w:r>
     </w:p>
     <w:p>
       <w:pPr>
         <w:numPr>
           <w:ilvl w:val="0"/>
-          <w:numId w:val="15"/>
+          <w:numId w:val="11"/>
         </w:numPr>
       </w:pPr>
       <w:r>
-        <w:lastRenderedPageBreak/>
-        <w:t>An organisations/reference-data store (SQLite or a simple config file) — New; hand-maintained rather than written by an ingestion process, holding content with no API source, such as the organisations directory, glossary entries and CubeSat spotlights.</w:t>
+        <w:t>Orbital is the only type with real work; the other three copy the tables the website reads. The orbital stages, in order:</w:t>
+      </w:r>
+    </w:p>
+    <w:p>
+      <w:pPr>
+        <w:pStyle w:val="ListParagraph"/>
+      </w:pPr>
+      <w:r>
+        <w:t>Objects — every object in Space-Track’s latest full pass or updated since, with an element set no older than MAX_ELEMENT_AGE_DAYS (30, matching Space-Track’s own current-catalogue query), plus objects decayed within RECENT_DECAY_DAYS (30), kept with their decay date. Elements come from Space-Track only. Epochs are normalised (ending Z) and object types mapped to the codes the site has always used (PAY, R/B, DEB, UNK). rcsSize (EST. SIZE) is CelesTrak’s radar figure from satcatRcs; rcsCategory keeps Space-Track’s SMALL / MEDIUM / LARGE. The objects are built in a separate staging file, because the stats and brightness code attach the orbital table as a database of its own; the tables are then copied into the site file with their indexes.</w:t>
+      </w:r>
+    </w:p>
+    <w:p>
+      <w:pPr>
+        <w:pStyle w:val="ListParagraph"/>
+      </w:pPr>
+      <w:r>
+        <w:t>Groups — scripts/groupRules.py (decision A, below). Each rule’s agreement with the latest CelesTrak list is printed on every publish, so drift shows up.</w:t>
+      </w:r>
+    </w:p>
+    <w:p>
+      <w:pPr>
+        <w:pStyle w:val="ListParagraph"/>
+      </w:pPr>
+      <w:r>
+        <w:t>Radio — SatNOGS transmitters linked to NORAD objects (below), then scripts/rfSelection.py (choose_rf) picks each satellite’s main downlink and uplink.</w:t>
+      </w:r>
+    </w:p>
+    <w:p>
+      <w:pPr>
+        <w:pStyle w:val="ListParagraph"/>
+      </w:pPr>
+      <w:r>
+        <w:t>Derived — EIRP and receive G/T (enrichEirp, with its GCAT class fallback while CelesTrak is unavailable), brightness (estimateBrightness → gcatBrightness) and the ON-ORBIT and LAUNCHES stats (orbitStats.refreshAll), run as stages.</w:t>
+      </w:r>
+    </w:p>
+    <w:p>
+      <w:pPr>
+        <w:pStyle w:val="ListParagraph"/>
+      </w:pPr>
+      <w:r>
+        <w:t>GCAT — only the tables and columns the website reads; then every source database’s ingestionRuns, for the freshness table.</w:t>
       </w:r>
     </w:p>
     <w:p>
       <w:pPr>
         <w:numPr>
           <w:ilvl w:val="0"/>
-          <w:numId w:val="15"/>
+          <w:numId w:val="11"/>
         </w:numPr>
       </w:pPr>
       <w:r>
-        <w:t>WAL (Write-Ahead Logging) mode enabled once per database file — Each process sets PRAGMA journal_mode = WAL; the first time it opens its own database file; because the setting is stored permanently in the file itself, and each file has exactly one writer, this needs no ongoing management.</w:t>
+        <w:t>First publish on DEV (2026-10-21): siteOrbital.db 25.3 MB in 21 s, the other three under 0.1 s each. On the live server the orbital publish takes about 40 s.</w:t>
+      </w:r>
+    </w:p>
+    <w:p>
+      <w:pPr>
+        <w:pStyle w:val="Heading2"/>
+      </w:pPr>
+      <w:bookmarkStart w:id="10" w:name="_Toc239257551"/>
+      <w:r>
+        <w:t>Sources and Their Roles (Decisions A, C, D)</w:t>
+      </w:r>
+      <w:bookmarkEnd w:id="10"/>
+    </w:p>
+    <w:p>
+      <w:pPr>
+        <w:numPr>
+          <w:ilvl w:val="0"/>
+          <w:numId w:val="11"/>
+        </w:numPr>
+      </w:pPr>
+      <w:r>
+        <w:t>Source priority — the NORAD satellite catalogue via Space-Track is the only orbit source; where sources overlap, the one closest to NORAD wins.</w:t>
+      </w:r>
+    </w:p>
+    <w:p>
+      <w:pPr>
+        <w:pStyle w:val="ListParagraph"/>
+      </w:pPr>
+      <w:r>
+        <w:t>Space-Track (NORAD) — every orbital element set and the catalogue fields (object type, owner, launch and decay dates, period, apogee, perigee, size class). A full pass once a day (the recommended current-catalogue query, not decayed, epoch within 30 days, plus decays in the last 30 days), a recent pass (EPOCH &gt; now − 2) otherwise. One login per run through the shared client in scripts/common.py.</w:t>
+      </w:r>
+    </w:p>
+    <w:p>
+      <w:pPr>
+        <w:pStyle w:val="ListParagraph"/>
+      </w:pPr>
+      <w:r>
+        <w:t>CelesTrak — group lists only (all 47 groups, as CSV, NORAD ID and name), plus its satcat.csv once per full pass for radar cross-sections. Etiquette: at most one pass per CELESTRAK_GROUPS_INTERVAL_HOURS (default 72, counted from the last attempt), 3 s between groups, a pass stops at the first connection failure, and CELESTRAK_ENABLED=0 means no requests at all. CelesTrak has blocked the live server since 2026-08-27, so the live .env sets CELESTRAK_ENABLED=0; the laptop is unaffected.</w:t>
+      </w:r>
+    </w:p>
+    <w:p>
+      <w:pPr>
+        <w:pStyle w:val="ListParagraph"/>
+      </w:pPr>
+      <w:r>
+        <w:t>SatNOGS — radio transmitters, plus its TLE feed kept only as an ID crosswalk. SatNOGS serves TLEs only (no OMM) and doesn’t support Alpha-5, so since NORAD’s 5-digit catalogue numbers ran out in July 2026 it lists new satellites under its own placeholder numbers (98xxx/99xxx), mostly carrying Space-Track’s elements re-encoded; it supplies no orbits.</w:t>
+      </w:r>
+    </w:p>
+    <w:p>
+      <w:pPr>
+        <w:pStyle w:val="ListParagraph"/>
+      </w:pPr>
+      <w:r>
+        <w:t>GCAT — owner, country, class, category, programme, mass and operations-end date for each payload, and the launch log; weekly.</w:t>
+      </w:r>
+    </w:p>
+    <w:p>
+      <w:pPr>
+        <w:numPr>
+          <w:ilvl w:val="0"/>
+          <w:numId w:val="11"/>
+        </w:numPr>
+      </w:pPr>
+      <w:r>
+        <w:t>Decision A — our own group rules, with CelesTrak definitive when available (decided 2026-10-21, extended the same day to the link-budget constellations). scripts/groupRules.py builds active, starlink and every constellation group the EIRP stage uses. Per group and object:</w:t>
+      </w:r>
+    </w:p>
+    <w:p>
+      <w:pPr>
+        <w:pStyle w:val="ListParagraph"/>
+      </w:pPr>
+      <w:r>
+        <w:t>1. CelesTrak, when available — its latest successful fetch of that group is at most CELESTRAK_MAX_AGE_DAYS (14) old. Its list is definitive for every object launched before that fetch: listed means a member, absent means not.</w:t>
+      </w:r>
+    </w:p>
+    <w:p>
+      <w:pPr>
+        <w:pStyle w:val="ListParagraph"/>
+      </w:pPr>
+      <w:r>
+        <w:t>2. The recent-launch rule (active only) — a payload launched within the last 3 months (RECENT_LAUNCH_DAYS = 91) is active unless shown otherwise: a later CelesTrak fetch leaves it out, or it has decayed. Catalogues take weeks to record a new satellite’s status. Constellation membership doesn’t expire.</w:t>
+      </w:r>
+    </w:p>
+    <w:p>
+      <w:pPr>
+        <w:pStyle w:val="ListParagraph"/>
+      </w:pPr>
+      <w:r>
+        <w:t>3. Our own rules — for objects launched after CelesTrak’s fetch, and for every object when CelesTrak is unavailable. active: a payload in orbit with no GCAT operations-end date (gcatPayloads.tOp), or a recent launch. Constellation groups (starlink, oneweb, kuiper, iridium-NEXT, globalstar, gps-ops, glo-ops, galileo, beidou, planet, eutelsat, qianfan, hulianwang, argos): an active payload whose GCAT owner code or programme belongs to the constellation, or, for payloads GCAT doesn’t list yet, a name prefix. Agreement with CelesTrak’s lists on 2026-10-21 ranged from 84% (glo-ops) to 100%; active 92.3%.</w:t>
+      </w:r>
+    </w:p>
+    <w:p>
+      <w:pPr>
+        <w:pStyle w:val="ListParagraph"/>
+      </w:pPr>
+      <w:r>
+        <w:t>CelesTrak-only groups — the ten whose rules agreed poorly (stations 50%, orbcomm 48%, sbas 34%, gnss 55%, sarsat 56%, ses 83%, intelsat 64%, telesat 61%, sar 67%, spire 65%) have no rule, and every other CelesTrak group likewise. They are absent while CelesTrak is unavailable: on the live server today the ADD OBJ group filter offers 15 groups instead of 47. Groups with no rule come back with CelesTrak’s next successful pass.</w:t>
+      </w:r>
+    </w:p>
+    <w:p>
+      <w:pPr>
+        <w:numPr>
+          <w:ilvl w:val="0"/>
+          <w:numId w:val="11"/>
+        </w:numPr>
+      </w:pPr>
+      <w:r>
+        <w:t>Transmitter-to-NORAD linking (SatNOGS crosswalk) — each SatNOGS transmitter is linked to an object in the catalogue by, in order: its norad_follow_id; the international designator in the TLE SatNOGS publishes under the transmitter’s own number, matched to Space-Track’s objectID (the only link for satellites launched since July 2026, e.g. SatNOGS 98193, JACK-007 → 2026-229K); its own norad_cat_id. Transmitters matching none are dropped. This fixed bug 9: the pre-refactor pipeline stored SatNOGS’s TLE rows as objects under its placeholder numbers and attached frequencies by norad_cat_id, so 384 satellites’ frequencies on the live server sat on 9xxxx duplicates instead of the real objects.</w:t>
+      </w:r>
+    </w:p>
+    <w:p>
+      <w:pPr>
+        <w:numPr>
+          <w:ilvl w:val="0"/>
+          <w:numId w:val="11"/>
+        </w:numPr>
+      </w:pPr>
+      <w:r>
+        <w:t>Radar cross-section kept for good (EST. SIZE) — satellites don’t change size, so CelesTrak’s RCS figure is kept once known: satcatRcs rows are only ever added or updated, never removed, and a blank never replaces a held figure. Each full CelesTrak pass ends with one satcat.csv request; ingestionCelesTrak.py --seed-rcs &lt;orbitalObjects.db&gt; was a one-off import of the figures the old database held (12,690, run on the live server by the migration). While CelesTrak blocks the live server, those seeded figures are its only source.</w:t>
+      </w:r>
+    </w:p>
+    <w:p>
+      <w:pPr>
+        <w:numPr>
+          <w:ilvl w:val="0"/>
+          <w:numId w:val="11"/>
+        </w:numPr>
+      </w:pPr>
+      <w:r>
+        <w:t>EIRP class tier: GCAT fallback — enrichEirp.py’s class tier normally reads CelesTrak’s function groups (weather, cubesat, geo …), which have no rules of our own. When no CelesTrak list is available, publishSite.py passes each payload’s class from GCAT (enrichEirp.gcat_class), used only where the groups place the payload in no class; constellation matches still win. Rules, first match wins: category SS → station; mass ≤ 30 kg → amateur (payload class A) or cubesat; MET → weather-geo or weather-leo by orbit; IMG-R → eo-radar; IMG or EOSCI → eo-optical; COM in GEO → military-comms (class D) or comms-geo; COM elsewhere → comms-leo-narrow; SCI, AST or TECH → science; anything else stays unknown. The publish log names the tier used. DEV, payloads in orbit: with CelesTrak 12,928 filing / 1,874 estimated / 4,102 unknown; without (as the live server) 12,762 / 4,881 / 1,261.</w:t>
+      </w:r>
+    </w:p>
+    <w:p>
+      <w:pPr>
+        <w:numPr>
+          <w:ilvl w:val="0"/>
+          <w:numId w:val="11"/>
+        </w:numPr>
+      </w:pPr>
+      <w:r>
+        <w:t>Decision C — publish after ingestion, from the last good data (decided 2026-10-21). C1: each ingestion run that succeeded and changed something ends by publishing every site file built from that source (Space-Track, SatNOGS, CelesTrak or GCAT → siteOrbital.db; news → siteNews.db); a run that changed nothing publishes nothing. C2: a failed or stale source never blocks a publish; the others publish from its last good data, the freshness table shows it as failed or stale, and data that looks wrong is still refused by the sanity checks. So CelesTrak being blocked never holds up orbital updates.</w:t>
+      </w:r>
+    </w:p>
+    <w:p>
+      <w:pPr>
+        <w:numPr>
+          <w:ilvl w:val="0"/>
+          <w:numId w:val="11"/>
+        </w:numPr>
+      </w:pPr>
+      <w:r>
+        <w:t>Decision D — the reference databases are built on the laptop and carried by the deploy (decided 2026-10-21). ingestionGroundSegment.db and ingestionSkyCatalogue.db have no online feed; they are committed to git (every other file in databases/ is git-ignored). deployToGoDaddy.sh excludes databases/ from its sync, uploads these two to .referenceUpload/, and scripts/installReferenceDbs.py on the server swaps in any that changed (after checking it opens as a database, under the writers’ lock) and publishes its site file. The server never needs the spreadsheet, the star catalogues or openpyxl.</w:t>
       </w:r>
     </w:p>
     <w:p>
@@ -3140,7 +3748,7 @@
         </w:numPr>
       </w:pPr>
       <w:r>
-        <w:t>News ingestion process — Implemented in scripts/readNews.py, run by cron every 30 minutes; writes new articles to space_news.db, dropping filler and duplicate titles, then prunes, re-tags and VACUUMs the database on every run (see News below).</w:t>
+        <w:t>News ingestion process — Implemented in scripts/readNews.py, run every 30 minutes; writes new articles to ingestionNews.db, dropping filler and duplicate titles, then prunes, re-tags and VACUUMs it on every run (see News below). siteNews.db is republished when new articles arrived; a run that only prunes records no changes, so the pruning reaches the site at the next run with new articles.</w:t>
       </w:r>
     </w:p>
     <w:p>
@@ -3151,16 +3759,7 @@
         </w:numPr>
       </w:pPr>
       <w:r>
-        <w:t xml:space="preserve">TLE ingestion process — </w:t>
-      </w:r>
-      <w:r>
-        <w:rPr>
-          <w:highlight w:val="yellow"/>
-        </w:rPr>
-        <w:t>Implemented; pulls updated orbital elements from CelesTrak, Space-Track and SatNOGS twice per day (see the full spec below), not the faster cadence originally envisaged here</w:t>
-      </w:r>
-      <w:r>
-        <w:t>, since TLEs go stale quickly.</w:t>
+        <w:t>Orbital ingestion processes — Implemented: scripts/ingestionSpaceTrack.py every 12 hours (the script itself makes one pass a day the full catalogue), scripts/ingestionSatNOGS.py every 12 hours, 30 minutes later, and scripts/ingestionCelesTrak.py every 3 days. Each that changed something republishes siteOrbital.db.</w:t>
       </w:r>
     </w:p>
     <w:p>
@@ -3174,7 +3773,7 @@
         <w:rPr>
           <w:highlight w:val="yellow"/>
         </w:rPr>
-        <w:t>SATCAT enrichment process (scripts/ingestSatcat.py) — Implemented; step 2 of the orbital pipeline (scripts/runPipeline.sh), run once daily (the midnight pipeline run only, or on demand with RUN_SATCAT=1) after TLE ingestion has returned — reads CelesTrak’s satcat.csv (primary) and Space-Track’s gp class (backfill) to populate objectType/owner/launchDate/decayDate/rcsSize/period/apogee/perigee on rows the TLE job already created; it never inserts new rows itself.</w:t>
+        <w:t>SATCAT enrichment process (scripts/ingestSatcat.py) — Legacy, no longer scheduled: Space-Track’s gp records carry the catalogue fields inline, and CelesTrak’s radar figures are kept in ingestionCelesTrak.db. Removed with the other pre-refactor scripts at the refactor’s clean-up step.</w:t>
       </w:r>
     </w:p>
     <w:p>
@@ -3188,7 +3787,7 @@
         <w:rPr>
           <w:highlight w:val="yellow"/>
         </w:rPr>
-        <w:t>GCAT ingestion process (scripts/ingestGcat.py) — Implemented; weekly (Sunday 03:00 server time), downloading four GCAT files with If-Modified-Since so unchanged files are skipped, and replacing each table whole inside one transaction. See the Launches section.</w:t>
+        <w:t>GCAT ingestion process (scripts/ingestGcat.py) — Implemented; weekly (Sunday 03:00 server time), downloading four GCAT files with If-Modified-Since so unchanged files are skipped, and replacing each table whole inside one transaction in ingestionGCAT.db; republishes siteOrbital.db when anything changed. See the Launches section.</w:t>
       </w:r>
     </w:p>
     <w:p>
@@ -3240,7 +3839,336 @@
         </w:rPr>
       </w:pPr>
       <w:r>
-        <w:t>Scheduling mechanism — cron, installed and kept current by setupCron.sh, which is idempotent: re-running it replaces only its own marked entries and leaves any other cron jobs alone. Three entries today: scripts/readNews.py every 30 minutes, scripts/runPipeline.sh every 12 hours under flock -n, and scripts/ingestGcat.py weekly (Sunday 03:00). Re-run setupCron.sh after any script path change.</w:t>
+        <w:t>Scheduling mechanism — cron, installed and kept current by setupCron.sh, which is idempotent: re-running it replaces only its own marked entries (# LCARS-FAS-CRON) and leaves any other cron jobs alone. It refuses unless databases/ exists, so it cannot start the new pipeline on a server not yet migrated. Every job is one source run through scripts/runIngestion.py &lt;source&gt;, which (1) takes the shared writers’ lock, databases/.writers.lock, waiting up to 15 minutes (fcntl, so Linux only; skipped on Windows); (2) runs that source’s ingestion script as its own process; (3) reads the run it recorded; and (4) publishes the dependent site files only if that run succeeded with changes. A failed or skipped run publishes nothing; a refused publish makes the run exit 1. Each source runs on its own schedule, so one failing never holds up the others. Server time (UTC−7):</w:t>
+      </w:r>
+    </w:p>
+    <w:tbl>
+      <w:tblPr>
+        <w:tblStyle w:val="GridTable1Light"/>
+        <w:tblW w:w="9072" w:type="dxa"/>
+        <w:tblLayout w:type="fixed"/>
+        <w:tblLook w:val="04A0" w:firstRow="1" w:lastRow="0" w:firstColumn="1" w:lastColumn="0" w:noHBand="0" w:noVBand="1"/>
+      </w:tblPr>
+      <w:tblGrid>
+        <w:gridCol w:w="1413"/>
+        <w:gridCol w:w="1134"/>
+        <w:gridCol w:w="6525"/>
+      </w:tblGrid>
+      <w:tr>
+        <w:trPr>
+          <w:cnfStyle w:val="100000000000" w:firstRow="1" w:lastRow="0" w:firstColumn="0" w:lastColumn="0" w:oddVBand="0" w:evenVBand="0" w:oddHBand="0" w:evenHBand="0" w:firstRowFirstColumn="0" w:firstRowLastColumn="0" w:lastRowFirstColumn="0" w:lastRowLastColumn="0"/>
+        </w:trPr>
+        <w:tc>
+          <w:tcPr>
+            <w:cnfStyle w:val="001000000000" w:firstRow="0" w:lastRow="0" w:firstColumn="1" w:lastColumn="0" w:oddVBand="0" w:evenVBand="0" w:oddHBand="0" w:evenHBand="0" w:firstRowFirstColumn="0" w:firstRowLastColumn="0" w:lastRowFirstColumn="0" w:lastRowLastColumn="0"/>
+            <w:tcW w:w="1413" w:type="dxa"/>
+            <w:hideMark/>
+          </w:tcPr>
+          <w:p>
+            <w:pPr>
+              <w:spacing w:after="0" w:line="240" w:lineRule="auto"/>
+            </w:pPr>
+            <w:r>
+              <w:t>Source</w:t>
+            </w:r>
+          </w:p>
+        </w:tc>
+        <w:tc>
+          <w:tcPr>
+            <w:tcW w:w="1134" w:type="dxa"/>
+            <w:hideMark/>
+          </w:tcPr>
+          <w:p>
+            <w:pPr>
+              <w:spacing w:after="0" w:line="240" w:lineRule="auto"/>
+              <w:cnfStyle w:val="100000000000" w:firstRow="1" w:lastRow="0" w:firstColumn="0" w:lastColumn="0" w:oddVBand="0" w:evenVBand="0" w:oddHBand="0" w:evenHBand="0" w:firstRowFirstColumn="0" w:firstRowLastColumn="0" w:lastRowFirstColumn="0" w:lastRowLastColumn="0"/>
+            </w:pPr>
+            <w:r>
+              <w:t>Schedule</w:t>
+            </w:r>
+          </w:p>
+        </w:tc>
+        <w:tc>
+          <w:tcPr>
+            <w:tcW w:w="6525" w:type="dxa"/>
+            <w:hideMark/>
+          </w:tcPr>
+          <w:p>
+            <w:pPr>
+              <w:spacing w:after="0" w:line="240" w:lineRule="auto"/>
+              <w:cnfStyle w:val="100000000000" w:firstRow="1" w:lastRow="0" w:firstColumn="0" w:lastColumn="0" w:oddVBand="0" w:evenVBand="0" w:oddHBand="0" w:evenHBand="0" w:firstRowFirstColumn="0" w:firstRowLastColumn="0" w:lastRowFirstColumn="0" w:lastRowLastColumn="0"/>
+            </w:pPr>
+            <w:r>
+              <w:t>Log</w:t>
+            </w:r>
+          </w:p>
+        </w:tc>
+      </w:tr>
+      <w:tr>
+        <w:tc>
+          <w:tcPr>
+            <w:cnfStyle w:val="001000000000" w:firstRow="0" w:lastRow="0" w:firstColumn="1" w:lastColumn="0" w:oddVBand="0" w:evenVBand="0" w:oddHBand="0" w:evenHBand="0" w:firstRowFirstColumn="0" w:firstRowLastColumn="0" w:lastRowFirstColumn="0" w:lastRowLastColumn="0"/>
+            <w:tcW w:w="1413" w:type="dxa"/>
+            <w:hideMark/>
+          </w:tcPr>
+          <w:p>
+            <w:pPr>
+              <w:spacing w:after="0" w:line="240" w:lineRule="auto"/>
+            </w:pPr>
+            <w:r>
+              <w:rPr>
+                <w:b w:val="0"/>
+                <w:bCs w:val="0"/>
+              </w:rPr>
+              <w:t>news</w:t>
+            </w:r>
+          </w:p>
+        </w:tc>
+        <w:tc>
+          <w:tcPr>
+            <w:tcW w:w="1134" w:type="dxa"/>
+            <w:hideMark/>
+          </w:tcPr>
+          <w:p>
+            <w:pPr>
+              <w:spacing w:after="0" w:line="240" w:lineRule="auto"/>
+              <w:cnfStyle w:val="000000000000" w:firstRow="0" w:lastRow="0" w:firstColumn="0" w:lastColumn="0" w:oddVBand="0" w:evenVBand="0" w:oddHBand="0" w:evenHBand="0" w:firstRowFirstColumn="0" w:firstRowLastColumn="0" w:lastRowFirstColumn="0" w:lastRowLastColumn="0"/>
+            </w:pPr>
+            <w:r>
+              <w:t>*/30 * * * * — every 30 min</w:t>
+            </w:r>
+          </w:p>
+        </w:tc>
+        <w:tc>
+          <w:tcPr>
+            <w:tcW w:w="6525" w:type="dxa"/>
+            <w:hideMark/>
+          </w:tcPr>
+          <w:p>
+            <w:pPr>
+              <w:spacing w:after="0" w:line="240" w:lineRule="auto"/>
+              <w:cnfStyle w:val="000000000000" w:firstRow="0" w:lastRow="0" w:firstColumn="0" w:lastColumn="0" w:oddVBand="0" w:evenVBand="0" w:oddHBand="0" w:evenHBand="0" w:firstRowFirstColumn="0" w:firstRowLastColumn="0" w:lastRowFirstColumn="0" w:lastRowLastColumn="0"/>
+            </w:pPr>
+            <w:r>
+              <w:t>~/logs/news_cron.log</w:t>
+            </w:r>
+          </w:p>
+        </w:tc>
+      </w:tr>
+      <w:tr>
+        <w:tc>
+          <w:tcPr>
+            <w:cnfStyle w:val="001000000000" w:firstRow="0" w:lastRow="0" w:firstColumn="1" w:lastColumn="0" w:oddVBand="0" w:evenVBand="0" w:oddHBand="0" w:evenHBand="0" w:firstRowFirstColumn="0" w:firstRowLastColumn="0" w:lastRowFirstColumn="0" w:lastRowLastColumn="0"/>
+            <w:tcW w:w="1413" w:type="dxa"/>
+            <w:hideMark/>
+          </w:tcPr>
+          <w:p>
+            <w:pPr>
+              <w:spacing w:after="0" w:line="240" w:lineRule="auto"/>
+            </w:pPr>
+            <w:r>
+              <w:rPr>
+                <w:b w:val="0"/>
+                <w:bCs w:val="0"/>
+              </w:rPr>
+              <w:t>spaceTrack</w:t>
+            </w:r>
+          </w:p>
+        </w:tc>
+        <w:tc>
+          <w:tcPr>
+            <w:tcW w:w="1134" w:type="dxa"/>
+            <w:hideMark/>
+          </w:tcPr>
+          <w:p>
+            <w:pPr>
+              <w:spacing w:after="0" w:line="240" w:lineRule="auto"/>
+              <w:cnfStyle w:val="000000000000" w:firstRow="0" w:lastRow="0" w:firstColumn="0" w:lastColumn="0" w:oddVBand="0" w:evenVBand="0" w:oddHBand="0" w:evenHBand="0" w:firstRowFirstColumn="0" w:firstRowLastColumn="0" w:lastRowFirstColumn="0" w:lastRowLastColumn="0"/>
+            </w:pPr>
+            <w:r>
+              <w:t>0 */12 * * * — every 12 h; the daily full pass is chosen by the script</w:t>
+            </w:r>
+          </w:p>
+        </w:tc>
+        <w:tc>
+          <w:tcPr>
+            <w:tcW w:w="6525" w:type="dxa"/>
+            <w:hideMark/>
+          </w:tcPr>
+          <w:p>
+            <w:pPr>
+              <w:spacing w:after="0" w:line="240" w:lineRule="auto"/>
+              <w:cnfStyle w:val="000000000000" w:firstRow="0" w:lastRow="0" w:firstColumn="0" w:lastColumn="0" w:oddVBand="0" w:evenVBand="0" w:oddHBand="0" w:evenHBand="0" w:firstRowFirstColumn="0" w:firstRowLastColumn="0" w:lastRowFirstColumn="0" w:lastRowLastColumn="0"/>
+            </w:pPr>
+            <w:r>
+              <w:t>~/logs/spaceTrack_cron.log</w:t>
+            </w:r>
+          </w:p>
+        </w:tc>
+      </w:tr>
+      <w:tr>
+        <w:tc>
+          <w:tcPr>
+            <w:cnfStyle w:val="001000000000" w:firstRow="0" w:lastRow="0" w:firstColumn="1" w:lastColumn="0" w:oddVBand="0" w:evenVBand="0" w:oddHBand="0" w:evenHBand="0" w:firstRowFirstColumn="0" w:firstRowLastColumn="0" w:lastRowFirstColumn="0" w:lastRowLastColumn="0"/>
+            <w:tcW w:w="1413" w:type="dxa"/>
+            <w:hideMark/>
+          </w:tcPr>
+          <w:p>
+            <w:pPr>
+              <w:spacing w:after="0" w:line="240" w:lineRule="auto"/>
+            </w:pPr>
+            <w:r>
+              <w:rPr>
+                <w:b w:val="0"/>
+                <w:bCs w:val="0"/>
+              </w:rPr>
+              <w:t>satnogs</w:t>
+            </w:r>
+          </w:p>
+        </w:tc>
+        <w:tc>
+          <w:tcPr>
+            <w:tcW w:w="1134" w:type="dxa"/>
+            <w:hideMark/>
+          </w:tcPr>
+          <w:p>
+            <w:pPr>
+              <w:spacing w:after="0" w:line="240" w:lineRule="auto"/>
+              <w:cnfStyle w:val="000000000000" w:firstRow="0" w:lastRow="0" w:firstColumn="0" w:lastColumn="0" w:oddVBand="0" w:evenVBand="0" w:oddHBand="0" w:evenHBand="0" w:firstRowFirstColumn="0" w:firstRowLastColumn="0" w:lastRowFirstColumn="0" w:lastRowLastColumn="0"/>
+            </w:pPr>
+            <w:r>
+              <w:t>30 */12 * * * — every 12 h, at :30</w:t>
+            </w:r>
+          </w:p>
+        </w:tc>
+        <w:tc>
+          <w:tcPr>
+            <w:tcW w:w="6525" w:type="dxa"/>
+            <w:hideMark/>
+          </w:tcPr>
+          <w:p>
+            <w:pPr>
+              <w:spacing w:after="0" w:line="240" w:lineRule="auto"/>
+              <w:cnfStyle w:val="000000000000" w:firstRow="0" w:lastRow="0" w:firstColumn="0" w:lastColumn="0" w:oddVBand="0" w:evenVBand="0" w:oddHBand="0" w:evenHBand="0" w:firstRowFirstColumn="0" w:firstRowLastColumn="0" w:lastRowFirstColumn="0" w:lastRowLastColumn="0"/>
+            </w:pPr>
+            <w:r>
+              <w:t>~/logs/satnogs_cron.log</w:t>
+            </w:r>
+          </w:p>
+        </w:tc>
+      </w:tr>
+      <w:tr>
+        <w:tc>
+          <w:tcPr>
+            <w:cnfStyle w:val="001000000000" w:firstRow="0" w:lastRow="0" w:firstColumn="1" w:lastColumn="0" w:oddVBand="0" w:evenVBand="0" w:oddHBand="0" w:evenHBand="0" w:firstRowFirstColumn="0" w:firstRowLastColumn="0" w:lastRowFirstColumn="0" w:lastRowLastColumn="0"/>
+            <w:tcW w:w="1413" w:type="dxa"/>
+            <w:hideMark/>
+          </w:tcPr>
+          <w:p>
+            <w:pPr>
+              <w:spacing w:after="0" w:line="240" w:lineRule="auto"/>
+            </w:pPr>
+            <w:r>
+              <w:rPr>
+                <w:b w:val="0"/>
+                <w:bCs w:val="0"/>
+              </w:rPr>
+              <w:t>celesTrak</w:t>
+            </w:r>
+          </w:p>
+        </w:tc>
+        <w:tc>
+          <w:tcPr>
+            <w:tcW w:w="1134" w:type="dxa"/>
+            <w:hideMark/>
+          </w:tcPr>
+          <w:p>
+            <w:pPr>
+              <w:spacing w:after="0" w:line="240" w:lineRule="auto"/>
+              <w:cnfStyle w:val="000000000000" w:firstRow="0" w:lastRow="0" w:firstColumn="0" w:lastColumn="0" w:oddVBand="0" w:evenVBand="0" w:oddHBand="0" w:evenHBand="0" w:firstRowFirstColumn="0" w:firstRowLastColumn="0" w:lastRowFirstColumn="0" w:lastRowLastColumn="0"/>
+            </w:pPr>
+            <w:r>
+              <w:t>15 4 */3 * * — 04:15 on days 1, 4, 7 … of the month, plus the script’s own 72 h check; a no-op while CELESTRAK_ENABLED=0</w:t>
+            </w:r>
+          </w:p>
+        </w:tc>
+        <w:tc>
+          <w:tcPr>
+            <w:tcW w:w="6525" w:type="dxa"/>
+            <w:hideMark/>
+          </w:tcPr>
+          <w:p>
+            <w:pPr>
+              <w:spacing w:after="0" w:line="240" w:lineRule="auto"/>
+              <w:cnfStyle w:val="000000000000" w:firstRow="0" w:lastRow="0" w:firstColumn="0" w:lastColumn="0" w:oddVBand="0" w:evenVBand="0" w:oddHBand="0" w:evenHBand="0" w:firstRowFirstColumn="0" w:firstRowLastColumn="0" w:lastRowFirstColumn="0" w:lastRowLastColumn="0"/>
+            </w:pPr>
+            <w:r>
+              <w:t>~/logs/celesTrak_cron.log</w:t>
+            </w:r>
+          </w:p>
+        </w:tc>
+      </w:tr>
+      <w:tr>
+        <w:tc>
+          <w:tcPr>
+            <w:cnfStyle w:val="001000000000" w:firstRow="0" w:lastRow="0" w:firstColumn="1" w:lastColumn="0" w:oddVBand="0" w:evenVBand="0" w:oddHBand="0" w:evenHBand="0" w:firstRowFirstColumn="0" w:firstRowLastColumn="0" w:lastRowFirstColumn="0" w:lastRowLastColumn="0"/>
+            <w:tcW w:w="1413" w:type="dxa"/>
+            <w:hideMark/>
+          </w:tcPr>
+          <w:p>
+            <w:pPr>
+              <w:spacing w:after="0" w:line="240" w:lineRule="auto"/>
+            </w:pPr>
+            <w:r>
+              <w:rPr>
+                <w:b w:val="0"/>
+                <w:bCs w:val="0"/>
+              </w:rPr>
+              <w:t>gcat</w:t>
+            </w:r>
+          </w:p>
+        </w:tc>
+        <w:tc>
+          <w:tcPr>
+            <w:tcW w:w="1134" w:type="dxa"/>
+            <w:hideMark/>
+          </w:tcPr>
+          <w:p>
+            <w:pPr>
+              <w:spacing w:after="0" w:line="240" w:lineRule="auto"/>
+              <w:cnfStyle w:val="000000000000" w:firstRow="0" w:lastRow="0" w:firstColumn="0" w:lastColumn="0" w:oddVBand="0" w:evenVBand="0" w:oddHBand="0" w:evenHBand="0" w:firstRowFirstColumn="0" w:firstRowLastColumn="0" w:lastRowFirstColumn="0" w:lastRowLastColumn="0"/>
+            </w:pPr>
+            <w:r>
+              <w:t>0 3 * * 0 — Sunday 03:00</w:t>
+            </w:r>
+          </w:p>
+        </w:tc>
+        <w:tc>
+          <w:tcPr>
+            <w:tcW w:w="6525" w:type="dxa"/>
+            <w:hideMark/>
+          </w:tcPr>
+          <w:p>
+            <w:pPr>
+              <w:spacing w:after="0" w:line="240" w:lineRule="auto"/>
+              <w:cnfStyle w:val="000000000000" w:firstRow="0" w:lastRow="0" w:firstColumn="0" w:lastColumn="0" w:oddVBand="0" w:evenVBand="0" w:oddHBand="0" w:evenHBand="0" w:firstRowFirstColumn="0" w:firstRowLastColumn="0" w:lastRowFirstColumn="0" w:lastRowLastColumn="0"/>
+            </w:pPr>
+            <w:r>
+              <w:t>~/logs/gcat_cron.log</w:t>
+            </w:r>
+          </w:p>
+        </w:tc>
+      </w:tr>
+    </w:tbl>
+    <w:p>
+      <w:pPr>
+        <w:numPr>
+          <w:ilvl w:val="0"/>
+          <w:numId w:val="11"/>
+        </w:numPr>
+      </w:pPr>
+      <w:r>
+        <w:t>The ground segment and the sky have no job (decision D). The pre-refactor crontab (readNews.py every 30 minutes, runPipeline.sh every 12 hours under flock -n, ingestGcat.py weekly) was replaced by scripts/migrateLive.py on 2026-10-21 at 23:04 UTC.</w:t>
       </w:r>
     </w:p>
     <w:p>
@@ -3259,9 +4187,429 @@
         </w:rPr>
       </w:pPr>
       <w:r>
-        <w:t>Run logging — every job records each run (start, finish, success, records changed) in an ingestionRuns table in its own database (scripts/ingestionLog.py). server.py’s /api/status turns these into the landing page’s data-freshness table, estimating each next sync as the last run’s start plus the job’s interval -- right whatever timezone the host’s cron uses, and a missed run shows OVERDUE.</w:t>
-      </w:r>
-    </w:p>
+        <w:t>Run logging and the freshness table — every ingestion records each run (job, start, finish, success, records changed, note) in an ingestionRuns table in its own database (scripts/ingestionLog.py), and each publish records itself the same way. The publish step copies its sources’ runs into each site file, and server.py’s /api/status turns them into the landing page’s data-freshness table (Data | Source | Last refresh | # Changes | Time to next sync), estimating each next sync as the last run’s start plus the row’s interval — right whatever timezone the host’s cron uses; a missed run shows OVERDUE and a failed last run shows as failed. Each row (STATUS_SOURCES in server.py) lists the job names it accepts, newest first; the pre-refactor names are kept until the clean-up step. The source labels are static text in STATUS_SOURCES:</w:t>
+      </w:r>
+    </w:p>
+    <w:tbl>
+      <w:tblPr>
+        <w:tblStyle w:val="GridTable1Light"/>
+        <w:tblW w:w="9072" w:type="dxa"/>
+        <w:tblLayout w:type="fixed"/>
+        <w:tblLook w:val="04A0" w:firstRow="1" w:lastRow="0" w:firstColumn="1" w:lastColumn="0" w:noHBand="0" w:noVBand="1"/>
+      </w:tblPr>
+      <w:tblGrid>
+        <w:gridCol w:w="1413"/>
+        <w:gridCol w:w="1134"/>
+        <w:gridCol w:w="6525"/>
+      </w:tblGrid>
+      <w:tr>
+        <w:trPr>
+          <w:cnfStyle w:val="100000000000" w:firstRow="1" w:lastRow="0" w:firstColumn="0" w:lastColumn="0" w:oddVBand="0" w:evenVBand="0" w:oddHBand="0" w:evenHBand="0" w:firstRowFirstColumn="0" w:firstRowLastColumn="0" w:lastRowFirstColumn="0" w:lastRowLastColumn="0"/>
+        </w:trPr>
+        <w:tc>
+          <w:tcPr>
+            <w:cnfStyle w:val="001000000000" w:firstRow="0" w:lastRow="0" w:firstColumn="1" w:lastColumn="0" w:oddVBand="0" w:evenVBand="0" w:oddHBand="0" w:evenHBand="0" w:firstRowFirstColumn="0" w:firstRowLastColumn="0" w:lastRowFirstColumn="0" w:lastRowLastColumn="0"/>
+            <w:tcW w:w="1413" w:type="dxa"/>
+            <w:hideMark/>
+          </w:tcPr>
+          <w:p>
+            <w:pPr>
+              <w:spacing w:after="0" w:line="240" w:lineRule="auto"/>
+            </w:pPr>
+            <w:r>
+              <w:t>Data</w:t>
+            </w:r>
+          </w:p>
+        </w:tc>
+        <w:tc>
+          <w:tcPr>
+            <w:tcW w:w="1134" w:type="dxa"/>
+            <w:hideMark/>
+          </w:tcPr>
+          <w:p>
+            <w:pPr>
+              <w:spacing w:after="0" w:line="240" w:lineRule="auto"/>
+              <w:cnfStyle w:val="100000000000" w:firstRow="1" w:lastRow="0" w:firstColumn="0" w:lastColumn="0" w:oddVBand="0" w:evenVBand="0" w:oddHBand="0" w:evenHBand="0" w:firstRowFirstColumn="0" w:firstRowLastColumn="0" w:lastRowFirstColumn="0" w:lastRowLastColumn="0"/>
+            </w:pPr>
+            <w:r>
+              <w:t>Source (label)</w:t>
+            </w:r>
+          </w:p>
+        </w:tc>
+        <w:tc>
+          <w:tcPr>
+            <w:tcW w:w="6525" w:type="dxa"/>
+            <w:hideMark/>
+          </w:tcPr>
+          <w:p>
+            <w:pPr>
+              <w:spacing w:after="0" w:line="240" w:lineRule="auto"/>
+              <w:cnfStyle w:val="100000000000" w:firstRow="1" w:lastRow="0" w:firstColumn="0" w:lastColumn="0" w:oddVBand="0" w:evenVBand="0" w:oddHBand="0" w:evenHBand="0" w:firstRowFirstColumn="0" w:firstRowLastColumn="0" w:lastRowFirstColumn="0" w:lastRowLastColumn="0"/>
+            </w:pPr>
+            <w:r>
+              <w:t>Jobs (interval)</w:t>
+            </w:r>
+          </w:p>
+        </w:tc>
+      </w:tr>
+      <w:tr>
+        <w:tc>
+          <w:tcPr>
+            <w:cnfStyle w:val="001000000000" w:firstRow="0" w:lastRow="0" w:firstColumn="1" w:lastColumn="0" w:oddVBand="0" w:evenVBand="0" w:oddHBand="0" w:evenHBand="0" w:firstRowFirstColumn="0" w:firstRowLastColumn="0" w:lastRowFirstColumn="0" w:lastRowLastColumn="0"/>
+            <w:tcW w:w="1413" w:type="dxa"/>
+            <w:hideMark/>
+          </w:tcPr>
+          <w:p>
+            <w:pPr>
+              <w:spacing w:after="0" w:line="240" w:lineRule="auto"/>
+            </w:pPr>
+            <w:r>
+              <w:rPr>
+                <w:b w:val="0"/>
+                <w:bCs w:val="0"/>
+              </w:rPr>
+              <w:t>News</w:t>
+            </w:r>
+          </w:p>
+        </w:tc>
+        <w:tc>
+          <w:tcPr>
+            <w:tcW w:w="1134" w:type="dxa"/>
+            <w:hideMark/>
+          </w:tcPr>
+          <w:p>
+            <w:pPr>
+              <w:spacing w:after="0" w:line="240" w:lineRule="auto"/>
+              <w:cnfStyle w:val="000000000000" w:firstRow="0" w:lastRow="0" w:firstColumn="0" w:lastColumn="0" w:oddVBand="0" w:evenVBand="0" w:oddHBand="0" w:evenHBand="0" w:firstRowFirstColumn="0" w:firstRowLastColumn="0" w:lastRowFirstColumn="0" w:lastRowLastColumn="0"/>
+            </w:pPr>
+            <w:r>
+              <w:t>18 RSS feeds</w:t>
+            </w:r>
+          </w:p>
+        </w:tc>
+        <w:tc>
+          <w:tcPr>
+            <w:tcW w:w="6525" w:type="dxa"/>
+            <w:hideMark/>
+          </w:tcPr>
+          <w:p>
+            <w:pPr>
+              <w:spacing w:after="0" w:line="240" w:lineRule="auto"/>
+              <w:cnfStyle w:val="000000000000" w:firstRow="0" w:lastRow="0" w:firstColumn="0" w:lastColumn="0" w:oddVBand="0" w:evenVBand="0" w:oddHBand="0" w:evenHBand="0" w:firstRowFirstColumn="0" w:firstRowLastColumn="0" w:lastRowFirstColumn="0" w:lastRowLastColumn="0"/>
+            </w:pPr>
+            <w:r>
+              <w:t>news (30 min)</w:t>
+            </w:r>
+          </w:p>
+        </w:tc>
+      </w:tr>
+      <w:tr>
+        <w:tc>
+          <w:tcPr>
+            <w:cnfStyle w:val="001000000000" w:firstRow="0" w:lastRow="0" w:firstColumn="1" w:lastColumn="0" w:oddVBand="0" w:evenVBand="0" w:oddHBand="0" w:evenHBand="0" w:firstRowFirstColumn="0" w:firstRowLastColumn="0" w:lastRowFirstColumn="0" w:lastRowLastColumn="0"/>
+            <w:tcW w:w="1413" w:type="dxa"/>
+            <w:hideMark/>
+          </w:tcPr>
+          <w:p>
+            <w:pPr>
+              <w:spacing w:after="0" w:line="240" w:lineRule="auto"/>
+            </w:pPr>
+            <w:r>
+              <w:rPr>
+                <w:b w:val="0"/>
+                <w:bCs w:val="0"/>
+              </w:rPr>
+              <w:t>Orbital elements</w:t>
+            </w:r>
+          </w:p>
+        </w:tc>
+        <w:tc>
+          <w:tcPr>
+            <w:tcW w:w="1134" w:type="dxa"/>
+            <w:hideMark/>
+          </w:tcPr>
+          <w:p>
+            <w:pPr>
+              <w:spacing w:after="0" w:line="240" w:lineRule="auto"/>
+              <w:cnfStyle w:val="000000000000" w:firstRow="0" w:lastRow="0" w:firstColumn="0" w:lastColumn="0" w:oddVBand="0" w:evenVBand="0" w:oddHBand="0" w:evenHBand="0" w:firstRowFirstColumn="0" w:firstRowLastColumn="0" w:lastRowFirstColumn="0" w:lastRowLastColumn="0"/>
+            </w:pPr>
+            <w:r>
+              <w:t>NORAD via Space-Track</w:t>
+            </w:r>
+          </w:p>
+        </w:tc>
+        <w:tc>
+          <w:tcPr>
+            <w:tcW w:w="6525" w:type="dxa"/>
+            <w:hideMark/>
+          </w:tcPr>
+          <w:p>
+            <w:pPr>
+              <w:spacing w:after="0" w:line="240" w:lineRule="auto"/>
+              <w:cnfStyle w:val="000000000000" w:firstRow="0" w:lastRow="0" w:firstColumn="0" w:lastColumn="0" w:oddVBand="0" w:evenVBand="0" w:oddHBand="0" w:evenHBand="0" w:firstRowFirstColumn="0" w:firstRowLastColumn="0" w:lastRowFirstColumn="0" w:lastRowLastColumn="0"/>
+            </w:pPr>
+            <w:r>
+              <w:t>spaceTrackRecent, spaceTrackFull; legacy orbitalElements (12 h)</w:t>
+            </w:r>
+          </w:p>
+        </w:tc>
+      </w:tr>
+      <w:tr>
+        <w:tc>
+          <w:tcPr>
+            <w:cnfStyle w:val="001000000000" w:firstRow="0" w:lastRow="0" w:firstColumn="1" w:lastColumn="0" w:oddVBand="0" w:evenVBand="0" w:oddHBand="0" w:evenHBand="0" w:firstRowFirstColumn="0" w:firstRowLastColumn="0" w:lastRowFirstColumn="0" w:lastRowLastColumn="0"/>
+            <w:tcW w:w="1413" w:type="dxa"/>
+            <w:hideMark/>
+          </w:tcPr>
+          <w:p>
+            <w:pPr>
+              <w:spacing w:after="0" w:line="240" w:lineRule="auto"/>
+            </w:pPr>
+            <w:r>
+              <w:rPr>
+                <w:b w:val="0"/>
+                <w:bCs w:val="0"/>
+              </w:rPr>
+              <w:t>Satellite catalogue</w:t>
+            </w:r>
+          </w:p>
+        </w:tc>
+        <w:tc>
+          <w:tcPr>
+            <w:tcW w:w="1134" w:type="dxa"/>
+            <w:hideMark/>
+          </w:tcPr>
+          <w:p>
+            <w:pPr>
+              <w:spacing w:after="0" w:line="240" w:lineRule="auto"/>
+              <w:cnfStyle w:val="000000000000" w:firstRow="0" w:lastRow="0" w:firstColumn="0" w:lastColumn="0" w:oddVBand="0" w:evenVBand="0" w:oddHBand="0" w:evenHBand="0" w:firstRowFirstColumn="0" w:firstRowLastColumn="0" w:lastRowFirstColumn="0" w:lastRowLastColumn="0"/>
+            </w:pPr>
+            <w:r>
+              <w:t>NORAD SATCAT via Space-Track</w:t>
+            </w:r>
+          </w:p>
+        </w:tc>
+        <w:tc>
+          <w:tcPr>
+            <w:tcW w:w="6525" w:type="dxa"/>
+            <w:hideMark/>
+          </w:tcPr>
+          <w:p>
+            <w:pPr>
+              <w:spacing w:after="0" w:line="240" w:lineRule="auto"/>
+              <w:cnfStyle w:val="000000000000" w:firstRow="0" w:lastRow="0" w:firstColumn="0" w:lastColumn="0" w:oddVBand="0" w:evenVBand="0" w:oddHBand="0" w:evenHBand="0" w:firstRowFirstColumn="0" w:firstRowLastColumn="0" w:lastRowFirstColumn="0" w:lastRowLastColumn="0"/>
+            </w:pPr>
+            <w:r>
+              <w:t>spaceTrackFull; legacy satcat (24 h)</w:t>
+            </w:r>
+          </w:p>
+        </w:tc>
+      </w:tr>
+      <w:tr>
+        <w:tc>
+          <w:tcPr>
+            <w:cnfStyle w:val="001000000000" w:firstRow="0" w:lastRow="0" w:firstColumn="1" w:lastColumn="0" w:oddVBand="0" w:evenVBand="0" w:oddHBand="0" w:evenHBand="0" w:firstRowFirstColumn="0" w:firstRowLastColumn="0" w:lastRowFirstColumn="0" w:lastRowLastColumn="0"/>
+            <w:tcW w:w="1413" w:type="dxa"/>
+            <w:hideMark/>
+          </w:tcPr>
+          <w:p>
+            <w:pPr>
+              <w:spacing w:after="0" w:line="240" w:lineRule="auto"/>
+            </w:pPr>
+            <w:r>
+              <w:rPr>
+                <w:b w:val="0"/>
+                <w:bCs w:val="0"/>
+              </w:rPr>
+              <w:t>Satellite groups</w:t>
+            </w:r>
+          </w:p>
+        </w:tc>
+        <w:tc>
+          <w:tcPr>
+            <w:tcW w:w="1134" w:type="dxa"/>
+            <w:hideMark/>
+          </w:tcPr>
+          <w:p>
+            <w:pPr>
+              <w:spacing w:after="0" w:line="240" w:lineRule="auto"/>
+              <w:cnfStyle w:val="000000000000" w:firstRow="0" w:lastRow="0" w:firstColumn="0" w:lastColumn="0" w:oddVBand="0" w:evenVBand="0" w:oddHBand="0" w:evenHBand="0" w:firstRowFirstColumn="0" w:firstRowLastColumn="0" w:lastRowFirstColumn="0" w:lastRowLastColumn="0"/>
+            </w:pPr>
+            <w:r>
+              <w:t>CelesTrak · our own rules</w:t>
+            </w:r>
+          </w:p>
+        </w:tc>
+        <w:tc>
+          <w:tcPr>
+            <w:tcW w:w="6525" w:type="dxa"/>
+            <w:hideMark/>
+          </w:tcPr>
+          <w:p>
+            <w:pPr>
+              <w:spacing w:after="0" w:line="240" w:lineRule="auto"/>
+              <w:cnfStyle w:val="000000000000" w:firstRow="0" w:lastRow="0" w:firstColumn="0" w:lastColumn="0" w:oddVBand="0" w:evenVBand="0" w:oddHBand="0" w:evenHBand="0" w:firstRowFirstColumn="0" w:firstRowLastColumn="0" w:lastRowFirstColumn="0" w:lastRowLastColumn="0"/>
+            </w:pPr>
+            <w:r>
+              <w:t>celesTrakGroups (7 days); blank until CelesTrak’s first successful pass</w:t>
+            </w:r>
+          </w:p>
+        </w:tc>
+      </w:tr>
+      <w:tr>
+        <w:tc>
+          <w:tcPr>
+            <w:cnfStyle w:val="001000000000" w:firstRow="0" w:lastRow="0" w:firstColumn="1" w:lastColumn="0" w:oddVBand="0" w:evenVBand="0" w:oddHBand="0" w:evenHBand="0" w:firstRowFirstColumn="0" w:firstRowLastColumn="0" w:lastRowFirstColumn="0" w:lastRowLastColumn="0"/>
+            <w:tcW w:w="1413" w:type="dxa"/>
+            <w:hideMark/>
+          </w:tcPr>
+          <w:p>
+            <w:pPr>
+              <w:spacing w:after="0" w:line="240" w:lineRule="auto"/>
+            </w:pPr>
+            <w:r>
+              <w:rPr>
+                <w:b w:val="0"/>
+                <w:bCs w:val="0"/>
+              </w:rPr>
+              <w:t>Downlink EIRP</w:t>
+            </w:r>
+          </w:p>
+        </w:tc>
+        <w:tc>
+          <w:tcPr>
+            <w:tcW w:w="1134" w:type="dxa"/>
+            <w:hideMark/>
+          </w:tcPr>
+          <w:p>
+            <w:pPr>
+              <w:spacing w:after="0" w:line="240" w:lineRule="auto"/>
+              <w:cnfStyle w:val="000000000000" w:firstRow="0" w:lastRow="0" w:firstColumn="0" w:lastColumn="0" w:oddVBand="0" w:evenVBand="0" w:oddHBand="0" w:evenHBand="0" w:firstRowFirstColumn="0" w:firstRowLastColumn="0" w:lastRowFirstColumn="0" w:lastRowLastColumn="0"/>
+            </w:pPr>
+            <w:r>
+              <w:t>Filings · band plans</w:t>
+            </w:r>
+          </w:p>
+        </w:tc>
+        <w:tc>
+          <w:tcPr>
+            <w:tcW w:w="6525" w:type="dxa"/>
+            <w:hideMark/>
+          </w:tcPr>
+          <w:p>
+            <w:pPr>
+              <w:spacing w:after="0" w:line="240" w:lineRule="auto"/>
+              <w:cnfStyle w:val="000000000000" w:firstRow="0" w:lastRow="0" w:firstColumn="0" w:lastColumn="0" w:oddVBand="0" w:evenVBand="0" w:oddHBand="0" w:evenHBand="0" w:firstRowFirstColumn="0" w:firstRowLastColumn="0" w:lastRowFirstColumn="0" w:lastRowLastColumn="0"/>
+            </w:pPr>
+            <w:r>
+              <w:t>publishOrbital — the time the figures were computed; legacy eirp (12 h)</w:t>
+            </w:r>
+          </w:p>
+        </w:tc>
+      </w:tr>
+      <w:tr>
+        <w:tc>
+          <w:tcPr>
+            <w:cnfStyle w:val="001000000000" w:firstRow="0" w:lastRow="0" w:firstColumn="1" w:lastColumn="0" w:oddVBand="0" w:evenVBand="0" w:oddHBand="0" w:evenHBand="0" w:firstRowFirstColumn="0" w:firstRowLastColumn="0" w:lastRowFirstColumn="0" w:lastRowLastColumn="0"/>
+            <w:tcW w:w="1413" w:type="dxa"/>
+            <w:hideMark/>
+          </w:tcPr>
+          <w:p>
+            <w:pPr>
+              <w:spacing w:after="0" w:line="240" w:lineRule="auto"/>
+            </w:pPr>
+            <w:r>
+              <w:rPr>
+                <w:b w:val="0"/>
+                <w:bCs w:val="0"/>
+              </w:rPr>
+              <w:t>Radio frequencies</w:t>
+            </w:r>
+          </w:p>
+        </w:tc>
+        <w:tc>
+          <w:tcPr>
+            <w:tcW w:w="1134" w:type="dxa"/>
+            <w:hideMark/>
+          </w:tcPr>
+          <w:p>
+            <w:pPr>
+              <w:spacing w:after="0" w:line="240" w:lineRule="auto"/>
+              <w:cnfStyle w:val="000000000000" w:firstRow="0" w:lastRow="0" w:firstColumn="0" w:lastColumn="0" w:oddVBand="0" w:evenVBand="0" w:oddHBand="0" w:evenHBand="0" w:firstRowFirstColumn="0" w:firstRowLastColumn="0" w:lastRowFirstColumn="0" w:lastRowLastColumn="0"/>
+            </w:pPr>
+            <w:r>
+              <w:t>SatNOGS DB</w:t>
+            </w:r>
+          </w:p>
+        </w:tc>
+        <w:tc>
+          <w:tcPr>
+            <w:tcW w:w="6525" w:type="dxa"/>
+            <w:hideMark/>
+          </w:tcPr>
+          <w:p>
+            <w:pPr>
+              <w:spacing w:after="0" w:line="240" w:lineRule="auto"/>
+              <w:cnfStyle w:val="000000000000" w:firstRow="0" w:lastRow="0" w:firstColumn="0" w:lastColumn="0" w:oddVBand="0" w:evenVBand="0" w:oddHBand="0" w:evenHBand="0" w:firstRowFirstColumn="0" w:firstRowLastColumn="0" w:lastRowFirstColumn="0" w:lastRowLastColumn="0"/>
+            </w:pPr>
+            <w:r>
+              <w:t>satnogs; legacy satnogsRf (12 h)</w:t>
+            </w:r>
+          </w:p>
+        </w:tc>
+      </w:tr>
+      <w:tr>
+        <w:tc>
+          <w:tcPr>
+            <w:cnfStyle w:val="001000000000" w:firstRow="0" w:lastRow="0" w:firstColumn="1" w:lastColumn="0" w:oddVBand="0" w:evenVBand="0" w:oddHBand="0" w:evenHBand="0" w:firstRowFirstColumn="0" w:firstRowLastColumn="0" w:lastRowFirstColumn="0" w:lastRowLastColumn="0"/>
+            <w:tcW w:w="1413" w:type="dxa"/>
+            <w:hideMark/>
+          </w:tcPr>
+          <w:p>
+            <w:pPr>
+              <w:spacing w:after="0" w:line="240" w:lineRule="auto"/>
+            </w:pPr>
+            <w:r>
+              <w:rPr>
+                <w:b w:val="0"/>
+                <w:bCs w:val="0"/>
+              </w:rPr>
+              <w:t>Launch &amp; ownership</w:t>
+            </w:r>
+          </w:p>
+        </w:tc>
+        <w:tc>
+          <w:tcPr>
+            <w:tcW w:w="1134" w:type="dxa"/>
+            <w:hideMark/>
+          </w:tcPr>
+          <w:p>
+            <w:pPr>
+              <w:spacing w:after="0" w:line="240" w:lineRule="auto"/>
+              <w:cnfStyle w:val="000000000000" w:firstRow="0" w:lastRow="0" w:firstColumn="0" w:lastColumn="0" w:oddVBand="0" w:evenVBand="0" w:oddHBand="0" w:evenHBand="0" w:firstRowFirstColumn="0" w:firstRowLastColumn="0" w:lastRowFirstColumn="0" w:lastRowLastColumn="0"/>
+            </w:pPr>
+            <w:r>
+              <w:t>GCAT</w:t>
+            </w:r>
+          </w:p>
+        </w:tc>
+        <w:tc>
+          <w:tcPr>
+            <w:tcW w:w="6525" w:type="dxa"/>
+            <w:hideMark/>
+          </w:tcPr>
+          <w:p>
+            <w:pPr>
+              <w:spacing w:after="0" w:line="240" w:lineRule="auto"/>
+              <w:cnfStyle w:val="000000000000" w:firstRow="0" w:lastRow="0" w:firstColumn="0" w:lastColumn="0" w:oddVBand="0" w:evenVBand="0" w:oddHBand="0" w:evenHBand="0" w:firstRowFirstColumn="0" w:firstRowLastColumn="0" w:lastRowFirstColumn="0" w:lastRowLastColumn="0"/>
+            </w:pPr>
+            <w:r>
+              <w:t>gcat (7 days)</w:t>
+            </w:r>
+          </w:p>
+        </w:tc>
+      </w:tr>
+    </w:tbl>
     <w:p>
       <w:pPr>
         <w:spacing w:after="0" w:line="240" w:lineRule="auto"/>
@@ -3379,7 +4727,7 @@
         <w:pStyle w:val="ListParagraph"/>
       </w:pPr>
       <w:r>
-        <w:t>Main / payload area (&lt;main&gt;) — the actual visualisation viewport; its content swaps based on the selected section. GRD-TRACK, GRND SGMNT, GS OPS and EO now hold real Leaflet maps (base map, antimeridian-safe world boundary, day/night terminator and lat/lon graticule on both, plus ground segment's colour-coded asset markers and GRD-TRACK's ground-track/sensor-footprint rendering); NEWS holds a working article list and detail view against space_news.db, filterable by topic from the control area; the remaining sections still hold placeholder/welcome content.</w:t>
+        <w:t>Main / payload area (&lt;main&gt;) — the actual visualisation viewport; its content swaps based on the selected section. GRD-TRACK, GRND SGMNT, GS OPS and EO now hold real Leaflet maps (base map, antimeridian-safe world boundary, day/night terminator and lat/lon graticule on both, plus ground segment's colour-coded asset markers and GRD-TRACK's ground-track/sensor-footprint rendering); NEWS holds a working article list and detail view against siteNews.db, filterable by topic from the control area; the remaining sections still hold placeholder/welcome content.</w:t>
       </w:r>
     </w:p>
     <w:p>
@@ -3498,7 +4846,7 @@
         <w:pStyle w:val="ListParagraph"/>
       </w:pPr>
       <w:r>
-        <w:t>Space-Track — the only credential the system holds. The username and password are kept in spacetrack.env on the server (owner-read-only, permissions 600), never in git (.gitignore) and never in a deploy (excluded by deployToGoDaddy.sh); the web server refuses the file. setupCron.sh reads it and passes the values to the 12-hour pipeline as environment variables in the crontab, so they are visible to anyone with shell access to the hosting account (crontab -l). Acceptable on single-user hosting; having the pipeline read the file itself would be tighter.</w:t>
+        <w:t>Space-Track — the only credential the system holds. The username and password are kept in spacetrack.env on the server (owner-read-only, permissions 600, re-applied by every setupCron.sh run), never in git (.gitignore) and never in a deploy (excluded by deployToGoDaddy.sh); the web server refuses the file. Since 2026-10-17 the ingestion scripts load it themselves (scripts/common.py), so the crontab and command lines hold no credentials.</w:t>
       </w:r>
     </w:p>
     <w:p>
@@ -3506,7 +4854,7 @@
         <w:pStyle w:val="ListParagraph"/>
       </w:pPr>
       <w:r>
-        <w:t>Local development — the same values live in a git-ignored .env on the development machine.</w:t>
+        <w:t>Local development — the same values live in a git-ignored spacetrack.env on the development machine; other settings (such as CELESTRAK_ENABLED) in a git-ignored .env.</w:t>
       </w:r>
     </w:p>
     <w:p>
@@ -3552,6 +4900,14 @@
         <w:pStyle w:val="ListParagraph"/>
       </w:pPr>
       <w:r>
+        <w:t>Open since the database refactor (found 2026-10-22) — the rules name the old ingestionDBs/ folder and refuse database files by extension, but not the new databases/ folder: on the live server databases/siteOrbital.db is refused (403) while databases/siteOrbital.db.prev, siteNews.db.prev and .writers.lock are served (200). The rules need databases/ added (and .prev / .tmp copies refused) on the server, and a copy kept in the repository.</w:t>
+      </w:r>
+    </w:p>
+    <w:p>
+      <w:pPr>
+        <w:pStyle w:val="ListParagraph"/>
+      </w:pPr>
+      <w:r>
         <w:t>Application (live and local) — server.py serves only index.html and files under assets/ (static_file_path(), an allowlist). Paths are resolved before checking, so ../ cannot climb out of assets/; anything else is a 404. Covered by tests in 0_tests/test_server.py.</w:t>
       </w:r>
     </w:p>
@@ -3584,7 +4940,7 @@
         <w:pStyle w:val="ListParagraph"/>
       </w:pPr>
       <w:r>
-        <w:t>Since 10 October 2026 no database is committed except groundSegmentAssets.db, which is built outside this repository and cannot easily be rebuilt; every other database is rebuilt by its own ingestion job.</w:t>
+        <w:t>Since 10 October 2026 no database is committed except the reference databases, which have no online feed and are built outside the server: today ingestionGroundSegment.db and ingestionSkyCatalogue.db (decision D). Every other database is rebuilt by its own ingestion job.</w:t>
       </w:r>
     </w:p>
     <w:p>
@@ -3744,7 +5100,7 @@
           </w:tcPr>
           <w:p>
             <w:r>
-              <w:t>Orbital elements (OMM) and SATCAT for most of the catalogue, especially on the live server</w:t>
+              <w:t>Every orbital element set and the catalogue fields — the only orbit source since 2026-10-21</w:t>
             </w:r>
           </w:p>
         </w:tc>
@@ -3764,7 +5120,7 @@
           </w:tcPr>
           <w:p>
             <w:r>
-              <w:t>One account, stored as above. Fetched every 12 h (orbits) and daily (SATCAT). The site shows derived figures and individual objects, never the raw files; the downloadable databases (bug 7) and the copies in old git commits were a breach risk — the web copies are now blocked.</w:t>
+              <w:t>One account, stored as above. Fetched every 12 h, one pass a day the full catalogue. The site shows derived figures and individual objects, never the raw files; the downloadable databases (bug 7) and the copies in old git commits were a breach risk — the web copies are now blocked.</w:t>
             </w:r>
           </w:p>
         </w:tc>
@@ -3786,7 +5142,7 @@
           </w:tcPr>
           <w:p>
             <w:r>
-              <w:t>Orbital elements (OMM), SATCAT, groups (active, stations, Starlink ...)</w:t>
+              <w:t>Group lists (active, Starlink, constellations, stations …) and radar cross-sections; no orbital elements since 2026-10-21</w:t>
             </w:r>
           </w:p>
         </w:tc>
@@ -3806,7 +5162,7 @@
           </w:tcPr>
           <w:p>
             <w:r>
-              <w:t>Every 12 h, a pause between group downloads, identifying User-Agent. Credited in Acknowledgments. Note: CelesTrak is currently unreachable from the GoDaddy server (requests time out).</w:t>
+              <w:t>At most one pass every 72 h (cron every 3 days), 3 s between groups, stopping at the first connection failure, identifying User-Agent. Credited in Acknowledgments. CelesTrak has blocked the GoDaddy server since 2026-08-27, so the server’s .env sets CELESTRAK_ENABLED=0 and it makes no requests at all.</w:t>
             </w:r>
           </w:p>
         </w:tc>
@@ -3828,7 +5184,7 @@
           </w:tcPr>
           <w:p>
             <w:r>
-              <w:t>Radio transmitter data; a few element sets</w:t>
+              <w:t>Radio transmitter data; its TLE feed only as an ID crosswalk (designators), no orbits</w:t>
             </w:r>
           </w:p>
         </w:tc>
@@ -4955,7 +6311,7 @@
     <w:p>
       <w:pPr/>
       <w:r>
-        <w:t>Three tables in the existing ingestionDBs/space_news.db:</w:t>
+        <w:t>Three tables in databases/ingestionNews.db (ingestionDBs/space_news.db until 2026-10-21), copied whole into siteNews.db by the publish step; the website reads siteNews.db:</w:t>
       </w:r>
     </w:p>
     <w:p>
@@ -5552,7 +6908,7 @@
     <w:p>
       <w:pPr/>
       <w:r>
-        <w:t xml:space="preserve">    ING --&gt;|filler + duplicate titles dropped in memory| DB[(space_news.db: articles)]</w:t>
+        <w:t xml:space="preserve">    ING --&gt;|filler + duplicate titles dropped in memory| DB[(ingestionNews.db: articles)]</w:t>
       </w:r>
     </w:p>
     <w:p>
@@ -5609,7 +6965,7 @@
     <w:p>
       <w:pPr/>
       <w:r>
-        <w:t>Status. Implemented and tested against the local database (2026-10-09); not yet deployed. On deployment, pruneNews.py (dry run first) and tagNews.py are run once over SSH against the live database, since the deploy deliberately excludes ingestionDBs/; cron then keeps it maintained.</w:t>
+        <w:t>Status. Implemented and tested against the local database (2026-10-09); not yet deployed. On deployment, pruneNews.py (dry run first) and tagNews.py are run once over SSH against the live database, since the deploy deliberately excludes the databases folder (now databases/); cron then keeps it maintained.</w:t>
       </w:r>
     </w:p>
     <w:p>
@@ -5863,17 +7219,17 @@
     </w:p>
     <w:p>
       <w:r>
-        <w:t xml:space="preserve">Three complementary sources were selected for orbital object ingestion, each fulfilling a distinct role rather than duplicating the others' coverage. CelesTrak's General Perturbations (GP) API (gp.php) serves as the primary source: a RESTful, unauthenticated endpoint offering pre-packaged category queries (GROUP=active, GROUP=starlink, etc.) that map directly onto the client's panel-level filtering requirements, and confirmed as CelesTrak's actively maintained, officially documented interface. </w:t>
-      </w:r>
-    </w:p>
-    <w:p>
-      <w:r>
-        <w:t xml:space="preserve">Space-Track.org, the U.S. Space Command's authoritative catalogue, provides a fallback and verification pass: its gp class is queried for objects updated within the preceding 48 hours, backfilling any NORAD IDs CelesTrak's category files failed to return in a given run, and is additionally the source of record for the four SATCAT-equivalent fields (OBJECT_TYPE, LAUNCH_DATE, DECAY_DATE, RCS_SIZE) returned inline with the orbital elements rather than as a separate resource. </w:t>
-      </w:r>
-    </w:p>
-    <w:p>
-      <w:r>
-        <w:t>SatNOGS DB supplies a narrow supplemental pass limited to amateur-radio and CubeSat objects falling outside both mainstream catalogues' typical coverage. Within a single ingestion run, source priority is strictly ordered — CelesTrak, then Space-Track, then SatNOGS — so a lower-priority source can only add coverage a higher-priority one missed that run, never overwrite it.</w:t>
+        <w:t>Since the database refactor of 2026-10-21 the NORAD satellite catalogue via Space-Track is the only source of orbits; the other sources supply what NORAD doesn’t. Space-Track’s gp class (OMM) gives every element set together with the catalogue fields (object type, owner, launch and decay dates, period, apogee, perigee, size class). Its documentation gives explicit blanket approval for redistributing basic SSA data, conditioned on citation. Before the refactor CelesTrak’s GP API was the primary source for engineering reasons (no login, built for bulk group downloads), with Space-Track as fallback; CelesTrak has blocked the live server since 2026-08-27, so the live data had been coming from Space-Track anyway.</w:t>
+      </w:r>
+    </w:p>
+    <w:p>
+      <w:r>
+        <w:t>CelesTrak now supplies only its group lists (active, Starlink, the constellations, stations …), which define the ADD OBJ group filter and the link budget’s constellation and class tiers, and its radar cross-section figures (EST. SIZE), kept for good once known. Where its lists are unavailable our own rules stand in (decision A, under ARCHITECTURE).</w:t>
+      </w:r>
+    </w:p>
+    <w:p>
+      <w:r>
+        <w:t>SatNOGS DB supplies radio transmitter records, and its TLE feed is kept only as an ID crosswalk: it serves no OMM and doesn’t support Alpha-5, so since NORAD’s 5-digit numbers ran out in July 2026 it lists new satellites under its own placeholder numbers, mostly with Space-Track’s elements re-encoded (1,572 of its 1,736 TLEs on 2026-10-21). GCAT supplies ownership, classification and the operations-end dates our group rules use. The full record of the refactor is 0_documentation/dbRefactorPlan.md.</w:t>
       </w:r>
     </w:p>
     <w:tbl>
@@ -5977,7 +7333,7 @@
               <w:cnfStyle w:val="000000000000" w:firstRow="0" w:lastRow="0" w:firstColumn="0" w:lastColumn="0" w:oddVBand="0" w:evenVBand="0" w:oddHBand="0" w:evenHBand="0" w:firstRowFirstColumn="0" w:firstRowLastColumn="0" w:lastRowFirstColumn="0" w:lastRowLastColumn="0"/>
             </w:pPr>
             <w:r>
-              <w:t>Primary</w:t>
+              <w:t>Group lists and radar cross-sections only (no elements since 2026-10-21)</w:t>
             </w:r>
           </w:p>
         </w:tc>
@@ -6046,15 +7402,7 @@
               </w:rPr>
             </w:pPr>
             <w:r>
-              <w:t>Fallback / full-catalog </w:t>
-            </w:r>
-          </w:p>
-          <w:p>
-            <w:pPr>
-              <w:cnfStyle w:val="000000000000" w:firstRow="0" w:lastRow="0" w:firstColumn="0" w:lastColumn="0" w:oddVBand="0" w:evenVBand="0" w:oddHBand="0" w:evenHBand="0" w:firstRowFirstColumn="0" w:firstRowLastColumn="0" w:lastRowFirstColumn="0" w:lastRowLastColumn="0"/>
-            </w:pPr>
-            <w:r>
-              <w:t>verification</w:t>
+              <w:t>Primary — the only orbit source; catalogue fields</w:t>
             </w:r>
           </w:p>
         </w:tc>
@@ -6138,7 +7486,7 @@
               <w:cnfStyle w:val="000000000000" w:firstRow="0" w:lastRow="0" w:firstColumn="0" w:lastColumn="0" w:oddVBand="0" w:evenVBand="0" w:oddHBand="0" w:evenHBand="0" w:firstRowFirstColumn="0" w:firstRowLastColumn="0" w:lastRowFirstColumn="0" w:lastRowLastColumn="0"/>
             </w:pPr>
             <w:r>
-              <w:t>Supplemental</w:t>
+              <w:t>Radio transmitters; TLE feed as an ID crosswalk only</w:t>
             </w:r>
           </w:p>
         </w:tc>
@@ -6152,7 +7500,7 @@
               <w:cnfStyle w:val="000000000000" w:firstRow="0" w:lastRow="0" w:firstColumn="0" w:lastColumn="0" w:oddVBand="0" w:evenVBand="0" w:oddHBand="0" w:evenHBand="0" w:firstRowFirstColumn="0" w:firstRowLastColumn="0" w:lastRowFirstColumn="0" w:lastRowLastColumn="0"/>
             </w:pPr>
             <w:r>
-              <w:t>Independently observed, not a Space-Track derivative – can surface objects ahead of the official catalog. </w:t>
+              <w:t>Open data, CC BY-SA 4.0 (attribution, share-alike for derived data).</w:t>
             </w:r>
           </w:p>
         </w:tc>
@@ -6204,7 +7552,7 @@
               <w:cnfStyle w:val="000000000000" w:firstRow="0" w:lastRow="0" w:firstColumn="0" w:lastColumn="0" w:oddVBand="0" w:evenVBand="0" w:oddHBand="0" w:evenHBand="0" w:firstRowFirstColumn="0" w:firstRowLastColumn="0" w:lastRowFirstColumn="0" w:lastRowLastColumn="0"/>
             </w:pPr>
             <w:r>
-              <w:t>Payload supplement</w:t>
+              <w:t>Ownership, classification, operations-end dates; launch log</w:t>
             </w:r>
           </w:p>
         </w:tc>
@@ -6254,7 +7602,7 @@
     </w:p>
     <w:p>
       <w:r>
-        <w:t>CelesTrak and Space-Track publish materially the same current on-orbit population (~34,000 objects); SatNOGS is the only source able to add coverage the other two don't have.</w:t>
+        <w:t>CelesTrak and Space-Track publish materially the same current on-orbit population (~33,000 objects); taking the orbits from Space-Track alone loses nothing. SatNOGS’s extra rows were duplicates under its placeholder numbers, not extra coverage.</w:t>
       </w:r>
     </w:p>
     <w:p>
@@ -6282,7 +7630,7 @@
     </w:p>
     <w:p>
       <w:r>
-        <w:t>The jobs shall run as two separate processes to reduce the risk that a single fail-over will take out both jobs or that the server side processing will exceed the restrictions of a cheap hosting package. Ingestion for both should run twice per day. Less ought to be adequate for something that is primarily entertaining but sooner or later people are going to want to watch satellites launched aboard e.g. SpaceX.</w:t>
+        <w:t>Each source runs as its own process on its own schedule (see Scheduled Jobs), so a failure in one never takes out another, and each run publishes siteOrbital.db only if it changed something.</w:t>
       </w:r>
     </w:p>
     <w:p/>
@@ -6369,35 +7717,7 @@
                 <w:b w:val="0"/>
                 <w:bCs w:val="0"/>
               </w:rPr>
-              <w:t>TLE/GP</w:t>
-            </w:r>
-          </w:p>
-          <w:p>
-            <w:pPr>
-              <w:spacing w:after="0" w:line="240" w:lineRule="auto"/>
-            </w:pPr>
-            <w:r>
-              <w:rPr>
-                <w:b w:val="0"/>
-                <w:bCs w:val="0"/>
-              </w:rPr>
-              <w:t>element </w:t>
-            </w:r>
-          </w:p>
-          <w:p>
-            <w:pPr>
-              <w:spacing w:after="0" w:line="240" w:lineRule="auto"/>
-              <w:rPr>
-                <w:b w:val="0"/>
-                <w:bCs w:val="0"/>
-              </w:rPr>
-            </w:pPr>
-            <w:r>
-              <w:rPr>
-                <w:b w:val="0"/>
-                <w:bCs w:val="0"/>
-              </w:rPr>
-              <w:t>fetch</w:t>
+              <w:t>Space-Track (ingestionSpaceTrack.py)</w:t>
             </w:r>
           </w:p>
         </w:tc>
@@ -6412,7 +7732,7 @@
               <w:cnfStyle w:val="000000000000" w:firstRow="0" w:lastRow="0" w:firstColumn="0" w:lastColumn="0" w:oddVBand="0" w:evenVBand="0" w:oddHBand="0" w:evenHBand="0" w:firstRowFirstColumn="0" w:firstRowLastColumn="0" w:lastRowFirstColumn="0" w:lastRowLastColumn="0"/>
             </w:pPr>
             <w:r>
-              <w:t>Twice daily (every 12h)</w:t>
+              <w:t>Every 12 h; one pass a day is the full catalogue, the others EPOCH &gt; now − 2</w:t>
             </w:r>
           </w:p>
         </w:tc>
@@ -6427,7 +7747,7 @@
               <w:cnfStyle w:val="000000000000" w:firstRow="0" w:lastRow="0" w:firstColumn="0" w:lastColumn="0" w:oddVBand="0" w:evenVBand="0" w:oddHBand="0" w:evenHBand="0" w:firstRowFirstColumn="0" w:firstRowLastColumn="0" w:lastRowFirstColumn="0" w:lastRowLastColumn="0"/>
             </w:pPr>
             <w:r>
-              <w:t>Within CelesTrak's polling ceiling; most objects don't get a fresh TLE from source more than once every 1–2 days regardless, so this loses negligible freshness vs. the earlier 6h proposal</w:t>
+              <w:t>Most objects don’t get a fresh element set from source more than once every 1–2 days; the daily full pass catches objects leaving the catalogue and recent decays</w:t>
             </w:r>
           </w:p>
         </w:tc>
@@ -6452,7 +7772,7 @@
                 <w:b w:val="0"/>
                 <w:bCs w:val="0"/>
               </w:rPr>
-              <w:t>SATCAT metadata fetch</w:t>
+              <w:t>SatNOGS (ingestionSatNOGS.py)</w:t>
             </w:r>
           </w:p>
         </w:tc>
@@ -6467,7 +7787,7 @@
               <w:cnfStyle w:val="000000000000" w:firstRow="0" w:lastRow="0" w:firstColumn="0" w:lastColumn="0" w:oddVBand="0" w:evenVBand="0" w:oddHBand="0" w:evenHBand="0" w:firstRowFirstColumn="0" w:firstRowLastColumn="0" w:lastRowFirstColumn="0" w:lastRowLastColumn="0"/>
             </w:pPr>
             <w:r>
-              <w:t>Twice daily (every 12h)</w:t>
+              <w:t>Every 12 h, 30 min after Space-Track</w:t>
             </w:r>
           </w:p>
         </w:tc>
@@ -6482,7 +7802,117 @@
               <w:cnfStyle w:val="000000000000" w:firstRow="0" w:lastRow="0" w:firstColumn="0" w:lastColumn="0" w:oddVBand="0" w:evenVBand="0" w:oddHBand="0" w:evenHBand="0" w:firstRowFirstColumn="0" w:firstRowLastColumn="0" w:lastRowFirstColumn="0" w:lastRowLastColumn="0"/>
             </w:pPr>
             <w:r>
-              <w:t>Matches CelesTrak's own SATCAT update cadence (1–2×/day)</w:t>
+              <w:t>Transmitter records and the crosswalk change slowly</w:t>
+            </w:r>
+          </w:p>
+        </w:tc>
+      </w:tr>
+      <w:tr>
+        <w:tc>
+          <w:tcPr>
+            <w:cnfStyle w:val="001000000000" w:firstRow="0" w:lastRow="0" w:firstColumn="1" w:lastColumn="0" w:oddVBand="0" w:evenVBand="0" w:oddHBand="0" w:evenHBand="0" w:firstRowFirstColumn="0" w:firstRowLastColumn="0" w:lastRowFirstColumn="0" w:lastRowLastColumn="0"/>
+            <w:tcW w:w="1413" w:type="dxa"/>
+            <w:hideMark/>
+          </w:tcPr>
+          <w:p>
+            <w:pPr>
+              <w:spacing w:after="0" w:line="240" w:lineRule="auto"/>
+              <w:rPr>
+                <w:b w:val="0"/>
+                <w:bCs w:val="0"/>
+              </w:rPr>
+            </w:pPr>
+            <w:r>
+              <w:rPr>
+                <w:b w:val="0"/>
+                <w:bCs w:val="0"/>
+              </w:rPr>
+              <w:t>CelesTrak (ingestionCelesTrak.py)</w:t>
+            </w:r>
+          </w:p>
+        </w:tc>
+        <w:tc>
+          <w:tcPr>
+            <w:tcW w:w="1134" w:type="dxa"/>
+            <w:hideMark/>
+          </w:tcPr>
+          <w:p>
+            <w:pPr>
+              <w:spacing w:after="0" w:line="240" w:lineRule="auto"/>
+              <w:cnfStyle w:val="000000000000" w:firstRow="0" w:lastRow="0" w:firstColumn="0" w:lastColumn="0" w:oddVBand="0" w:evenVBand="0" w:oddHBand="0" w:evenHBand="0" w:firstRowFirstColumn="0" w:firstRowLastColumn="0" w:lastRowFirstColumn="0" w:lastRowLastColumn="0"/>
+            </w:pPr>
+            <w:r>
+              <w:t>Every 3 days (72 h minimum between passes); off on the live server</w:t>
+            </w:r>
+          </w:p>
+        </w:tc>
+        <w:tc>
+          <w:tcPr>
+            <w:tcW w:w="6525" w:type="dxa"/>
+            <w:hideMark/>
+          </w:tcPr>
+          <w:p>
+            <w:pPr>
+              <w:spacing w:after="0" w:line="240" w:lineRule="auto"/>
+              <w:cnfStyle w:val="000000000000" w:firstRow="0" w:lastRow="0" w:firstColumn="0" w:lastColumn="0" w:oddVBand="0" w:evenVBand="0" w:oddHBand="0" w:evenHBand="0" w:firstRowFirstColumn="0" w:firstRowLastColumn="0" w:lastRowFirstColumn="0" w:lastRowLastColumn="0"/>
+            </w:pPr>
+            <w:r>
+              <w:t>Group membership changes slowly; keeps well inside CelesTrak’s etiquette after the 2026-08 block</w:t>
+            </w:r>
+          </w:p>
+        </w:tc>
+      </w:tr>
+      <w:tr>
+        <w:tc>
+          <w:tcPr>
+            <w:cnfStyle w:val="001000000000" w:firstRow="0" w:lastRow="0" w:firstColumn="1" w:lastColumn="0" w:oddVBand="0" w:evenVBand="0" w:oddHBand="0" w:evenHBand="0" w:firstRowFirstColumn="0" w:firstRowLastColumn="0" w:lastRowFirstColumn="0" w:lastRowLastColumn="0"/>
+            <w:tcW w:w="1413" w:type="dxa"/>
+            <w:hideMark/>
+          </w:tcPr>
+          <w:p>
+            <w:pPr>
+              <w:spacing w:after="0" w:line="240" w:lineRule="auto"/>
+              <w:rPr>
+                <w:b w:val="0"/>
+                <w:bCs w:val="0"/>
+              </w:rPr>
+            </w:pPr>
+            <w:r>
+              <w:rPr>
+                <w:b w:val="0"/>
+                <w:bCs w:val="0"/>
+              </w:rPr>
+              <w:t>GCAT (ingestGcat.py)</w:t>
+            </w:r>
+          </w:p>
+        </w:tc>
+        <w:tc>
+          <w:tcPr>
+            <w:tcW w:w="1134" w:type="dxa"/>
+            <w:hideMark/>
+          </w:tcPr>
+          <w:p>
+            <w:pPr>
+              <w:spacing w:after="0" w:line="240" w:lineRule="auto"/>
+              <w:cnfStyle w:val="000000000000" w:firstRow="0" w:lastRow="0" w:firstColumn="0" w:lastColumn="0" w:oddVBand="0" w:evenVBand="0" w:oddHBand="0" w:evenHBand="0" w:firstRowFirstColumn="0" w:firstRowLastColumn="0" w:lastRowFirstColumn="0" w:lastRowLastColumn="0"/>
+            </w:pPr>
+            <w:r>
+              <w:t>Weekly, Sunday 03:00</w:t>
+            </w:r>
+          </w:p>
+        </w:tc>
+        <w:tc>
+          <w:tcPr>
+            <w:tcW w:w="6525" w:type="dxa"/>
+            <w:hideMark/>
+          </w:tcPr>
+          <w:p>
+            <w:pPr>
+              <w:spacing w:after="0" w:line="240" w:lineRule="auto"/>
+              <w:cnfStyle w:val="000000000000" w:firstRow="0" w:lastRow="0" w:firstColumn="0" w:lastColumn="0" w:oddVBand="0" w:evenVBand="0" w:oddHBand="0" w:evenHBand="0" w:firstRowFirstColumn="0" w:firstRowLastColumn="0" w:lastRowFirstColumn="0" w:lastRowLastColumn="0"/>
+            </w:pPr>
+            <w:r>
+              <w:t>GCAT updates nightly, but ~30 MB is not worth fetching more often</w:t>
             </w:r>
           </w:p>
         </w:tc>
@@ -6495,7 +7925,7 @@
     </w:p>
     <w:p>
       <w:r>
-        <w:t xml:space="preserve">All three downloads shall be chunked and throttled to avoid reaching the rate limit. </w:t>
+        <w:t>Every source is fetched politely: one Space-Track login per run with timeouts and logout, an identifying User-Agent everywhere, 3 s between CelesTrak groups, and failures recorded as failed runs rather than retried in a loop.</w:t>
       </w:r>
     </w:p>
     <w:p>
@@ -6508,7 +7938,7 @@
     </w:p>
     <w:p>
       <w:r>
-        <w:t xml:space="preserve">The orbital objects data shall be held in a new domain database: ingestionDBs/orbitalObjects.db (SQLite via Python’s sqlite3 module, WAL mode) — consistent with the project's one-process-per-domain, one-database-per-domain architecture. The data will be held in a single table, with data upserted (rather than appended) keyed on the NORAD catalog number, since this is current-state data. </w:t>
+        <w:t>The raw data is held per source (ingestionSpaceTrack.db, ingestionCelesTrak.db, ingestionSatNOGS.db, ingestionGCAT.db; SQLite, WAL mode), upserted rather than appended and keyed on the NORAD catalogue number (SatNOGS: transmitter uuid and its own number). What the website reads is orbital_objects in siteOrbital.db, rebuilt from them on every publish. Until 2026-10-21 it was a single table in ingestionDBs/orbitalObjects.db, upserted by ingestOrbitalData.py; that file is legacy and stays on the live server until the clean-up step.</w:t>
       </w:r>
     </w:p>
     <w:p>
@@ -6574,6 +8004,17 @@
     </w:p>
     <w:p>
       <w:pPr>
+        <w:numPr>
+          <w:ilvl w:val="0"/>
+          <w:numId w:val="11"/>
+        </w:numPr>
+      </w:pPr>
+      <w:r>
+        <w:t>Since the refactor this works in two layers: ingestionSpaceTrack.db keeps every object it has seen, with lastSeenFull showing whether the latest full pass still had it, while the publish step carries into siteOrbital.db only objects still in the catalogue with elements at most 30 days old, plus objects decayed within the last 30 days, kept with their decay date. A disappearance from the site can therefore always be checked against the ingestion database.</w:t>
+      </w:r>
+    </w:p>
+    <w:p>
+      <w:pPr>
         <w:pStyle w:val="Heading3"/>
       </w:pPr>
       <w:r>
@@ -6585,7 +8026,7 @@
         <w:rPr>
           <w:highlight w:val="yellow"/>
         </w:rPr>
-        <w:t>The implemented API is three endpoints, not the single group-filtered one originally planned here -- the client's needs turned out to split cleanly into three different access patterns. GET /api/orbital-objects?ids=&lt;comma-separated noradIDs&gt; serves the GRD-TRACK panel's persisted plotted-objects list (batched into one request, not one per object). GET /api/orbital-objects/filter-options returns the distinct owner and CelesTrak group values currently in the database, read live rather than hardcoded, for the ADD OBJ search form's dropdowns. GET /api/orbital-objects/search?name=&amp;noradId=&amp;owner=&amp;objectType=&amp;group=&amp;altitudeRegime=&amp;inclinationBand= is the ADD OBJ search itself -- every filter is optional and AND-combined, group filtering joins through orbital_object_groups (see below), and results are capped at 500 (with a 4000-row pre-filter scan cap so a lightly-filtered search can't force a full-table scan on every request). The original reasoning for not implementing a full unfiltered dump still holds -- the full catalog's raw TLE text alone is about equal to the project's 5MB initial-load budget -- it's just enforced per-endpoint now rather than via a single ?group= parameter.</w:t>
+        <w:t>The implemented API is three endpoints, not the single group-filtered one originally planned here -- the client's needs turned out to split cleanly into three different access patterns. GET /api/orbital-objects?ids=&lt;comma-separated noradIDs&gt; serves the GRD-TRACK panel's persisted plotted-objects list (batched into one request, not one per object). GET /api/orbital-objects/filter-options returns the distinct owner and group values currently in the database, read live rather than hardcoded, for the ADD OBJ search form's dropdowns. GET /api/orbital-objects/search?name=&amp;noradId=&amp;owner=&amp;objectType=&amp;group=&amp;altitudeRegime=&amp;inclinationBand= is the ADD OBJ search itself -- every filter is optional and AND-combined, group filtering joins through orbital_object_groups (see below), and results are capped at 500 (with a 4000-row pre-filter scan cap so a lightly-filtered search can't force a full-table scan on every request). The original reasoning for not implementing a full unfiltered dump still holds -- the full catalog's raw TLE text alone is about equal to the project's 5MB initial-load budget -- it's just enforced per-endpoint now rather than via a single ?group= parameter.</w:t>
       </w:r>
     </w:p>
     <w:p>
@@ -6606,7 +8047,7 @@
         <w:rPr>
           <w:highlight w:val="yellow"/>
         </w:rPr>
-        <w:t>The implemented panel goes beyond ground-track rendering alone, none of which was documented here at the time of writing: an ADD OBJ search form (name/NORAD ID/owner/object type/CelesTrak group/altitude regime/inclination band, against the /api/orbital-objects/search endpoint above) lets a user find and plot objects; a persisted plotted-objects list (localStorage) survives reloads; SHW FOOT renders each plotted object's sensor footprint, recomputed on a live interval rather than drawn once; and a separate observer-location feature (IP geolocation, deliberately not the browser Geolocation API, plus a manual LAT/LON/PLACE override) drives a "you are here" marker independent of the TLE data entirely.</w:t>
+        <w:t>The implemented panel goes beyond ground-track rendering alone, none of which was documented here at the time of writing: an ADD OBJ search form (name/NORAD ID/owner/object type/group/altitude regime/inclination band, against the /api/orbital-objects/search endpoint above) lets a user find and plot objects; a persisted plotted-objects list (localStorage) survives reloads; SHW FOOT renders each plotted object's sensor footprint, recomputed on a live interval rather than drawn once; and a separate observer-location feature (IP geolocation, deliberately not the browser Geolocation API, plus a manual LAT/LON/PLACE override) drives a "you are here" marker independent of the TLE data entirely.</w:t>
       </w:r>
     </w:p>
     <w:p>
@@ -6637,36 +8078,37 @@
     </w:p>
     <w:p>
       <w:r>
-        <w:t xml:space="preserve">    CT[CelesTrak] --&gt;|primary| ING[ingestOrbitalData.py]</w:t>
-      </w:r>
-    </w:p>
-    <w:p>
-      <w:r>
-        <w:t xml:space="preserve">    ST[Space-Track.org] --&gt;|fallback + verification| ING</w:t>
-      </w:r>
-    </w:p>
-    <w:p>
-      <w:r>
-        <w:t xml:space="preserve">    SN[SatNOGS DB] --&gt;|supplemental| ING</w:t>
-      </w:r>
-    </w:p>
-    <w:p>
-      <w:r>
-        <w:t xml:space="preserve">    ING --&gt;|upsert by noradID| DB[(orbitalObjects.db)]</w:t>
-      </w:r>
-    </w:p>
-    <w:p>
-      <w:r>
-        <w:t xml:space="preserve">    DB --&gt; API["/api/orbital-objects</w:t>
-      </w:r>
-      <w:r>
-        <w:rPr>
-          <w:highlight w:val="yellow"/>
-        </w:rPr>
-        <w:t>?ids=... | /search?...</w:t>
-      </w:r>
-      <w:r>
-        <w:t>"]</w:t>
+        <w:t xml:space="preserve">    ST[Space-Track (NORAD)] --&gt;|elements + catalogue| IST[ingestionSpaceTrack.py] --&gt; DST[(ingestionSpaceTrack.db)]</w:t>
+      </w:r>
+    </w:p>
+    <w:p>
+      <w:r>
+        <w:t xml:space="preserve">    CT[CelesTrak] --&gt;|group lists + RCS, every 3 days| ICT[ingestionCelesTrak.py] --&gt; DCT[(ingestionCelesTrak.db)]</w:t>
+      </w:r>
+    </w:p>
+    <w:p>
+      <w:r>
+        <w:t xml:space="preserve">    SN[SatNOGS DB] --&gt;|transmitters + TLE crosswalk| ISN[ingestionSatNOGS.py] --&gt; DSN[(ingestionSatNOGS.db)]</w:t>
+      </w:r>
+    </w:p>
+    <w:p>
+      <w:r>
+        <w:t xml:space="preserve">    GC[GCAT] --&gt;|weekly| IGC[ingestGcat.py] --&gt; DGC[(ingestionGCAT.db)]</w:t>
+      </w:r>
+    </w:p>
+    <w:p>
+      <w:r>
+        <w:t xml:space="preserve">    DST &amp; DCT &amp; DSN &amp; DGC --&gt;|read-only, after a run with changes| PUB[publishSite.py orbital]</w:t>
+      </w:r>
+    </w:p>
+    <w:p>
+      <w:r>
+        <w:t xml:space="preserve">    PUB --&gt;|checks, .prev, os.replace| SITE[(siteOrbital.db)]</w:t>
+      </w:r>
+    </w:p>
+    <w:p>
+      <w:r>
+        <w:t xml:space="preserve">    SITE --&gt;|site_db orbital| API["/api/orbital-objects?ids=... | /search?..."]</w:t>
       </w:r>
     </w:p>
     <w:p>
@@ -6711,12 +8153,42 @@
     </w:p>
     <w:p>
       <w:r>
-        <w:t xml:space="preserve">        TEXT line1</w:t>
-      </w:r>
-    </w:p>
-    <w:p>
-      <w:r>
-        <w:t xml:space="preserve">        TEXT line2</w:t>
+        <w:t xml:space="preserve">        TEXT objectID</w:t>
+      </w:r>
+    </w:p>
+    <w:p>
+      <w:r>
+        <w:t xml:space="preserve">        REAL meanMotion</w:t>
+      </w:r>
+    </w:p>
+    <w:p>
+      <w:r>
+        <w:t xml:space="preserve">        REAL eccentricity</w:t>
+      </w:r>
+    </w:p>
+    <w:p>
+      <w:r>
+        <w:t xml:space="preserve">        REAL inclination</w:t>
+      </w:r>
+    </w:p>
+    <w:p>
+      <w:r>
+        <w:t xml:space="preserve">        REAL raOfAscNode</w:t>
+      </w:r>
+    </w:p>
+    <w:p>
+      <w:r>
+        <w:t xml:space="preserve">        REAL argOfPericenter</w:t>
+      </w:r>
+    </w:p>
+    <w:p>
+      <w:r>
+        <w:t xml:space="preserve">        REAL meanAnomaly</w:t>
+      </w:r>
+    </w:p>
+    <w:p>
+      <w:r>
+        <w:t xml:space="preserve">        REAL bstar</w:t>
       </w:r>
     </w:p>
     <w:p>
@@ -6791,7 +8263,7 @@
     </w:p>
     <w:p>
       <w:r>
-        <w:t>Field notes updated accordingly: `noradID` (PK), `objectType`/`owner`/`launchDate`/`decayDate`/`rcsSize` (SATCAT job), `decayDate IS NOT NULL` is the exclusion filter, `source` and `fetchedAt` as before.Where:-</w:t>
+        <w:t>Field notes (siteOrbital.db, since 2026-10-21; abridged — the full list is ORBITAL_TABLE_SQL in scripts/publishSite.py): every column comes from Space-Track except rcsSize (CelesTrak’s kept figure), the radio columns (SatNOGS, via the publish step) and the EIRP and G/T columns (enrichEirp, a publish stage). Where:-</w:t>
       </w:r>
     </w:p>
     <w:p>
@@ -6807,7 +8279,7 @@
         <w:pStyle w:val="ListParagraph"/>
       </w:pPr>
       <w:r>
-        <w:t>line1 / line2 — raw TLE lines, kept verbatim rather than fully decomposed, matching the "store the source alongside the derived value" audit pattern from the star-catalogue pipeline.</w:t>
+        <w:t>objectID and the element columns (meanMotion, eccentricity, inclination, raOfAscNode, argOfPericenter, meanAnomaly, bstar, meanMotionDot, meanMotionDdot) — Space-Track’s OMM fields as published; the client builds its SGP4 record from them. No TLE lines are stored. objectID (the international designator) also links SatNOGS transmitters to their object.</w:t>
       </w:r>
     </w:p>
     <w:p>
@@ -6818,10 +8290,7 @@
         <w:rPr>
           <w:highlight w:val="yellow"/>
         </w:rPr>
-        <w:t>objectType, owner, launch_date, decay_date, rcs_size, period, apogee, perigee</w:t>
-      </w:r>
-      <w:r>
-        <w:t xml:space="preserve"> — populated/refreshed by the SATCAT job, on its own slower cadence.</w:t>
+        <w:t>objectType, owner, launchDate, decayDate, period, apogee, perigee, rcsCategory — from the same Space-Track record (the catalogue fields come inline with the elements), refreshed on every run.</w:t>
       </w:r>
     </w:p>
     <w:p>
@@ -6837,7 +8306,7 @@
         <w:pStyle w:val="ListParagraph"/>
       </w:pPr>
       <w:r>
-        <w:t>source — which feed (celestrak / space-track / satnogs) supplied the most recent update for that row.</w:t>
+        <w:t>source — always space-track since the refactor (it named celestrak / space-track / satnogs before).</w:t>
       </w:r>
     </w:p>
     <w:p>
@@ -6845,7 +8314,7 @@
         <w:pStyle w:val="ListParagraph"/>
       </w:pPr>
       <w:r>
-        <w:t>fetchedAt — last successful ingestion timestamp for that row.</w:t>
+        <w:t>fetchedAt — when the row’s Space-Track record was last fetched.</w:t>
       </w:r>
     </w:p>
     <w:p>
@@ -6870,8 +8339,7 @@
     </w:p>
     <w:p>
       <w:r>
-        <w:lastRenderedPageBreak/>
-        <w:t>We store which CelesTrak groups each satellite belongs to. A satellite can belong to more than one group at once. Starlink satellites sit in both "starlink" and "active." A single column cannot hold that cleanly, so we use a second table, orbital_object_groups, with one row per satellite per group.</w:t>
+        <w:t>We store which groups each satellite belongs to — CelesTrak’s lists while they are available, otherwise our own rules (decision A, under ARCHITECTURE). A satellite can belong to more than one group at once. Starlink satellites sit in both "starlink" and "active." A single column cannot hold that cleanly, so we use a second table, orbital_object_groups, with one row per satellite per group.</w:t>
       </w:r>
     </w:p>
     <w:p>
@@ -6881,7 +8349,7 @@
     </w:p>
     <w:p>
       <w:r>
-        <w:t>Not every satellite has a group. CelesTrak does not sort every object into a named list. It has no general group for rocket bodies or debris, only three for specific fragmentation events. Objects that come from Space-Track or SatNOGS also have no group, since neither source tags objects by group. A satellite with no rows in the groups table is not an error. It simply means CelesTrak places no named list around that object.</w:t>
+        <w:t>Not every satellite has a group. CelesTrak does not sort every object into a named list: it has no general group for rocket bodies or debris, only three for specific fragmentation events, and our own rules cover only active and 13 constellations. While CelesTrak is unavailable the groups without a rule are absent altogether. A satellite with no rows in the groups table is not an error.</w:t>
       </w:r>
     </w:p>
     <w:p/>
@@ -7065,23 +8533,7 @@
                 <w:sz w:val="21"/>
                 <w:szCs w:val="21"/>
               </w:rPr>
-              <w:t>CelesTrak (</w:t>
-            </w:r>
-            <w:r>
-              <w:rPr>
-                <w:rFonts w:ascii="Courier New" w:hAnsi="Courier New" w:cs="Courier New"/>
-                <w:sz w:val="20"/>
-                <w:szCs w:val="20"/>
-              </w:rPr>
-              <w:t>satcat.csv</w:t>
-            </w:r>
-            <w:r>
-              <w:rPr>
-                <w:rFonts w:ascii="Segoe UI" w:hAnsi="Segoe UI" w:cs="Segoe UI"/>
-                <w:sz w:val="21"/>
-                <w:szCs w:val="21"/>
-              </w:rPr>
-              <w:t>)</w:t>
+              <w:t>Space-Track gp OBJECT_TYPE (PAYLOAD, ROCKET BODY, DEBRIS, UNKNOWN), mapped by publishSite.py</w:t>
             </w:r>
           </w:p>
         </w:tc>
@@ -7162,23 +8614,7 @@
                 <w:sz w:val="21"/>
                 <w:szCs w:val="21"/>
               </w:rPr>
-              <w:t>CelesTrak (</w:t>
-            </w:r>
-            <w:r>
-              <w:rPr>
-                <w:rFonts w:ascii="Courier New" w:hAnsi="Courier New" w:cs="Courier New"/>
-                <w:sz w:val="20"/>
-                <w:szCs w:val="20"/>
-              </w:rPr>
-              <w:t>satcat.csv</w:t>
-            </w:r>
-            <w:r>
-              <w:rPr>
-                <w:rFonts w:ascii="Segoe UI" w:hAnsi="Segoe UI" w:cs="Segoe UI"/>
-                <w:sz w:val="21"/>
-                <w:szCs w:val="21"/>
-              </w:rPr>
-              <w:t>)</w:t>
+              <w:t>Space-Track gp OBJECT_TYPE (PAYLOAD, ROCKET BODY, DEBRIS, UNKNOWN), mapped by publishSite.py</w:t>
             </w:r>
           </w:p>
         </w:tc>
@@ -7259,23 +8695,7 @@
                 <w:sz w:val="21"/>
                 <w:szCs w:val="21"/>
               </w:rPr>
-              <w:t>CelesTrak (</w:t>
-            </w:r>
-            <w:r>
-              <w:rPr>
-                <w:rFonts w:ascii="Courier New" w:hAnsi="Courier New" w:cs="Courier New"/>
-                <w:sz w:val="20"/>
-                <w:szCs w:val="20"/>
-              </w:rPr>
-              <w:t>satcat.csv</w:t>
-            </w:r>
-            <w:r>
-              <w:rPr>
-                <w:rFonts w:ascii="Segoe UI" w:hAnsi="Segoe UI" w:cs="Segoe UI"/>
-                <w:sz w:val="21"/>
-                <w:szCs w:val="21"/>
-              </w:rPr>
-              <w:t>)</w:t>
+              <w:t>Space-Track gp OBJECT_TYPE (PAYLOAD, ROCKET BODY, DEBRIS, UNKNOWN), mapped by publishSite.py</w:t>
             </w:r>
           </w:p>
         </w:tc>
@@ -7356,23 +8776,7 @@
                 <w:sz w:val="21"/>
                 <w:szCs w:val="21"/>
               </w:rPr>
-              <w:t>CelesTrak (</w:t>
-            </w:r>
-            <w:r>
-              <w:rPr>
-                <w:rFonts w:ascii="Courier New" w:hAnsi="Courier New" w:cs="Courier New"/>
-                <w:sz w:val="20"/>
-                <w:szCs w:val="20"/>
-              </w:rPr>
-              <w:t>satcat.csv</w:t>
-            </w:r>
-            <w:r>
-              <w:rPr>
-                <w:rFonts w:ascii="Segoe UI" w:hAnsi="Segoe UI" w:cs="Segoe UI"/>
-                <w:sz w:val="21"/>
-                <w:szCs w:val="21"/>
-              </w:rPr>
-              <w:t>)</w:t>
+              <w:t>Space-Track gp OBJECT_TYPE (PAYLOAD, ROCKET BODY, DEBRIS, UNKNOWN), mapped by publishSite.py</w:t>
             </w:r>
           </w:p>
         </w:tc>
@@ -7428,64 +8832,32 @@
                 <w:sz w:val="21"/>
                 <w:szCs w:val="21"/>
               </w:rPr>
-              <w:t>Object type not yet classified (unabbreviated equivalent of </w:t>
-            </w:r>
-            <w:r>
-              <w:rPr>
-                <w:rFonts w:ascii="Courier New" w:hAnsi="Courier New" w:cs="Courier New"/>
-                <w:sz w:val="20"/>
-                <w:szCs w:val="20"/>
-              </w:rPr>
-              <w:t>UNK</w:t>
-            </w:r>
-            <w:r>
+              <w:t>Object type not yet classified (unabbreviated equivalent of UNK)</w:t>
+            </w:r>
+          </w:p>
+        </w:tc>
+        <w:tc>
+          <w:tcPr>
+            <w:tcW w:w="2557" w:type="dxa"/>
+            <w:hideMark/>
+          </w:tcPr>
+          <w:p>
+            <w:pPr>
+              <w:spacing w:after="0" w:line="240" w:lineRule="auto"/>
+              <w:cnfStyle w:val="000000000000" w:firstRow="0" w:lastRow="0" w:firstColumn="0" w:lastColumn="0" w:oddVBand="0" w:evenVBand="0" w:oddHBand="0" w:evenHBand="0" w:firstRowFirstColumn="0" w:firstRowLastColumn="0" w:lastRowFirstColumn="0" w:lastRowLastColumn="0"/>
               <w:rPr>
                 <w:rFonts w:ascii="Segoe UI" w:hAnsi="Segoe UI" w:cs="Segoe UI"/>
                 <w:sz w:val="21"/>
                 <w:szCs w:val="21"/>
               </w:rPr>
-              <w:t>)</w:t>
-            </w:r>
-          </w:p>
-        </w:tc>
-        <w:tc>
-          <w:tcPr>
-            <w:tcW w:w="2557" w:type="dxa"/>
-            <w:hideMark/>
-          </w:tcPr>
-          <w:p>
-            <w:pPr>
-              <w:spacing w:after="0" w:line="240" w:lineRule="auto"/>
-              <w:cnfStyle w:val="000000000000" w:firstRow="0" w:lastRow="0" w:firstColumn="0" w:lastColumn="0" w:oddVBand="0" w:evenVBand="0" w:oddHBand="0" w:evenHBand="0" w:firstRowFirstColumn="0" w:firstRowLastColumn="0" w:lastRowFirstColumn="0" w:lastRowLastColumn="0"/>
+            </w:pPr>
+            <w:r>
               <w:rPr>
                 <w:rFonts w:ascii="Segoe UI" w:hAnsi="Segoe UI" w:cs="Segoe UI"/>
                 <w:sz w:val="21"/>
                 <w:szCs w:val="21"/>
               </w:rPr>
-            </w:pPr>
-            <w:r>
-              <w:rPr>
-                <w:rFonts w:ascii="Segoe UI" w:hAnsi="Segoe UI" w:cs="Segoe UI"/>
-                <w:sz w:val="21"/>
-                <w:szCs w:val="21"/>
-              </w:rPr>
-              <w:t>Space-Track (</w:t>
-            </w:r>
-            <w:r>
-              <w:rPr>
-                <w:rFonts w:ascii="Courier New" w:hAnsi="Courier New" w:cs="Courier New"/>
-                <w:sz w:val="20"/>
-                <w:szCs w:val="20"/>
-              </w:rPr>
-              <w:t>gp</w:t>
-            </w:r>
-            <w:r>
-              <w:rPr>
-                <w:rFonts w:ascii="Segoe UI" w:hAnsi="Segoe UI" w:cs="Segoe UI"/>
-                <w:sz w:val="21"/>
-                <w:szCs w:val="21"/>
-              </w:rPr>
-              <w:t> class, backfill only)</w:t>
+              <w:t>No longer stored: the publish step maps it to UNK</w:t>
             </w:r>
           </w:p>
         </w:tc>
@@ -7552,7 +8924,7 @@
     <w:p>
       <w:pPr/>
       <w:r>
-        <w:t>Two sources, each used for what it is right for. GCAT (ingestionDBs/gcat.db, written weekly by scripts/ingestGcat.py -- see the Launches section) decides which payloads are in orbit and who owns them: state, owner organisations and class (each payload’s own: A academic, B commercial, C civil government, D defence). orbitalObjects.db (the 12-hourly orbital pipeline, OMM element sets plus the NORAD satellite catalogue) gives where each one is now -- its current perigee and apogee -- matched to GCAT by NORAD number.</w:t>
+        <w:t>Two sources, each used for what it is right for. GCAT (ingestionGCAT.db, written weekly by scripts/ingestGcat.py -- see the Launches section) decides which payloads are in orbit and who owns them: state, owner organisations and class (each payload’s own: A academic, B commercial, C civil government, D defence). The NORAD satellite catalogue via Space-Track (orbital_objects in siteOrbital.db) gives where each one is now -- its current perigee and apogee -- matched to GCAT by NORAD number. Active status and the stations and Starlink groups come from orbital_object_groups (decision A).</w:t>
       </w:r>
     </w:p>
     <w:p>
@@ -7586,7 +8958,7 @@
         <w:pStyle w:val="ListParagraph"/>
       </w:pPr>
       <w:r>
-        <w:t>After either source changes -- at the end of every scripts/ingestGcat.py run (including runs where GCAT’s files were unchanged and skipped), and as the last step (5) of scripts/runPipeline.sh, after the orbital elements and catalogue have been refreshed. Ownership changes slowly; current orbit is the part that must be up to date, so recalculating after each 12-hourly pipeline run keeps the regime figures current.</w:t>
+        <w:t>As a stage of every orbital publish -- that is, after any Space-Track, SatNOGS, CelesTrak or GCAT run that changed something (orbitStats.refreshAll, run by scripts/publishSite.py). Ownership changes slowly; current orbit is the part that must be up to date, so recalculating after each 12-hourly Space-Track run keeps the regime figures current.</w:t>
       </w:r>
     </w:p>
     <w:p>
@@ -7594,7 +8966,7 @@
         <w:pStyle w:val="ListParagraph"/>
       </w:pPr>
       <w:r>
-        <w:t>On demand -- python scripts/orbitStats.py recalculates everything without re-downloading, so a change to a chart’s rules (top-N cut-off, labels, regime boundaries) takes effect immediately. The same pattern as scripts/tagNews.py for news topics. It skips itself until both source databases exist.</w:t>
+        <w:t>On demand -- python scripts/publishSite.py orbital recalculates everything from the ingestion databases without re-downloading, so a change to a chart’s rules (top-N cut-off, labels, regime boundaries) takes effect at once. The same pattern as scripts/tagNews.py for news topics.</w:t>
       </w:r>
     </w:p>
     <w:p>
@@ -7614,7 +8986,7 @@
     <w:p>
       <w:pPr/>
       <w:r>
-        <w:t>Derived figures live in their own database, ingestionDBs/onOrbitStats.db, written only by scripts/orbitStats.py (one small function per table) -- separate from both sources because it is built from both. It is rebuilt each run and not committed to git.</w:t>
+        <w:t>Derived figures are tables in siteOrbital.db, written by the orbitStats stage of the publish step -- rebuilt on every publish and never committed to git. Until 2026-10-21 they lived in their own database, ingestionDBs/onOrbitStats.db (legacy, removed at the clean-up step).</w:t>
       </w:r>
     </w:p>
     <w:p>
@@ -7644,7 +9016,7 @@
     <w:p>
       <w:pPr/>
       <w:r>
-        <w:t>GET /api/on-orbit/nationality returns {rows: [{label, stateCode, payloads}], totalPayloads}; GET /api/on-orbit/regimes returns {rows: [{regime, all, exclSpacex}]}. Both read onOrbitStats.db, opened only once it exists, and return empty rows rather than an error before then.</w:t>
+        <w:t>GET /api/on-orbit/nationality returns {rows: [{label, stateCode, payloads}], totalPayloads}; GET /api/on-orbit/regimes returns {rows: [{regime, all, exclSpacex}]}. Both read siteOrbital.db (stats_db()), opened only once it exists, and return empty rows rather than an error before then.</w:t>
       </w:r>
     </w:p>
     <w:p>
@@ -7678,7 +9050,7 @@
     <w:p>
       <w:pPr/>
       <w:r>
-        <w:t>Implemented (2026-10-09): the ON-ORBIT section, the payloads-by-nationality chart, the current-orbit regime table, and scripts/orbitStats.py with onOrbitStats.db. To do: the sector, inclination and altitude charts; actions for the control-area buttons. GCAT’s payload date columns TLast, TOp and TDate are stored but their meanings still need confirming before any “operational vs inactive” split relies on them.</w:t>
+        <w:t>Implemented (2026-10-09): the ON-ORBIT section, the payloads-by-nationality chart, the current-orbit regime table, and scripts/orbitStats.py with onOrbitStats.db (since 2026-10-21 a stage of the publish step, its tables in siteOrbital.db). To do: the sector, inclination and altitude charts; actions for the control-area buttons. GCAT’s payload date columns TLast, TOp and TDate are stored but their meanings still need confirming before any “operational vs inactive” split relies on them.</w:t>
       </w:r>
     </w:p>
     <w:p>
@@ -7807,7 +9179,7 @@
           </w:tcPr>
           <w:p>
             <w:r>
-              <w:t>Orbital catalogues - Space-Track / CelesTrak (OMM elements + SATCAT)</w:t>
+              <w:t>Orbital catalogues - the NORAD catalogue via Space-Track (OMM elements + SATCAT, the only orbit source); CelesTrak for group lists and radar cross-sections</w:t>
             </w:r>
           </w:p>
         </w:tc>
@@ -7932,10 +9304,7 @@
         <w:rPr>
           <w:b/>
         </w:rPr>
-        <w:t xml:space="preserve">Downlink EIRP. </w:t>
-      </w:r>
-      <w:r>
-        <w:t>Two tiers, produced by the ingestion-pipeline enrichment step. Tier 1 (filing): a curated table keyed by constellation / operator, values from FCC Schedule S, ITU filings, GNSS ICDs and published footprint contours (Starlink Ku 38 dBW, OneWeb Ku 36, Kuiper Ka 38, GNSS L 27, Iridium-NEXT L 17, Globalstar S 20, ORBCOMM VHF 12, Planet X 13, GEO comms Ku ~52), matched by CelesTrak group with a name-prefix fallback. Tier 2 (estimated): no constellation match, so the band is inferred from the object's groups / type / orbit and the EIRP read from a (band, mission-class) table. Rocket bodies and debris are tagged 'none'. About three-quarters of active payloads get a value; every figure is a boresight / filed-maximum number.</w:t>
+        <w:t>Downlink EIRP. Two tiers, produced by the ingestion-pipeline enrichment step. Tier 1 (filing): a curated table keyed by constellation / operator, values from FCC Schedule S, ITU filings, GNSS ICDs and published footprint contours (Starlink Ku 38 dBW, OneWeb Ku 36, Kuiper Ka 38, GNSS L 27, Iridium-NEXT L 17, Globalstar S 20, ORBCOMM VHF 12, Planet X 13, GEO comms Ku ~52), matched by group (CelesTrak’s lists when available, otherwise our rules -- decision A) with a name-prefix fallback. Tier 2 (estimated): no constellation match, so the band is inferred from the object's mission class -- from CelesTrak’s function groups and the orbit, or, only while CelesTrak is unavailable, from GCAT (enrichEirp.gcat_class; see ARCHITECTURE) -- and the EIRP read from a (band, mission-class) table. Rocket bodies and debris are tagged 'none'. About three-quarters of active payloads get a value; every figure is a boresight / filed-maximum number.</w:t>
       </w:r>
     </w:p>
     <w:p>
@@ -7943,10 +9312,7 @@
         <w:rPr>
           <w:b/>
         </w:rPr>
-        <w:t xml:space="preserve">Downlink and uplink centre frequency. </w:t>
-      </w:r>
-      <w:r>
-        <w:t>The budget needs a real frequency, not a band letter - both free-space loss and rain attenuation scale with it, and X-band alone spans 8-12 GHz ~3.5 dB. Downlink: exact downlink_low / downlink_high from the SatNOGS DB where the satellite is listed; otherwise the mid-point of the enriched downlink band; otherwise unknown. Uplink is harder, because it is a different frequency from the downlink and usually a different band: uplink_low / uplink_high from SatNOGS (present only for transceiver / transponder records); otherwise a curated per-constellation uplink band or the standard paired Earth-to-space allocation, taken at mid-point; otherwise unknown. A satellite the station only needs to receive needs no uplink figure.</w:t>
+        <w:t>Downlink and uplink centre frequency. The budget needs a real frequency, not a band letter - both free-space loss and rain attenuation scale with it, and X-band alone spans 8-12 GHz ~3.5 dB. Downlink: exact downlink_low / downlink_high from the SatNOGS DB where the satellite is listed (transmitters linked to the NORAD object by follow ID, then designator, then own number, and the main downlink and uplink picked by rfSelection.choose_rf, at the publish step); otherwise the mid-point of the enriched downlink band; otherwise unknown. Uplink is harder, because it is a different frequency from the downlink and usually a different band: uplink_low / uplink_high from SatNOGS (present only for transceiver / transponder records); otherwise a curated per-constellation uplink band or the standard paired Earth-to-space allocation, taken at mid-point; otherwise unknown. A satellite the station only needs to receive needs no uplink figure.</w:t>
       </w:r>
     </w:p>
     <w:p>
@@ -8911,7 +10277,7 @@
         <w:pStyle w:val="ListParagraph"/>
       </w:pPr>
       <w:r>
-        <w:t>scripts/ingestGcat.py — Implemented 2026-10-09 (planned here as ingestGcatPayloads.py). Downloads four GCAT files weekly (satcat, psatcat, orgs, launchlog; ~30 MB, no auth, CC-BY-4.0), with If-Modified-Since so unchanged files are skipped, and replaces each table whole inside one transaction in its own ingestionDBs/gcat.db (gcatObjects, gcatPayloads, gcatOrgs, gcatLaunches) -- a separate database because GCAT now serves two sections, Launches and the ON-ORBIT overview. Matching GCAT launches to LL2 launches by date + site, with method/confidence in launch_payloads, becomes a separate step once LL2 ingestion exists.</w:t>
+        <w:t>scripts/ingestGcat.py — Implemented 2026-10-09 (planned here as ingestGcatPayloads.py). Downloads four GCAT files weekly (satcat, psatcat, orgs, launchlog; ~30 MB, no auth, CC-BY-4.0), with If-Modified-Since so unchanged files are skipped, and replaces each table whole inside one transaction in its own database, ingestionGCAT.db (gcat.db until 2026-10-21: gcatObjects, gcatPayloads, gcatOrgs, gcatLaunches; the website reads copies of gcatLaunches, gcatOrgs and a trimmed gcatObjects in siteOrbital.db) -- a separate database because GCAT now serves two sections, Launches and the ON-ORBIT overview. Matching GCAT launches to LL2 launches by date + site, with method/confidence in launch_payloads, becomes a separate step once LL2 ingestion exists.</w:t>
       </w:r>
     </w:p>
     <w:p>
@@ -8938,7 +10304,7 @@
     </w:p>
     <w:p>
       <w:r>
-        <w:t>The data will be held in five tables in a new domain database, ingestionDBs/launches.db (SQLite, WAL mode) — consistent with this project’s one-process-per-domain, one-database-per-domain principle. launches links to spacecraft and launch_vehicles by a clean foreign key (both LL2-native, no matching needed); it links to gcat_payloads only indirectly, through the fuzzy-matched launch_payloads table, since GCAT is a separate, unlinked catalogue. As built, GCAT’s own tables live in gcat.db (see ingestGcat.py above); launches.db keeps the LL2 tables and the launch_payloads link.</w:t>
+        <w:t>The data will be held in five tables in a new domain database (SQLite, WAL mode; planned as ingestionDBs/launches.db, under the 2026-10 convention databases/ingestion&lt;Source&gt;.db, published into a site file) — consistent with this project’s one-process-per-domain, one-database-per-domain principle. launches links to spacecraft and launch_vehicles by a clean foreign key (both LL2-native, no matching needed); it links to gcat_payloads only indirectly, through the fuzzy-matched launch_payloads table, since GCAT is a separate, unlinked catalogue. As built, GCAT’s own tables live in ingestionGCAT.db (see ingestGcat.py above); launches.db keeps the LL2 tables and the launch_payloads link.</w:t>
       </w:r>
     </w:p>
     <w:p>
@@ -9326,6 +10692,46 @@
     </w:p>
     <w:p>
       <w:r>
+        <w:t xml:space="preserve">        TEXT rcsCategory</w:t>
+      </w:r>
+    </w:p>
+    <w:p>
+      <w:r>
+        <w:t xml:space="preserve">        TEXT downlinkBand</w:t>
+      </w:r>
+    </w:p>
+    <w:p>
+      <w:r>
+        <w:t xml:space="preserve">        REAL eirpDbw</w:t>
+      </w:r>
+    </w:p>
+    <w:p>
+      <w:r>
+        <w:t xml:space="preserve">        TEXT eirpSource</w:t>
+      </w:r>
+    </w:p>
+    <w:p>
+      <w:r>
+        <w:t xml:space="preserve">        REAL satGtDbk</w:t>
+      </w:r>
+    </w:p>
+    <w:p>
+      <w:r>
+        <w:t xml:space="preserve">        REAL dlFreqHz</w:t>
+      </w:r>
+    </w:p>
+    <w:p>
+      <w:r>
+        <w:t xml:space="preserve">        REAL ulFreqHz</w:t>
+      </w:r>
+    </w:p>
+    <w:p>
+      <w:r>
+        <w:t xml:space="preserve">        TEXT rfSource</w:t>
+      </w:r>
+    </w:p>
+    <w:p>
+      <w:r>
         <w:t xml:space="preserve">    }</w:t>
       </w:r>
     </w:p>
@@ -9501,7 +10907,7 @@
     </w:p>
     <w:p>
       <w:r>
-        <w:t xml:space="preserve">    ING2 --&gt; GDB[(gcat.db: gcatObjects, gcatPayloads, gcatOrgs, gcatLaunches)]</w:t>
+        <w:t xml:space="preserve">    ING2 --&gt; GDB[(ingestionGCAT.db: gcatObjects, gcatPayloads, gcatOrgs, gcatLaunches)]</w:t>
       </w:r>
     </w:p>
     <w:p>
@@ -9651,14 +11057,7 @@
         <w:rPr>
           <w:highlight w:val="yellow"/>
         </w:rPr>
-        <w:t>Industry infrastructure asset data is held in its own SQLite database -- as implemented, ingestionDBs/groundSegmentAssets.db, not infrastructure.db -- following the same one-database-per-domain convention as space_news.db and merged_100pc.sqlite. As implemented, the maintenance workflow differs from what was originally planned here: rschGrdSgmt/GroundSegmentAssets_master.xlsx is the authoritative, hand-edited source (new categories and corrections are made directly in that spreadsheet, not via ad hoc SQL), and rschGrdSgmt/build_ground_segment_db.py regenerates the database from it. The original nine per-category spreadsheets under infrastructureRsch/ were the research inputs used to build the master once; they're now historical/frozen, not kept in sync with it, and no longer read by the build script. The API server's role is a read-only GET /api/ground-</w:t>
-      </w:r>
-      <w:r>
-        <w:rPr>
-          <w:highlight w:val="yellow"/>
-        </w:rPr>
-        <w:lastRenderedPageBreak/>
-        <w:t>segment-assets endpoint (not /api/infrastructure as originally named here), matching the existing /api/news handler's shape.</w:t>
+        <w:t>Industry infrastructure asset data is held in its own SQLite database -- as implemented, databases/ingestionGroundSegment.db (groundSegmentAssets.db until 2026-10-21; never infrastructure.db), published unchanged into siteGroundSegment.db, which the website reads. Al’s grndSgmntAssets_master.xlsx (DEV/LCARS/rschGrdSgmt/) is the authoritative, hand-edited source (new categories and corrections are made directly in that spreadsheet, not via ad hoc SQL), and scripts/ingestionGroundSegment.py (moved into the repo from rschGrdSgmt/build_ground_segment_db.py) rebuilds the database from it on the laptop, reading the spreadsheet read-only; the rebuilt database is committed and carried to the server by the deploy (decision D). The original nine per-category spreadsheets under infrastructureRsch/ were the research inputs used to build the master once; they’re now historical/frozen and no longer read. The API server’s role is a read-only GET /api/ground-segment-assets endpoint (not /api/infrastructure as originally named here), matching the existing /api/news handler’s shape.</w:t>
       </w:r>
     </w:p>
     <w:p>

</xml_diff>

<commit_message>
Docs (DB refactor step 14): mark changes green for Al's review; freshness labels decided static
Co-Authored-By: Claude Opus 5.5 <noreply@anthropic.com>
</commit_message>
<xml_diff>
--- a/0_documentation/designAndArchitecture_0.4.docx
+++ b/0_documentation/designAndArchitecture_0.4.docx
@@ -202,6 +202,7 @@
             <w:r>
               <w:rPr>
                 <w:rFonts w:eastAsia="Courier New"/>
+                <w:color w:val="008000"/>
                 <w:highlight w:val="yellow"/>
               </w:rPr>
               <w:t>0.7</w:t>
@@ -249,6 +250,7 @@
             <w:r>
               <w:rPr>
                 <w:rFonts w:eastAsia="Courier New"/>
+                <w:color w:val="008000"/>
               </w:rPr>
               <w:t>2026-10-22</w:t>
             </w:r>
@@ -2524,6 +2526,7 @@
         <w:rPr>
           <w:b/>
           <w:bCs/>
+          <w:color w:val="008000"/>
         </w:rPr>
         <w:t>SQLite (via Python’s built-in sqlite3 module) — Zero-ops embedded database used for every database in the project (databases/); comfortably handles current and expected ingestion volumes (orbital elements, news, weather snapshots) without the operational overhead of running a separate database server.</w:t>
       </w:r>
@@ -2625,6 +2628,7 @@
         <w:rPr>
           <w:b/>
           <w:bCs/>
+          <w:color w:val="008000"/>
         </w:rPr>
         <w:t>satellite.js — The standard JavaScript port of the SGP4/SDP4 orbit propagator; runs entirely client-side against the orbital elements already pulled from the NORAD satellite catalogue (via Space-Track), and covers ground tracks, the overhead-now predictor, GEO-belt density and sensor cones without any server round-trip.</w:t>
       </w:r>
@@ -2794,6 +2798,7 @@
       </w:pPr>
       <w:r>
         <w:rPr>
+          <w:color w:val="008000"/>
           <w:highlight w:val="yellow"/>
         </w:rPr>
         <w:t>assets/onOrbitPanel.js — Scaffold; the ON-ORBIT overview section (what is on orbit by nationality, sector, orbital inclination and altitude): its own control area and main-area placeholder so far, lazy-loaded by openOnOrbitSection(). Its data comes from siteOrbital.db: GCAT joined to the NORAD catalogue by NORAD number (see On-Orbit Overview).</w:t>
@@ -2862,6 +2867,9 @@
         </w:numPr>
       </w:pPr>
       <w:r>
+        <w:rPr>
+          <w:color w:val="008000"/>
+        </w:rPr>
         <w:t>One short-lived script per data source, rather than a single shared process — The API server (server.py) serves the endpoints the client calls; each data source is ingested by its own script on its own cron schedule (Space-Track, SatNOGS, CelesTrak, GCAT and news so far, with space weather, launches and Earth observation imagery to follow). This keeps each script’s code and responsibilities simple, and a failed or slow run in one job can’t stall the API server or any other job. Since the October 2026 database refactor, an ingestion run that changed something ends by publishing the website databases built from that source (see Server-Side Databases and Scheduled Jobs). The pre-refactor orbital pipeline, scripts/runPipeline.sh (ingestOrbitalData, ingestSatcat, enrichEirp, ingestSatnogsRf in order), is legacy: no longer scheduled, and kept only until the refactor’s clean-up step.</w:t>
       </w:r>
     </w:p>
@@ -2873,6 +2881,9 @@
         </w:numPr>
       </w:pPr>
       <w:r>
+        <w:rPr>
+          <w:color w:val="008000"/>
+        </w:rPr>
         <w:t>All processes hosted on the same machine — The GoDaddy cPanel shared host; the server and the ingestion scripts communicate only indirectly, via the database files described below, not via direct inter-process calls.</w:t>
       </w:r>
     </w:p>
@@ -2905,6 +2916,9 @@
         </w:numPr>
       </w:pPr>
       <w:r>
+        <w:rPr>
+          <w:color w:val="008000"/>
+        </w:rPr>
         <w:t>The API server is supervised by Passenger; ingestion needs no supervisor — Passenger starts server.py on demand and restarts it after a crash (touching tmp/restart.txt in the app directory forces a reload after a deploy). Ingestion scripts exit after every run, so a failed run simply waits for cron’s next tick, and a shared writers’ lock (databases/.writers.lock, taken by scripts/runIngestion.py) makes every ingestion and publish wait for the one before it. Long-running background processes are deliberately avoided, since the host reaps unregistered ones.</w:t>
       </w:r>
     </w:p>
@@ -2916,6 +2930,9 @@
         </w:numPr>
       </w:pPr>
       <w:r>
+        <w:rPr>
+          <w:color w:val="008000"/>
+        </w:rPr>
         <w:t>Per-process failure isolation — Each ingestion process owns exactly one database file and has no direct dependency on the others, so one script failing has no effect on the API server or the other ingestion jobs. The website databases are rebuilt from every source’s last good data, so a failed or stale source only means that source’s part of the site is briefly stale until its next successful run; the landing page’s freshness table shows it.</w:t>
       </w:r>
     </w:p>
@@ -3013,6 +3030,9 @@
         </w:numPr>
       </w:pPr>
       <w:r>
+        <w:rPr>
+          <w:color w:val="008000"/>
+        </w:rPr>
         <w:t>Three kinds of SQLite database, each with exactly one writer (database and source refactor, agreed and carried out 2026-10-21; the full record is 0_documentation/dbRefactorPlan.md). All live in databases/, which replaced ingestionDBs/ on 2026-10-21. Every path and name is defined once, in scripts/dbPaths.py (with the map from each website database to the ingestion databases it is built from); scripts, server.py and 0_tools/bugs.py all build paths with its dbPath(). One writer per file avoids write-lock contention; whole-file atomic swaps of the website databases mean a reader never sees half a file.</w:t>
       </w:r>
     </w:p>
@@ -3024,6 +3044,9 @@
         </w:numPr>
       </w:pPr>
       <w:r>
+        <w:rPr>
+          <w:color w:val="008000"/>
+        </w:rPr>
         <w:t>ingestion&lt;Source&gt;.db — one per external source, holding what that source said, written only by that source’s ingestion script (upserts, so incremental) and read only by the publish step:</w:t>
       </w:r>
     </w:p>
@@ -3032,6 +3055,9 @@
         <w:pStyle w:val="ListParagraph"/>
       </w:pPr>
       <w:r>
+        <w:rPr>
+          <w:color w:val="008000"/>
+        </w:rPr>
         <w:t>ingestionSpaceTrack.db — table gp: the NORAD catalogue’s GP element sets and catalogue fields (all fields except the TLE lines, camelCase columns, plus fetchedAt and lastSeenFull), from scripts/ingestionSpaceTrack.py. A row is replaced only by a newer epoch, or the same epoch with changed metadata. Objects that leave the catalogue keep their row; lastSeenFull shows the publish step they were not in the latest full pass.</w:t>
       </w:r>
     </w:p>
@@ -3040,6 +3066,9 @@
         <w:pStyle w:val="ListParagraph"/>
       </w:pPr>
       <w:r>
+        <w:rPr>
+          <w:color w:val="008000"/>
+        </w:rPr>
         <w:t>ingestionCelesTrak.db — groupMembers (groupName, noradID, objectName) for all 47 CelesTrak groups, groupFetches (lastAttempt, lastSuccess, members, note) per group, and satcatRcs, the radar cross-section figures kept for good once known; from scripts/ingestionCelesTrak.py. No orbital elements.</w:t>
       </w:r>
     </w:p>
@@ -3048,6 +3077,9 @@
         <w:pStyle w:val="ListParagraph"/>
       </w:pPr>
       <w:r>
+        <w:rPr>
+          <w:color w:val="008000"/>
+        </w:rPr>
         <w:t>ingestionSatNOGS.db — transmitters (every SatNOGS transmitter record, keyed by uuid, replaced wholesale) and tle, an ID crosswalk only: one row per SatNOGS number with the catalogue number and international designator from its TLE line. No elements are decoded; from scripts/ingestionSatNOGS.py.</w:t>
       </w:r>
     </w:p>
@@ -3056,6 +3088,9 @@
         <w:pStyle w:val="ListParagraph"/>
       </w:pPr>
       <w:r>
+        <w:rPr>
+          <w:color w:val="008000"/>
+        </w:rPr>
         <w:t>ingestionGCAT.db — GCAT’s tables (gcatObjects, gcatPayloads, gcatOrgs, gcatLaunches and the build-only ones), from scripts/ingestGcat.py (was gcat.db).</w:t>
       </w:r>
     </w:p>
@@ -3064,6 +3099,9 @@
         <w:pStyle w:val="ListParagraph"/>
       </w:pPr>
       <w:r>
+        <w:rPr>
+          <w:color w:val="008000"/>
+        </w:rPr>
         <w:t>ingestionNews.db — the news articles, their topics and the per-topic counts, from scripts/readNews.py (was space_news.db; snake_case columns kept).</w:t>
       </w:r>
     </w:p>
@@ -3072,6 +3110,9 @@
         <w:pStyle w:val="ListParagraph"/>
       </w:pPr>
       <w:r>
+        <w:rPr>
+          <w:color w:val="008000"/>
+        </w:rPr>
         <w:t>ingestionGroundSegment.db and ingestionSkyCatalogue.db — the two reference databases, which have no online feed: built on the laptop by scripts/ingestionGroundSegment.py (from Al’s grndSgmntAssets_master.xlsx, read-only) and scripts/buildSkyCatalogue.py, committed to git and carried to the server by the deploy (decision D below).</w:t>
       </w:r>
     </w:p>
@@ -3083,6 +3124,9 @@
         </w:numPr>
       </w:pPr>
       <w:r>
+        <w:rPr>
+          <w:color w:val="008000"/>
+        </w:rPr>
         <w:t>site&lt;Type&gt;.db — what the website reads, one per type of data, written only by scripts/publishSite.py and rebuilt whole on every publish (see Publish Step below):</w:t>
       </w:r>
     </w:p>
@@ -3113,6 +3157,9 @@
               <w:spacing w:after="0" w:line="240" w:lineRule="auto"/>
             </w:pPr>
             <w:r>
+              <w:rPr>
+                <w:color w:val="008000"/>
+              </w:rPr>
               <w:t>File</w:t>
             </w:r>
           </w:p>
@@ -3128,6 +3175,9 @@
               <w:cnfStyle w:val="100000000000" w:firstRow="1" w:lastRow="0" w:firstColumn="0" w:lastColumn="0" w:oddVBand="0" w:evenVBand="0" w:oddHBand="0" w:evenHBand="0" w:firstRowFirstColumn="0" w:firstRowLastColumn="0" w:lastRowFirstColumn="0" w:lastRowLastColumn="0"/>
             </w:pPr>
             <w:r>
+              <w:rPr>
+                <w:color w:val="008000"/>
+              </w:rPr>
               <w:t>Contents</w:t>
             </w:r>
           </w:p>
@@ -3143,6 +3193,9 @@
               <w:cnfStyle w:val="100000000000" w:firstRow="1" w:lastRow="0" w:firstColumn="0" w:lastColumn="0" w:oddVBand="0" w:evenVBand="0" w:oddHBand="0" w:evenHBand="0" w:firstRowFirstColumn="0" w:firstRowLastColumn="0" w:lastRowFirstColumn="0" w:lastRowLastColumn="0"/>
             </w:pPr>
             <w:r>
+              <w:rPr>
+                <w:color w:val="008000"/>
+              </w:rPr>
               <w:t>Built from</w:t>
             </w:r>
           </w:p>
@@ -3163,6 +3216,7 @@
               <w:rPr>
                 <w:b w:val="0"/>
                 <w:bCs w:val="0"/>
+                <w:color w:val="008000"/>
               </w:rPr>
               <w:t>siteOrbital.db (~25 MB)</w:t>
             </w:r>
@@ -3179,6 +3233,9 @@
               <w:cnfStyle w:val="000000000000" w:firstRow="0" w:lastRow="0" w:firstColumn="0" w:lastColumn="0" w:oddVBand="0" w:evenVBand="0" w:oddHBand="0" w:evenHBand="0" w:firstRowFirstColumn="0" w:firstRowLastColumn="0" w:lastRowFirstColumn="0" w:lastRowLastColumn="0"/>
             </w:pPr>
             <w:r>
+              <w:rPr>
+                <w:color w:val="008000"/>
+              </w:rPr>
               <w:t>orbital_objects (with radio, EIRP and G/T columns filled), orbital_object_groups, the GCAT tables and columns the site reads (gcatLaunches, gcatOrgs, trimmed gcatObjects), gcatBrightness, the ON-ORBIT and LAUNCHES stats tables, and every source’s ingestionRuns</w:t>
             </w:r>
           </w:p>
@@ -3194,6 +3251,9 @@
               <w:cnfStyle w:val="000000000000" w:firstRow="0" w:lastRow="0" w:firstColumn="0" w:lastColumn="0" w:oddVBand="0" w:evenVBand="0" w:oddHBand="0" w:evenHBand="0" w:firstRowFirstColumn="0" w:firstRowLastColumn="0" w:lastRowFirstColumn="0" w:lastRowLastColumn="0"/>
             </w:pPr>
             <w:r>
+              <w:rPr>
+                <w:color w:val="008000"/>
+              </w:rPr>
               <w:t>ingestionSpaceTrack, ingestionCelesTrak, ingestionSatNOGS, ingestionGCAT</w:t>
             </w:r>
           </w:p>
@@ -3214,6 +3274,7 @@
               <w:rPr>
                 <w:b w:val="0"/>
                 <w:bCs w:val="0"/>
+                <w:color w:val="008000"/>
               </w:rPr>
               <w:t>siteNews.db (~2 MB)</w:t>
             </w:r>
@@ -3230,6 +3291,9 @@
               <w:cnfStyle w:val="000000000000" w:firstRow="0" w:lastRow="0" w:firstColumn="0" w:lastColumn="0" w:oddVBand="0" w:evenVBand="0" w:oddHBand="0" w:evenHBand="0" w:firstRowFirstColumn="0" w:firstRowLastColumn="0" w:lastRowFirstColumn="0" w:lastRowLastColumn="0"/>
             </w:pPr>
             <w:r>
+              <w:rPr>
+                <w:color w:val="008000"/>
+              </w:rPr>
               <w:t>articles, articleTopics, newsTopicCounts, and the news runs</w:t>
             </w:r>
           </w:p>
@@ -3245,6 +3309,9 @@
               <w:cnfStyle w:val="000000000000" w:firstRow="0" w:lastRow="0" w:firstColumn="0" w:lastColumn="0" w:oddVBand="0" w:evenVBand="0" w:oddHBand="0" w:evenHBand="0" w:firstRowFirstColumn="0" w:firstRowLastColumn="0" w:lastRowFirstColumn="0" w:lastRowLastColumn="0"/>
             </w:pPr>
             <w:r>
+              <w:rPr>
+                <w:color w:val="008000"/>
+              </w:rPr>
               <w:t>ingestionNews</w:t>
             </w:r>
           </w:p>
@@ -3265,6 +3332,7 @@
               <w:rPr>
                 <w:b w:val="0"/>
                 <w:bCs w:val="0"/>
+                <w:color w:val="008000"/>
               </w:rPr>
               <w:t>siteSky.db (~0.4 MB)</w:t>
             </w:r>
@@ -3281,6 +3349,9 @@
               <w:cnfStyle w:val="000000000000" w:firstRow="0" w:lastRow="0" w:firstColumn="0" w:lastColumn="0" w:oddVBand="0" w:evenVBand="0" w:oddHBand="0" w:evenHBand="0" w:firstRowFirstColumn="0" w:firstRowLastColumn="0" w:lastRowFirstColumn="0" w:lastRowLastColumn="0"/>
             </w:pPr>
             <w:r>
+              <w:rPr>
+                <w:color w:val="008000"/>
+              </w:rPr>
               <w:t>stars, star names, constellations and their lines, Milky Way, deep-sky objects</w:t>
             </w:r>
           </w:p>
@@ -3296,6 +3367,9 @@
               <w:cnfStyle w:val="000000000000" w:firstRow="0" w:lastRow="0" w:firstColumn="0" w:lastColumn="0" w:oddVBand="0" w:evenVBand="0" w:oddHBand="0" w:evenHBand="0" w:firstRowFirstColumn="0" w:firstRowLastColumn="0" w:lastRowFirstColumn="0" w:lastRowLastColumn="0"/>
             </w:pPr>
             <w:r>
+              <w:rPr>
+                <w:color w:val="008000"/>
+              </w:rPr>
               <w:t>ingestionSkyCatalogue</w:t>
             </w:r>
           </w:p>
@@ -3316,6 +3390,7 @@
               <w:rPr>
                 <w:b w:val="0"/>
                 <w:bCs w:val="0"/>
+                <w:color w:val="008000"/>
               </w:rPr>
               <w:t>siteGroundSegment.db (~0.1 MB)</w:t>
             </w:r>
@@ -3332,6 +3407,9 @@
               <w:cnfStyle w:val="000000000000" w:firstRow="0" w:lastRow="0" w:firstColumn="0" w:lastColumn="0" w:oddVBand="0" w:evenVBand="0" w:oddHBand="0" w:evenHBand="0" w:firstRowFirstColumn="0" w:firstRowLastColumn="0" w:lastRowFirstColumn="0" w:lastRowLastColumn="0"/>
             </w:pPr>
             <w:r>
+              <w:rPr>
+                <w:color w:val="008000"/>
+              </w:rPr>
               <w:t>ground_segment_assets</w:t>
             </w:r>
           </w:p>
@@ -3347,6 +3425,9 @@
               <w:cnfStyle w:val="000000000000" w:firstRow="0" w:lastRow="0" w:firstColumn="0" w:lastColumn="0" w:oddVBand="0" w:evenVBand="0" w:oddHBand="0" w:evenHBand="0" w:firstRowFirstColumn="0" w:firstRowLastColumn="0" w:lastRowFirstColumn="0" w:lastRowLastColumn="0"/>
             </w:pPr>
             <w:r>
+              <w:rPr>
+                <w:color w:val="008000"/>
+              </w:rPr>
               <w:t>ingestionGroundSegment</w:t>
             </w:r>
           </w:p>
@@ -3361,6 +3442,9 @@
         </w:numPr>
       </w:pPr>
       <w:r>
+        <w:rPr>
+          <w:color w:val="008000"/>
+        </w:rPr>
         <w:t>Decision B — one website database per type of data (decided 2026-10-21). A single shared file only pays off for data that is joined or must stay mutually consistent, which applies only within the orbital data. The raw ingestion data, the GCAT tables used only for building (gcatPayloads, gcatParents, gcatDecays, gcatDebrisYears, gcatFiles) and bug reports are in no site file.</w:t>
       </w:r>
     </w:p>
@@ -3372,6 +3456,9 @@
         </w:numPr>
       </w:pPr>
       <w:r>
+        <w:rPr>
+          <w:color w:val="008000"/>
+        </w:rPr>
         <w:t>inbox&lt;Name&gt;.db — what the website writes to: inboxBugReports.db, the BUG REPORT form’s submissions (was bugReports.db), read by python 0_tools/bugs.py import-reports.</w:t>
       </w:r>
     </w:p>
@@ -3383,6 +3470,9 @@
         </w:numPr>
       </w:pPr>
       <w:r>
+        <w:rPr>
+          <w:color w:val="008000"/>
+        </w:rPr>
         <w:t>How the website reads them — server.py’s site_db(kind) (kind is orbital, news, sky or groundSegment) hands out a read-only connection, one per thread, and reopens it whenever the site file’s inode, modification time or size changes, so each publish is picked up on the next request and a long-lived connection never keeps reading the old file after the swap. gcat_db() and stats_db() both return the orbital connection. On Windows (the DEV laptop) each thread’s connections are closed after every request (release_site_dbs()), since an open file there would stop publishSite.py replacing it; on Linux they stay open.</w:t>
       </w:r>
     </w:p>
@@ -3394,6 +3484,9 @@
         </w:numPr>
       </w:pPr>
       <w:r>
+        <w:rPr>
+          <w:color w:val="008000"/>
+        </w:rPr>
         <w:t>Legacy fallback — a kind whose site file doesn’t exist is served from the pre-refactor databases instead (LEGACY_FILES in server.py): for orbital, orbitalObjects.db opened with onOrbitStats.db and the GCAT database attached, so the same table names resolve. Likewise scripts/dbPaths.py falls back to ingestionDBs/ with the old file names (LEGACY_NAMES) wherever only that folder exists. Both kept master deployable to the live server before its migration; both, and the old orbitalObjects.db, onOrbitStats.db and gcat.db.bak still in the live databases/, are legacy and are removed at the refactor’s clean-up step.</w:t>
       </w:r>
     </w:p>
@@ -3416,6 +3509,9 @@
         </w:numPr>
       </w:pPr>
       <w:r>
+        <w:rPr>
+          <w:color w:val="008000"/>
+        </w:rPr>
         <w:t>A space-weather time-series store (SQLite) — New; to follow the same convention (an ingestion&lt;Source&gt;.db, published into a site file); written by the space-weather ingestion process, retaining Kp-index, solar wind and CME/flare event history over time rather than just the latest value, needed for the historical dashboards in the software requirements.</w:t>
       </w:r>
     </w:p>
@@ -3427,6 +3523,9 @@
         </w:numPr>
       </w:pPr>
       <w:r>
+        <w:rPr>
+          <w:color w:val="008000"/>
+        </w:rPr>
         <w:t>A launches database (SQLite) — New; to follow the same convention (an ingestion&lt;Source&gt;.db, published into a site file); written by the launches ingestion process, storing launch records pulled from Launch Library 2, supporting the heat-map, time-series, by-organisation and by-vehicle views.</w:t>
       </w:r>
     </w:p>
@@ -3450,6 +3549,9 @@
         </w:numPr>
       </w:pPr>
       <w:r>
+        <w:rPr>
+          <w:color w:val="008000"/>
+        </w:rPr>
         <w:t>WAL (Write-Ahead Logging) mode enabled once per ingestion database — Each ingestion process sets PRAGMA journal_mode = WAL; the first time it opens its own database file; because the setting is stored permanently in the file itself, and each file has exactly one writer, this needs no ongoing management. The site files need none: they are opened read-only and replaced, never written in place.</w:t>
       </w:r>
     </w:p>
@@ -3459,6 +3561,9 @@
       </w:pPr>
       <w:bookmarkStart w:id="10" w:name="_Toc239257551"/>
       <w:r>
+        <w:rPr>
+          <w:color w:val="008000"/>
+        </w:rPr>
         <w:t>Publish Step</w:t>
       </w:r>
       <w:bookmarkEnd w:id="10"/>
@@ -3471,6 +3576,9 @@
         </w:numPr>
       </w:pPr>
       <w:r>
+        <w:rPr>
+          <w:color w:val="008000"/>
+        </w:rPr>
         <w:t>Ingestion vs publish — ingestion fetches from a source and stores what it said, incrementally; publishing turns the latest ingested data into what the website shows. python scripts/publishSite.py orbital|news|sky|groundSegment|all, for each type:</w:t>
       </w:r>
     </w:p>
@@ -3479,6 +3587,9 @@
         <w:pStyle w:val="ListParagraph"/>
       </w:pPr>
       <w:r>
+        <w:rPr>
+          <w:color w:val="008000"/>
+        </w:rPr>
         <w:t>1. Read its ingestion databases, ATTACHed read-only.</w:t>
       </w:r>
     </w:p>
@@ -3487,6 +3598,9 @@
         <w:pStyle w:val="ListParagraph"/>
       </w:pPr>
       <w:r>
+        <w:rPr>
+          <w:color w:val="008000"/>
+        </w:rPr>
         <w:t>2. Build site&lt;Type&gt;.db.tmp beside the live file — always from scratch, never patched: the files are small, the stats and the source merge depend on every object anyway, the same inputs give the same output, decayed or dropped objects disappear without deletion logic, schema changes need no migrations, and the next run corrects a bad one.</w:t>
       </w:r>
     </w:p>
@@ -3495,6 +3609,9 @@
         <w:pStyle w:val="ListParagraph"/>
       </w:pPr>
       <w:r>
+        <w:rPr>
+          <w:color w:val="008000"/>
+        </w:rPr>
         <w:t>3. Check it: PRAGMA integrity_check, no empty key table, and a sanity check that refuses to publish when a key table (orbital_objects, onOrbitObjects, gcatLaunches; articles; skyStars; ground_segment_assets) would shrink by more than MAX_DROP (10%) against the file it replaces. --force overrides the sanity check.</w:t>
       </w:r>
     </w:p>
@@ -3503,6 +3620,9 @@
         <w:pStyle w:val="ListParagraph"/>
       </w:pPr>
       <w:r>
+        <w:rPr>
+          <w:color w:val="008000"/>
+        </w:rPr>
         <w:t>4. Record the publish itself as a run (publishOrbital and so on) in the file’s ingestionRuns, then copy the live file to site&lt;Type&gt;.db.prev and os.replace the .tmp into place — atomic, so the website only ever sees a whole file. server.py notices and reconnects.</w:t>
       </w:r>
     </w:p>
@@ -3514,6 +3634,9 @@
         </w:numPr>
       </w:pPr>
       <w:r>
+        <w:rPr>
+          <w:color w:val="008000"/>
+        </w:rPr>
         <w:t>If any step fails, nothing is swapped, the command prints REFUSED and exits 1, and the website keeps serving the previous version. .prev is a one-step undo: copying it back over the live file restores the previous publish.</w:t>
       </w:r>
     </w:p>
@@ -3525,6 +3648,9 @@
         </w:numPr>
       </w:pPr>
       <w:r>
+        <w:rPr>
+          <w:color w:val="008000"/>
+        </w:rPr>
         <w:t>Orbital is the only type with real work; the other three copy the tables the website reads. The orbital stages, in order:</w:t>
       </w:r>
     </w:p>
@@ -3533,6 +3659,9 @@
         <w:pStyle w:val="ListParagraph"/>
       </w:pPr>
       <w:r>
+        <w:rPr>
+          <w:color w:val="008000"/>
+        </w:rPr>
         <w:t>Objects — every object in Space-Track’s latest full pass or updated since, with an element set no older than MAX_ELEMENT_AGE_DAYS (30, matching Space-Track’s own current-catalogue query), plus objects decayed within RECENT_DECAY_DAYS (30), kept with their decay date. Elements come from Space-Track only. Epochs are normalised (ending Z) and object types mapped to the codes the site has always used (PAY, R/B, DEB, UNK). rcsSize (EST. SIZE) is CelesTrak’s radar figure from satcatRcs; rcsCategory keeps Space-Track’s SMALL / MEDIUM / LARGE. The objects are built in a separate staging file, because the stats and brightness code attach the orbital table as a database of its own; the tables are then copied into the site file with their indexes.</w:t>
       </w:r>
     </w:p>
@@ -3541,6 +3670,9 @@
         <w:pStyle w:val="ListParagraph"/>
       </w:pPr>
       <w:r>
+        <w:rPr>
+          <w:color w:val="008000"/>
+        </w:rPr>
         <w:t>Groups — scripts/groupRules.py (decision A, below). Each rule’s agreement with the latest CelesTrak list is printed on every publish, so drift shows up.</w:t>
       </w:r>
     </w:p>
@@ -3549,6 +3681,9 @@
         <w:pStyle w:val="ListParagraph"/>
       </w:pPr>
       <w:r>
+        <w:rPr>
+          <w:color w:val="008000"/>
+        </w:rPr>
         <w:t>Radio — SatNOGS transmitters linked to NORAD objects (below), then scripts/rfSelection.py (choose_rf) picks each satellite’s main downlink and uplink.</w:t>
       </w:r>
     </w:p>
@@ -3557,6 +3692,9 @@
         <w:pStyle w:val="ListParagraph"/>
       </w:pPr>
       <w:r>
+        <w:rPr>
+          <w:color w:val="008000"/>
+        </w:rPr>
         <w:t>Derived — EIRP and receive G/T (enrichEirp, with its GCAT class fallback while CelesTrak is unavailable), brightness (estimateBrightness → gcatBrightness) and the ON-ORBIT and LAUNCHES stats (orbitStats.refreshAll), run as stages.</w:t>
       </w:r>
     </w:p>
@@ -3565,6 +3703,9 @@
         <w:pStyle w:val="ListParagraph"/>
       </w:pPr>
       <w:r>
+        <w:rPr>
+          <w:color w:val="008000"/>
+        </w:rPr>
         <w:t>GCAT — only the tables and columns the website reads; then every source database’s ingestionRuns, for the freshness table.</w:t>
       </w:r>
     </w:p>
@@ -3576,6 +3717,9 @@
         </w:numPr>
       </w:pPr>
       <w:r>
+        <w:rPr>
+          <w:color w:val="008000"/>
+        </w:rPr>
         <w:t>First publish on DEV (2026-10-21): siteOrbital.db 25.3 MB in 21 s, the other three under 0.1 s each. On the live server the orbital publish takes about 40 s.</w:t>
       </w:r>
     </w:p>
@@ -3585,6 +3729,9 @@
       </w:pPr>
       <w:bookmarkStart w:id="10" w:name="_Toc239257551"/>
       <w:r>
+        <w:rPr>
+          <w:color w:val="008000"/>
+        </w:rPr>
         <w:t>Sources and Their Roles (Decisions A, C, D)</w:t>
       </w:r>
       <w:bookmarkEnd w:id="10"/>
@@ -3597,6 +3744,9 @@
         </w:numPr>
       </w:pPr>
       <w:r>
+        <w:rPr>
+          <w:color w:val="008000"/>
+        </w:rPr>
         <w:t>Source priority — the NORAD satellite catalogue via Space-Track is the only orbit source; where sources overlap, the one closest to NORAD wins.</w:t>
       </w:r>
     </w:p>
@@ -3605,6 +3755,9 @@
         <w:pStyle w:val="ListParagraph"/>
       </w:pPr>
       <w:r>
+        <w:rPr>
+          <w:color w:val="008000"/>
+        </w:rPr>
         <w:t>Space-Track (NORAD) — every orbital element set and the catalogue fields (object type, owner, launch and decay dates, period, apogee, perigee, size class). A full pass once a day (the recommended current-catalogue query, not decayed, epoch within 30 days, plus decays in the last 30 days), a recent pass (EPOCH &gt; now − 2) otherwise. One login per run through the shared client in scripts/common.py.</w:t>
       </w:r>
     </w:p>
@@ -3613,6 +3766,9 @@
         <w:pStyle w:val="ListParagraph"/>
       </w:pPr>
       <w:r>
+        <w:rPr>
+          <w:color w:val="008000"/>
+        </w:rPr>
         <w:t>CelesTrak — group lists only (all 47 groups, as CSV, NORAD ID and name), plus its satcat.csv once per full pass for radar cross-sections. Etiquette: at most one pass per CELESTRAK_GROUPS_INTERVAL_HOURS (default 72, counted from the last attempt), 3 s between groups, a pass stops at the first connection failure, and CELESTRAK_ENABLED=0 means no requests at all. CelesTrak has blocked the live server since 2026-08-27, so the live .env sets CELESTRAK_ENABLED=0; the laptop is unaffected.</w:t>
       </w:r>
     </w:p>
@@ -3621,6 +3777,9 @@
         <w:pStyle w:val="ListParagraph"/>
       </w:pPr>
       <w:r>
+        <w:rPr>
+          <w:color w:val="008000"/>
+        </w:rPr>
         <w:t>SatNOGS — radio transmitters, plus its TLE feed kept only as an ID crosswalk. SatNOGS serves TLEs only (no OMM) and doesn’t support Alpha-5, so since NORAD’s 5-digit catalogue numbers ran out in July 2026 it lists new satellites under its own placeholder numbers (98xxx/99xxx), mostly carrying Space-Track’s elements re-encoded; it supplies no orbits.</w:t>
       </w:r>
     </w:p>
@@ -3629,6 +3788,9 @@
         <w:pStyle w:val="ListParagraph"/>
       </w:pPr>
       <w:r>
+        <w:rPr>
+          <w:color w:val="008000"/>
+        </w:rPr>
         <w:t>GCAT — owner, country, class, category, programme, mass and operations-end date for each payload, and the launch log; weekly.</w:t>
       </w:r>
     </w:p>
@@ -3640,6 +3802,9 @@
         </w:numPr>
       </w:pPr>
       <w:r>
+        <w:rPr>
+          <w:color w:val="008000"/>
+        </w:rPr>
         <w:t>Decision A — our own group rules, with CelesTrak definitive when available (decided 2026-10-21, extended the same day to the link-budget constellations). scripts/groupRules.py builds active, starlink and every constellation group the EIRP stage uses. Per group and object:</w:t>
       </w:r>
     </w:p>
@@ -3648,6 +3813,9 @@
         <w:pStyle w:val="ListParagraph"/>
       </w:pPr>
       <w:r>
+        <w:rPr>
+          <w:color w:val="008000"/>
+        </w:rPr>
         <w:t>1. CelesTrak, when available — its latest successful fetch of that group is at most CELESTRAK_MAX_AGE_DAYS (14) old. Its list is definitive for every object launched before that fetch: listed means a member, absent means not.</w:t>
       </w:r>
     </w:p>
@@ -3656,6 +3824,9 @@
         <w:pStyle w:val="ListParagraph"/>
       </w:pPr>
       <w:r>
+        <w:rPr>
+          <w:color w:val="008000"/>
+        </w:rPr>
         <w:t>2. The recent-launch rule (active only) — a payload launched within the last 3 months (RECENT_LAUNCH_DAYS = 91) is active unless shown otherwise: a later CelesTrak fetch leaves it out, or it has decayed. Catalogues take weeks to record a new satellite’s status. Constellation membership doesn’t expire.</w:t>
       </w:r>
     </w:p>
@@ -3664,6 +3835,9 @@
         <w:pStyle w:val="ListParagraph"/>
       </w:pPr>
       <w:r>
+        <w:rPr>
+          <w:color w:val="008000"/>
+        </w:rPr>
         <w:t>3. Our own rules — for objects launched after CelesTrak’s fetch, and for every object when CelesTrak is unavailable. active: a payload in orbit with no GCAT operations-end date (gcatPayloads.tOp), or a recent launch. Constellation groups (starlink, oneweb, kuiper, iridium-NEXT, globalstar, gps-ops, glo-ops, galileo, beidou, planet, eutelsat, qianfan, hulianwang, argos): an active payload whose GCAT owner code or programme belongs to the constellation, or, for payloads GCAT doesn’t list yet, a name prefix. Agreement with CelesTrak’s lists on 2026-10-21 ranged from 84% (glo-ops) to 100%; active 92.3%.</w:t>
       </w:r>
     </w:p>
@@ -3672,6 +3846,9 @@
         <w:pStyle w:val="ListParagraph"/>
       </w:pPr>
       <w:r>
+        <w:rPr>
+          <w:color w:val="008000"/>
+        </w:rPr>
         <w:t>CelesTrak-only groups — the ten whose rules agreed poorly (stations 50%, orbcomm 48%, sbas 34%, gnss 55%, sarsat 56%, ses 83%, intelsat 64%, telesat 61%, sar 67%, spire 65%) have no rule, and every other CelesTrak group likewise. They are absent while CelesTrak is unavailable: on the live server today the ADD OBJ group filter offers 15 groups instead of 47. Groups with no rule come back with CelesTrak’s next successful pass.</w:t>
       </w:r>
     </w:p>
@@ -3683,6 +3860,9 @@
         </w:numPr>
       </w:pPr>
       <w:r>
+        <w:rPr>
+          <w:color w:val="008000"/>
+        </w:rPr>
         <w:t>Transmitter-to-NORAD linking (SatNOGS crosswalk) — each SatNOGS transmitter is linked to an object in the catalogue by, in order: its norad_follow_id; the international designator in the TLE SatNOGS publishes under the transmitter’s own number, matched to Space-Track’s objectID (the only link for satellites launched since July 2026, e.g. SatNOGS 98193, JACK-007 → 2026-229K); its own norad_cat_id. Transmitters matching none are dropped. This fixed bug 9: the pre-refactor pipeline stored SatNOGS’s TLE rows as objects under its placeholder numbers and attached frequencies by norad_cat_id, so 384 satellites’ frequencies on the live server sat on 9xxxx duplicates instead of the real objects.</w:t>
       </w:r>
     </w:p>
@@ -3694,6 +3874,9 @@
         </w:numPr>
       </w:pPr>
       <w:r>
+        <w:rPr>
+          <w:color w:val="008000"/>
+        </w:rPr>
         <w:t>Radar cross-section kept for good (EST. SIZE) — satellites don’t change size, so CelesTrak’s RCS figure is kept once known: satcatRcs rows are only ever added or updated, never removed, and a blank never replaces a held figure. Each full CelesTrak pass ends with one satcat.csv request; ingestionCelesTrak.py --seed-rcs &lt;orbitalObjects.db&gt; was a one-off import of the figures the old database held (12,690, run on the live server by the migration). While CelesTrak blocks the live server, those seeded figures are its only source.</w:t>
       </w:r>
     </w:p>
@@ -3705,6 +3888,9 @@
         </w:numPr>
       </w:pPr>
       <w:r>
+        <w:rPr>
+          <w:color w:val="008000"/>
+        </w:rPr>
         <w:t>EIRP class tier: GCAT fallback — enrichEirp.py’s class tier normally reads CelesTrak’s function groups (weather, cubesat, geo …), which have no rules of our own. When no CelesTrak list is available, publishSite.py passes each payload’s class from GCAT (enrichEirp.gcat_class), used only where the groups place the payload in no class; constellation matches still win. Rules, first match wins: category SS → station; mass ≤ 30 kg → amateur (payload class A) or cubesat; MET → weather-geo or weather-leo by orbit; IMG-R → eo-radar; IMG or EOSCI → eo-optical; COM in GEO → military-comms (class D) or comms-geo; COM elsewhere → comms-leo-narrow; SCI, AST or TECH → science; anything else stays unknown. The publish log names the tier used. DEV, payloads in orbit: with CelesTrak 12,928 filing / 1,874 estimated / 4,102 unknown; without (as the live server) 12,762 / 4,881 / 1,261.</w:t>
       </w:r>
     </w:p>
@@ -3716,6 +3902,9 @@
         </w:numPr>
       </w:pPr>
       <w:r>
+        <w:rPr>
+          <w:color w:val="008000"/>
+        </w:rPr>
         <w:t>Decision C — publish after ingestion, from the last good data (decided 2026-10-21). C1: each ingestion run that succeeded and changed something ends by publishing every site file built from that source (Space-Track, SatNOGS, CelesTrak or GCAT → siteOrbital.db; news → siteNews.db); a run that changed nothing publishes nothing. C2: a failed or stale source never blocks a publish; the others publish from its last good data, the freshness table shows it as failed or stale, and data that looks wrong is still refused by the sanity checks. So CelesTrak being blocked never holds up orbital updates.</w:t>
       </w:r>
     </w:p>
@@ -3727,6 +3916,9 @@
         </w:numPr>
       </w:pPr>
       <w:r>
+        <w:rPr>
+          <w:color w:val="008000"/>
+        </w:rPr>
         <w:t>Decision D — the reference databases are built on the laptop and carried by the deploy (decided 2026-10-21). ingestionGroundSegment.db and ingestionSkyCatalogue.db have no online feed; they are committed to git (every other file in databases/ is git-ignored). deployToGoDaddy.sh excludes databases/ from its sync, uploads these two to .referenceUpload/, and scripts/installReferenceDbs.py on the server swaps in any that changed (after checking it opens as a database, under the writers’ lock) and publishes its site file. The server never needs the spreadsheet, the star catalogues or openpyxl.</w:t>
       </w:r>
     </w:p>
@@ -3748,6 +3940,9 @@
         </w:numPr>
       </w:pPr>
       <w:r>
+        <w:rPr>
+          <w:color w:val="008000"/>
+        </w:rPr>
         <w:t>News ingestion process — Implemented in scripts/readNews.py, run every 30 minutes; writes new articles to ingestionNews.db, dropping filler and duplicate titles, then prunes, re-tags and VACUUMs it on every run (see News below). siteNews.db is republished when new articles arrived; a run that only prunes records no changes, so the pruning reaches the site at the next run with new articles.</w:t>
       </w:r>
     </w:p>
@@ -3759,6 +3954,9 @@
         </w:numPr>
       </w:pPr>
       <w:r>
+        <w:rPr>
+          <w:color w:val="008000"/>
+        </w:rPr>
         <w:t>Orbital ingestion processes — Implemented: scripts/ingestionSpaceTrack.py every 12 hours (the script itself makes one pass a day the full catalogue), scripts/ingestionSatNOGS.py every 12 hours, 30 minutes later, and scripts/ingestionCelesTrak.py every 3 days. Each that changed something republishes siteOrbital.db.</w:t>
       </w:r>
     </w:p>
@@ -3771,6 +3969,7 @@
       </w:pPr>
       <w:r>
         <w:rPr>
+          <w:color w:val="008000"/>
           <w:highlight w:val="yellow"/>
         </w:rPr>
         <w:t>SATCAT enrichment process (scripts/ingestSatcat.py) — Legacy, no longer scheduled: Space-Track’s gp records carry the catalogue fields inline, and CelesTrak’s radar figures are kept in ingestionCelesTrak.db. Removed with the other pre-refactor scripts at the refactor’s clean-up step.</w:t>
@@ -3785,6 +3984,7 @@
       </w:pPr>
       <w:r>
         <w:rPr>
+          <w:color w:val="008000"/>
           <w:highlight w:val="yellow"/>
         </w:rPr>
         <w:t>GCAT ingestion process (scripts/ingestGcat.py) — Implemented; weekly (Sunday 03:00 server time), downloading four GCAT files with If-Modified-Since so unchanged files are skipped, and replacing each table whole inside one transaction in ingestionGCAT.db; republishes siteOrbital.db when anything changed. See the Launches section.</w:t>
@@ -3839,6 +4039,9 @@
         </w:rPr>
       </w:pPr>
       <w:r>
+        <w:rPr>
+          <w:color w:val="008000"/>
+        </w:rPr>
         <w:t>Scheduling mechanism — cron, installed and kept current by setupCron.sh, which is idempotent: re-running it replaces only its own marked entries (# LCARS-FAS-CRON) and leaves any other cron jobs alone. It refuses unless databases/ exists, so it cannot start the new pipeline on a server not yet migrated. Every job is one source run through scripts/runIngestion.py &lt;source&gt;, which (1) takes the shared writers’ lock, databases/.writers.lock, waiting up to 15 minutes (fcntl, so Linux only; skipped on Windows); (2) runs that source’s ingestion script as its own process; (3) reads the run it recorded; and (4) publishes the dependent site files only if that run succeeded with changes. A failed or skipped run publishes nothing; a refused publish makes the run exit 1. Each source runs on its own schedule, so one failing never holds up the others. Server time (UTC−7):</w:t>
       </w:r>
     </w:p>
@@ -3884,6 +4087,9 @@
               <w:cnfStyle w:val="100000000000" w:firstRow="1" w:lastRow="0" w:firstColumn="0" w:lastColumn="0" w:oddVBand="0" w:evenVBand="0" w:oddHBand="0" w:evenHBand="0" w:firstRowFirstColumn="0" w:firstRowLastColumn="0" w:lastRowFirstColumn="0" w:lastRowLastColumn="0"/>
             </w:pPr>
             <w:r>
+              <w:rPr>
+                <w:color w:val="008000"/>
+              </w:rPr>
               <w:t>Schedule</w:t>
             </w:r>
           </w:p>
@@ -3899,6 +4105,9 @@
               <w:cnfStyle w:val="100000000000" w:firstRow="1" w:lastRow="0" w:firstColumn="0" w:lastColumn="0" w:oddVBand="0" w:evenVBand="0" w:oddHBand="0" w:evenHBand="0" w:firstRowFirstColumn="0" w:firstRowLastColumn="0" w:lastRowFirstColumn="0" w:lastRowLastColumn="0"/>
             </w:pPr>
             <w:r>
+              <w:rPr>
+                <w:color w:val="008000"/>
+              </w:rPr>
               <w:t>Log</w:t>
             </w:r>
           </w:p>
@@ -3919,6 +4128,7 @@
               <w:rPr>
                 <w:b w:val="0"/>
                 <w:bCs w:val="0"/>
+                <w:color w:val="008000"/>
               </w:rPr>
               <w:t>news</w:t>
             </w:r>
@@ -3935,6 +4145,9 @@
               <w:cnfStyle w:val="000000000000" w:firstRow="0" w:lastRow="0" w:firstColumn="0" w:lastColumn="0" w:oddVBand="0" w:evenVBand="0" w:oddHBand="0" w:evenHBand="0" w:firstRowFirstColumn="0" w:firstRowLastColumn="0" w:lastRowFirstColumn="0" w:lastRowLastColumn="0"/>
             </w:pPr>
             <w:r>
+              <w:rPr>
+                <w:color w:val="008000"/>
+              </w:rPr>
               <w:t>*/30 * * * * — every 30 min</w:t>
             </w:r>
           </w:p>
@@ -3950,6 +4163,9 @@
               <w:cnfStyle w:val="000000000000" w:firstRow="0" w:lastRow="0" w:firstColumn="0" w:lastColumn="0" w:oddVBand="0" w:evenVBand="0" w:oddHBand="0" w:evenHBand="0" w:firstRowFirstColumn="0" w:firstRowLastColumn="0" w:lastRowFirstColumn="0" w:lastRowLastColumn="0"/>
             </w:pPr>
             <w:r>
+              <w:rPr>
+                <w:color w:val="008000"/>
+              </w:rPr>
               <w:t>~/logs/news_cron.log</w:t>
             </w:r>
           </w:p>
@@ -3970,6 +4186,7 @@
               <w:rPr>
                 <w:b w:val="0"/>
                 <w:bCs w:val="0"/>
+                <w:color w:val="008000"/>
               </w:rPr>
               <w:t>spaceTrack</w:t>
             </w:r>
@@ -3986,6 +4203,9 @@
               <w:cnfStyle w:val="000000000000" w:firstRow="0" w:lastRow="0" w:firstColumn="0" w:lastColumn="0" w:oddVBand="0" w:evenVBand="0" w:oddHBand="0" w:evenHBand="0" w:firstRowFirstColumn="0" w:firstRowLastColumn="0" w:lastRowFirstColumn="0" w:lastRowLastColumn="0"/>
             </w:pPr>
             <w:r>
+              <w:rPr>
+                <w:color w:val="008000"/>
+              </w:rPr>
               <w:t>0 */12 * * * — every 12 h; the daily full pass is chosen by the script</w:t>
             </w:r>
           </w:p>
@@ -4001,6 +4221,9 @@
               <w:cnfStyle w:val="000000000000" w:firstRow="0" w:lastRow="0" w:firstColumn="0" w:lastColumn="0" w:oddVBand="0" w:evenVBand="0" w:oddHBand="0" w:evenHBand="0" w:firstRowFirstColumn="0" w:firstRowLastColumn="0" w:lastRowFirstColumn="0" w:lastRowLastColumn="0"/>
             </w:pPr>
             <w:r>
+              <w:rPr>
+                <w:color w:val="008000"/>
+              </w:rPr>
               <w:t>~/logs/spaceTrack_cron.log</w:t>
             </w:r>
           </w:p>
@@ -4021,6 +4244,7 @@
               <w:rPr>
                 <w:b w:val="0"/>
                 <w:bCs w:val="0"/>
+                <w:color w:val="008000"/>
               </w:rPr>
               <w:t>satnogs</w:t>
             </w:r>
@@ -4037,6 +4261,9 @@
               <w:cnfStyle w:val="000000000000" w:firstRow="0" w:lastRow="0" w:firstColumn="0" w:lastColumn="0" w:oddVBand="0" w:evenVBand="0" w:oddHBand="0" w:evenHBand="0" w:firstRowFirstColumn="0" w:firstRowLastColumn="0" w:lastRowFirstColumn="0" w:lastRowLastColumn="0"/>
             </w:pPr>
             <w:r>
+              <w:rPr>
+                <w:color w:val="008000"/>
+              </w:rPr>
               <w:t>30 */12 * * * — every 12 h, at :30</w:t>
             </w:r>
           </w:p>
@@ -4052,6 +4279,9 @@
               <w:cnfStyle w:val="000000000000" w:firstRow="0" w:lastRow="0" w:firstColumn="0" w:lastColumn="0" w:oddVBand="0" w:evenVBand="0" w:oddHBand="0" w:evenHBand="0" w:firstRowFirstColumn="0" w:firstRowLastColumn="0" w:lastRowFirstColumn="0" w:lastRowLastColumn="0"/>
             </w:pPr>
             <w:r>
+              <w:rPr>
+                <w:color w:val="008000"/>
+              </w:rPr>
               <w:t>~/logs/satnogs_cron.log</w:t>
             </w:r>
           </w:p>
@@ -4072,6 +4302,7 @@
               <w:rPr>
                 <w:b w:val="0"/>
                 <w:bCs w:val="0"/>
+                <w:color w:val="008000"/>
               </w:rPr>
               <w:t>celesTrak</w:t>
             </w:r>
@@ -4088,6 +4319,9 @@
               <w:cnfStyle w:val="000000000000" w:firstRow="0" w:lastRow="0" w:firstColumn="0" w:lastColumn="0" w:oddVBand="0" w:evenVBand="0" w:oddHBand="0" w:evenHBand="0" w:firstRowFirstColumn="0" w:firstRowLastColumn="0" w:lastRowFirstColumn="0" w:lastRowLastColumn="0"/>
             </w:pPr>
             <w:r>
+              <w:rPr>
+                <w:color w:val="008000"/>
+              </w:rPr>
               <w:t>15 4 */3 * * — 04:15 on days 1, 4, 7 … of the month, plus the script’s own 72 h check; a no-op while CELESTRAK_ENABLED=0</w:t>
             </w:r>
           </w:p>
@@ -4103,6 +4337,9 @@
               <w:cnfStyle w:val="000000000000" w:firstRow="0" w:lastRow="0" w:firstColumn="0" w:lastColumn="0" w:oddVBand="0" w:evenVBand="0" w:oddHBand="0" w:evenHBand="0" w:firstRowFirstColumn="0" w:firstRowLastColumn="0" w:lastRowFirstColumn="0" w:lastRowLastColumn="0"/>
             </w:pPr>
             <w:r>
+              <w:rPr>
+                <w:color w:val="008000"/>
+              </w:rPr>
               <w:t>~/logs/celesTrak_cron.log</w:t>
             </w:r>
           </w:p>
@@ -4123,6 +4360,7 @@
               <w:rPr>
                 <w:b w:val="0"/>
                 <w:bCs w:val="0"/>
+                <w:color w:val="008000"/>
               </w:rPr>
               <w:t>gcat</w:t>
             </w:r>
@@ -4139,6 +4377,9 @@
               <w:cnfStyle w:val="000000000000" w:firstRow="0" w:lastRow="0" w:firstColumn="0" w:lastColumn="0" w:oddVBand="0" w:evenVBand="0" w:oddHBand="0" w:evenHBand="0" w:firstRowFirstColumn="0" w:firstRowLastColumn="0" w:lastRowFirstColumn="0" w:lastRowLastColumn="0"/>
             </w:pPr>
             <w:r>
+              <w:rPr>
+                <w:color w:val="008000"/>
+              </w:rPr>
               <w:t>0 3 * * 0 — Sunday 03:00</w:t>
             </w:r>
           </w:p>
@@ -4154,6 +4395,9 @@
               <w:cnfStyle w:val="000000000000" w:firstRow="0" w:lastRow="0" w:firstColumn="0" w:lastColumn="0" w:oddVBand="0" w:evenVBand="0" w:oddHBand="0" w:evenHBand="0" w:firstRowFirstColumn="0" w:firstRowLastColumn="0" w:lastRowFirstColumn="0" w:lastRowLastColumn="0"/>
             </w:pPr>
             <w:r>
+              <w:rPr>
+                <w:color w:val="008000"/>
+              </w:rPr>
               <w:t>~/logs/gcat_cron.log</w:t>
             </w:r>
           </w:p>
@@ -4168,6 +4412,9 @@
         </w:numPr>
       </w:pPr>
       <w:r>
+        <w:rPr>
+          <w:color w:val="008000"/>
+        </w:rPr>
         <w:t>The ground segment and the sky have no job (decision D). The pre-refactor crontab (readNews.py every 30 minutes, runPipeline.sh every 12 hours under flock -n, ingestGcat.py weekly) was replaced by scripts/migrateLive.py on 2026-10-21 at 23:04 UTC.</w:t>
       </w:r>
     </w:p>
@@ -4187,6 +4434,9 @@
         </w:rPr>
       </w:pPr>
       <w:r>
+        <w:rPr>
+          <w:color w:val="008000"/>
+        </w:rPr>
         <w:t>Run logging and the freshness table — every ingestion records each run (job, start, finish, success, records changed, note) in an ingestionRuns table in its own database (scripts/ingestionLog.py), and each publish records itself the same way. The publish step copies its sources’ runs into each site file, and server.py’s /api/status turns them into the landing page’s data-freshness table (Data | Source | Last refresh | # Changes | Time to next sync), estimating each next sync as the last run’s start plus the row’s interval — right whatever timezone the host’s cron uses; a missed run shows OVERDUE and a failed last run shows as failed. Each row (STATUS_SOURCES in server.py) lists the job names it accepts, newest first; the pre-refactor names are kept until the clean-up step. The source labels are static text in STATUS_SOURCES:</w:t>
       </w:r>
     </w:p>
@@ -4217,6 +4467,9 @@
               <w:spacing w:after="0" w:line="240" w:lineRule="auto"/>
             </w:pPr>
             <w:r>
+              <w:rPr>
+                <w:color w:val="008000"/>
+              </w:rPr>
               <w:t>Data</w:t>
             </w:r>
           </w:p>
@@ -4232,6 +4485,9 @@
               <w:cnfStyle w:val="100000000000" w:firstRow="1" w:lastRow="0" w:firstColumn="0" w:lastColumn="0" w:oddVBand="0" w:evenVBand="0" w:oddHBand="0" w:evenHBand="0" w:firstRowFirstColumn="0" w:firstRowLastColumn="0" w:lastRowFirstColumn="0" w:lastRowLastColumn="0"/>
             </w:pPr>
             <w:r>
+              <w:rPr>
+                <w:color w:val="008000"/>
+              </w:rPr>
               <w:t>Source (label)</w:t>
             </w:r>
           </w:p>
@@ -4247,6 +4503,9 @@
               <w:cnfStyle w:val="100000000000" w:firstRow="1" w:lastRow="0" w:firstColumn="0" w:lastColumn="0" w:oddVBand="0" w:evenVBand="0" w:oddHBand="0" w:evenHBand="0" w:firstRowFirstColumn="0" w:firstRowLastColumn="0" w:lastRowFirstColumn="0" w:lastRowLastColumn="0"/>
             </w:pPr>
             <w:r>
+              <w:rPr>
+                <w:color w:val="008000"/>
+              </w:rPr>
               <w:t>Jobs (interval)</w:t>
             </w:r>
           </w:p>
@@ -4283,6 +4542,9 @@
               <w:cnfStyle w:val="000000000000" w:firstRow="0" w:lastRow="0" w:firstColumn="0" w:lastColumn="0" w:oddVBand="0" w:evenVBand="0" w:oddHBand="0" w:evenHBand="0" w:firstRowFirstColumn="0" w:firstRowLastColumn="0" w:lastRowFirstColumn="0" w:lastRowLastColumn="0"/>
             </w:pPr>
             <w:r>
+              <w:rPr>
+                <w:color w:val="008000"/>
+              </w:rPr>
               <w:t>18 RSS feeds</w:t>
             </w:r>
           </w:p>
@@ -4298,6 +4560,9 @@
               <w:cnfStyle w:val="000000000000" w:firstRow="0" w:lastRow="0" w:firstColumn="0" w:lastColumn="0" w:oddVBand="0" w:evenVBand="0" w:oddHBand="0" w:evenHBand="0" w:firstRowFirstColumn="0" w:firstRowLastColumn="0" w:lastRowFirstColumn="0" w:lastRowLastColumn="0"/>
             </w:pPr>
             <w:r>
+              <w:rPr>
+                <w:color w:val="008000"/>
+              </w:rPr>
               <w:t>news (30 min)</w:t>
             </w:r>
           </w:p>
@@ -4318,6 +4583,7 @@
               <w:rPr>
                 <w:b w:val="0"/>
                 <w:bCs w:val="0"/>
+                <w:color w:val="008000"/>
               </w:rPr>
               <w:t>Orbital elements</w:t>
             </w:r>
@@ -4334,6 +4600,9 @@
               <w:cnfStyle w:val="000000000000" w:firstRow="0" w:lastRow="0" w:firstColumn="0" w:lastColumn="0" w:oddVBand="0" w:evenVBand="0" w:oddHBand="0" w:evenHBand="0" w:firstRowFirstColumn="0" w:firstRowLastColumn="0" w:lastRowFirstColumn="0" w:lastRowLastColumn="0"/>
             </w:pPr>
             <w:r>
+              <w:rPr>
+                <w:color w:val="008000"/>
+              </w:rPr>
               <w:t>NORAD via Space-Track</w:t>
             </w:r>
           </w:p>
@@ -4349,6 +4618,9 @@
               <w:cnfStyle w:val="000000000000" w:firstRow="0" w:lastRow="0" w:firstColumn="0" w:lastColumn="0" w:oddVBand="0" w:evenVBand="0" w:oddHBand="0" w:evenHBand="0" w:firstRowFirstColumn="0" w:firstRowLastColumn="0" w:lastRowFirstColumn="0" w:lastRowLastColumn="0"/>
             </w:pPr>
             <w:r>
+              <w:rPr>
+                <w:color w:val="008000"/>
+              </w:rPr>
               <w:t>spaceTrackRecent, spaceTrackFull; legacy orbitalElements (12 h)</w:t>
             </w:r>
           </w:p>
@@ -4369,6 +4641,7 @@
               <w:rPr>
                 <w:b w:val="0"/>
                 <w:bCs w:val="0"/>
+                <w:color w:val="008000"/>
               </w:rPr>
               <w:t>Satellite catalogue</w:t>
             </w:r>
@@ -4385,6 +4658,9 @@
               <w:cnfStyle w:val="000000000000" w:firstRow="0" w:lastRow="0" w:firstColumn="0" w:lastColumn="0" w:oddVBand="0" w:evenVBand="0" w:oddHBand="0" w:evenHBand="0" w:firstRowFirstColumn="0" w:firstRowLastColumn="0" w:lastRowFirstColumn="0" w:lastRowLastColumn="0"/>
             </w:pPr>
             <w:r>
+              <w:rPr>
+                <w:color w:val="008000"/>
+              </w:rPr>
               <w:t>NORAD SATCAT via Space-Track</w:t>
             </w:r>
           </w:p>
@@ -4400,6 +4676,9 @@
               <w:cnfStyle w:val="000000000000" w:firstRow="0" w:lastRow="0" w:firstColumn="0" w:lastColumn="0" w:oddVBand="0" w:evenVBand="0" w:oddHBand="0" w:evenHBand="0" w:firstRowFirstColumn="0" w:firstRowLastColumn="0" w:lastRowFirstColumn="0" w:lastRowLastColumn="0"/>
             </w:pPr>
             <w:r>
+              <w:rPr>
+                <w:color w:val="008000"/>
+              </w:rPr>
               <w:t>spaceTrackFull; legacy satcat (24 h)</w:t>
             </w:r>
           </w:p>
@@ -4420,6 +4699,7 @@
               <w:rPr>
                 <w:b w:val="0"/>
                 <w:bCs w:val="0"/>
+                <w:color w:val="008000"/>
               </w:rPr>
               <w:t>Satellite groups</w:t>
             </w:r>
@@ -4436,6 +4716,9 @@
               <w:cnfStyle w:val="000000000000" w:firstRow="0" w:lastRow="0" w:firstColumn="0" w:lastColumn="0" w:oddVBand="0" w:evenVBand="0" w:oddHBand="0" w:evenHBand="0" w:firstRowFirstColumn="0" w:firstRowLastColumn="0" w:lastRowFirstColumn="0" w:lastRowLastColumn="0"/>
             </w:pPr>
             <w:r>
+              <w:rPr>
+                <w:color w:val="008000"/>
+              </w:rPr>
               <w:t>CelesTrak · our own rules</w:t>
             </w:r>
           </w:p>
@@ -4451,6 +4734,9 @@
               <w:cnfStyle w:val="000000000000" w:firstRow="0" w:lastRow="0" w:firstColumn="0" w:lastColumn="0" w:oddVBand="0" w:evenVBand="0" w:oddHBand="0" w:evenHBand="0" w:firstRowFirstColumn="0" w:firstRowLastColumn="0" w:lastRowFirstColumn="0" w:lastRowLastColumn="0"/>
             </w:pPr>
             <w:r>
+              <w:rPr>
+                <w:color w:val="008000"/>
+              </w:rPr>
               <w:t>celesTrakGroups (7 days); blank until CelesTrak’s first successful pass</w:t>
             </w:r>
           </w:p>
@@ -4471,6 +4757,7 @@
               <w:rPr>
                 <w:b w:val="0"/>
                 <w:bCs w:val="0"/>
+                <w:color w:val="008000"/>
               </w:rPr>
               <w:t>Downlink EIRP</w:t>
             </w:r>
@@ -4487,6 +4774,9 @@
               <w:cnfStyle w:val="000000000000" w:firstRow="0" w:lastRow="0" w:firstColumn="0" w:lastColumn="0" w:oddVBand="0" w:evenVBand="0" w:oddHBand="0" w:evenHBand="0" w:firstRowFirstColumn="0" w:firstRowLastColumn="0" w:lastRowFirstColumn="0" w:lastRowLastColumn="0"/>
             </w:pPr>
             <w:r>
+              <w:rPr>
+                <w:color w:val="008000"/>
+              </w:rPr>
               <w:t>Filings · band plans</w:t>
             </w:r>
           </w:p>
@@ -4502,6 +4792,9 @@
               <w:cnfStyle w:val="000000000000" w:firstRow="0" w:lastRow="0" w:firstColumn="0" w:lastColumn="0" w:oddVBand="0" w:evenVBand="0" w:oddHBand="0" w:evenHBand="0" w:firstRowFirstColumn="0" w:firstRowLastColumn="0" w:lastRowFirstColumn="0" w:lastRowLastColumn="0"/>
             </w:pPr>
             <w:r>
+              <w:rPr>
+                <w:color w:val="008000"/>
+              </w:rPr>
               <w:t>publishOrbital — the time the figures were computed; legacy eirp (12 h)</w:t>
             </w:r>
           </w:p>
@@ -4522,6 +4815,7 @@
               <w:rPr>
                 <w:b w:val="0"/>
                 <w:bCs w:val="0"/>
+                <w:color w:val="008000"/>
               </w:rPr>
               <w:t>Radio frequencies</w:t>
             </w:r>
@@ -4553,6 +4847,9 @@
               <w:cnfStyle w:val="000000000000" w:firstRow="0" w:lastRow="0" w:firstColumn="0" w:lastColumn="0" w:oddVBand="0" w:evenVBand="0" w:oddHBand="0" w:evenHBand="0" w:firstRowFirstColumn="0" w:firstRowLastColumn="0" w:lastRowFirstColumn="0" w:lastRowLastColumn="0"/>
             </w:pPr>
             <w:r>
+              <w:rPr>
+                <w:color w:val="008000"/>
+              </w:rPr>
               <w:t>satnogs; legacy satnogsRf (12 h)</w:t>
             </w:r>
           </w:p>
@@ -4573,6 +4870,7 @@
               <w:rPr>
                 <w:b w:val="0"/>
                 <w:bCs w:val="0"/>
+                <w:color w:val="008000"/>
               </w:rPr>
               <w:t>Launch &amp; ownership</w:t>
             </w:r>
@@ -4604,6 +4902,9 @@
               <w:cnfStyle w:val="000000000000" w:firstRow="0" w:lastRow="0" w:firstColumn="0" w:lastColumn="0" w:oddVBand="0" w:evenVBand="0" w:oddHBand="0" w:evenHBand="0" w:firstRowFirstColumn="0" w:firstRowLastColumn="0" w:lastRowFirstColumn="0" w:lastRowLastColumn="0"/>
             </w:pPr>
             <w:r>
+              <w:rPr>
+                <w:color w:val="008000"/>
+              </w:rPr>
               <w:t>gcat (7 days)</w:t>
             </w:r>
           </w:p>
@@ -4727,6 +5028,9 @@
         <w:pStyle w:val="ListParagraph"/>
       </w:pPr>
       <w:r>
+        <w:rPr>
+          <w:color w:val="008000"/>
+        </w:rPr>
         <w:t>Main / payload area (&lt;main&gt;) — the actual visualisation viewport; its content swaps based on the selected section. GRD-TRACK, GRND SGMNT, GS OPS and EO now hold real Leaflet maps (base map, antimeridian-safe world boundary, day/night terminator and lat/lon graticule on both, plus ground segment's colour-coded asset markers and GRD-TRACK's ground-track/sensor-footprint rendering); NEWS holds a working article list and detail view against siteNews.db, filterable by topic from the control area; the remaining sections still hold placeholder/welcome content.</w:t>
       </w:r>
     </w:p>
@@ -4846,6 +5150,9 @@
         <w:pStyle w:val="ListParagraph"/>
       </w:pPr>
       <w:r>
+        <w:rPr>
+          <w:color w:val="008000"/>
+        </w:rPr>
         <w:t>Space-Track — the only credential the system holds. The username and password are kept in spacetrack.env on the server (owner-read-only, permissions 600, re-applied by every setupCron.sh run), never in git (.gitignore) and never in a deploy (excluded by deployToGoDaddy.sh); the web server refuses the file. Since 2026-10-17 the ingestion scripts load it themselves (scripts/common.py), so the crontab and command lines hold no credentials.</w:t>
       </w:r>
     </w:p>
@@ -4854,6 +5161,9 @@
         <w:pStyle w:val="ListParagraph"/>
       </w:pPr>
       <w:r>
+        <w:rPr>
+          <w:color w:val="008000"/>
+        </w:rPr>
         <w:t>Local development — the same values live in a git-ignored spacetrack.env on the development machine; other settings (such as CELESTRAK_ENABLED) in a git-ignored .env.</w:t>
       </w:r>
     </w:p>
@@ -4900,6 +5210,9 @@
         <w:pStyle w:val="ListParagraph"/>
       </w:pPr>
       <w:r>
+        <w:rPr>
+          <w:color w:val="008000"/>
+        </w:rPr>
         <w:t>Open since the database refactor (found 2026-10-22) — the rules name the old ingestionDBs/ folder and refuse database files by extension, but not the new databases/ folder: on the live server databases/siteOrbital.db is refused (403) while databases/siteOrbital.db.prev, siteNews.db.prev and .writers.lock are served (200). The rules need databases/ added (and .prev / .tmp copies refused) on the server, and a copy kept in the repository.</w:t>
       </w:r>
     </w:p>
@@ -4940,6 +5253,9 @@
         <w:pStyle w:val="ListParagraph"/>
       </w:pPr>
       <w:r>
+        <w:rPr>
+          <w:color w:val="008000"/>
+        </w:rPr>
         <w:t>Since 10 October 2026 no database is committed except the reference databases, which have no online feed and are built outside the server: today ingestionGroundSegment.db and ingestionSkyCatalogue.db (decision D). Every other database is rebuilt by its own ingestion job.</w:t>
       </w:r>
     </w:p>
@@ -5100,6 +5416,9 @@
           </w:tcPr>
           <w:p>
             <w:r>
+              <w:rPr>
+                <w:color w:val="008000"/>
+              </w:rPr>
               <w:t>Every orbital element set and the catalogue fields — the only orbit source since 2026-10-21</w:t>
             </w:r>
           </w:p>
@@ -5120,6 +5439,9 @@
           </w:tcPr>
           <w:p>
             <w:r>
+              <w:rPr>
+                <w:color w:val="008000"/>
+              </w:rPr>
               <w:t>One account, stored as above. Fetched every 12 h, one pass a day the full catalogue. The site shows derived figures and individual objects, never the raw files; the downloadable databases (bug 7) and the copies in old git commits were a breach risk — the web copies are now blocked.</w:t>
             </w:r>
           </w:p>
@@ -5142,6 +5464,9 @@
           </w:tcPr>
           <w:p>
             <w:r>
+              <w:rPr>
+                <w:color w:val="008000"/>
+              </w:rPr>
               <w:t>Group lists (active, Starlink, constellations, stations …) and radar cross-sections; no orbital elements since 2026-10-21</w:t>
             </w:r>
           </w:p>
@@ -5162,6 +5487,9 @@
           </w:tcPr>
           <w:p>
             <w:r>
+              <w:rPr>
+                <w:color w:val="008000"/>
+              </w:rPr>
               <w:t>At most one pass every 72 h (cron every 3 days), 3 s between groups, stopping at the first connection failure, identifying User-Agent. Credited in Acknowledgments. CelesTrak has blocked the GoDaddy server since 2026-08-27, so the server’s .env sets CELESTRAK_ENABLED=0 and it makes no requests at all.</w:t>
             </w:r>
           </w:p>
@@ -5184,6 +5512,9 @@
           </w:tcPr>
           <w:p>
             <w:r>
+              <w:rPr>
+                <w:color w:val="008000"/>
+              </w:rPr>
               <w:t>Radio transmitter data; its TLE feed only as an ID crosswalk (designators), no orbits</w:t>
             </w:r>
           </w:p>
@@ -6311,6 +6642,9 @@
     <w:p>
       <w:pPr/>
       <w:r>
+        <w:rPr>
+          <w:color w:val="008000"/>
+        </w:rPr>
         <w:t>Three tables in databases/ingestionNews.db (ingestionDBs/space_news.db until 2026-10-21), copied whole into siteNews.db by the publish step; the website reads siteNews.db:</w:t>
       </w:r>
     </w:p>
@@ -6908,6 +7242,9 @@
     <w:p>
       <w:pPr/>
       <w:r>
+        <w:rPr>
+          <w:color w:val="008000"/>
+        </w:rPr>
         <w:t xml:space="preserve">    ING --&gt;|filler + duplicate titles dropped in memory| DB[(ingestionNews.db: articles)]</w:t>
       </w:r>
     </w:p>
@@ -6965,6 +7302,9 @@
     <w:p>
       <w:pPr/>
       <w:r>
+        <w:rPr>
+          <w:color w:val="008000"/>
+        </w:rPr>
         <w:t>Status. Implemented and tested against the local database (2026-10-09); not yet deployed. On deployment, pruneNews.py (dry run first) and tagNews.py are run once over SSH against the live database, since the deploy deliberately excludes the databases folder (now databases/); cron then keeps it maintained.</w:t>
       </w:r>
     </w:p>
@@ -7219,16 +7559,25 @@
     </w:p>
     <w:p>
       <w:r>
+        <w:rPr>
+          <w:color w:val="008000"/>
+        </w:rPr>
         <w:t>Since the database refactor of 2026-10-21 the NORAD satellite catalogue via Space-Track is the only source of orbits; the other sources supply what NORAD doesn’t. Space-Track’s gp class (OMM) gives every element set together with the catalogue fields (object type, owner, launch and decay dates, period, apogee, perigee, size class). Its documentation gives explicit blanket approval for redistributing basic SSA data, conditioned on citation. Before the refactor CelesTrak’s GP API was the primary source for engineering reasons (no login, built for bulk group downloads), with Space-Track as fallback; CelesTrak has blocked the live server since 2026-08-27, so the live data had been coming from Space-Track anyway.</w:t>
       </w:r>
     </w:p>
     <w:p>
       <w:r>
+        <w:rPr>
+          <w:color w:val="008000"/>
+        </w:rPr>
         <w:t>CelesTrak now supplies only its group lists (active, Starlink, the constellations, stations …), which define the ADD OBJ group filter and the link budget’s constellation and class tiers, and its radar cross-section figures (EST. SIZE), kept for good once known. Where its lists are unavailable our own rules stand in (decision A, under ARCHITECTURE).</w:t>
       </w:r>
     </w:p>
     <w:p>
       <w:r>
+        <w:rPr>
+          <w:color w:val="008000"/>
+        </w:rPr>
         <w:t>SatNOGS DB supplies radio transmitter records, and its TLE feed is kept only as an ID crosswalk: it serves no OMM and doesn’t support Alpha-5, so since NORAD’s 5-digit numbers ran out in July 2026 it lists new satellites under its own placeholder numbers, mostly with Space-Track’s elements re-encoded (1,572 of its 1,736 TLEs on 2026-10-21). GCAT supplies ownership, classification and the operations-end dates our group rules use. The full record of the refactor is 0_documentation/dbRefactorPlan.md.</w:t>
       </w:r>
     </w:p>
@@ -7333,6 +7682,9 @@
               <w:cnfStyle w:val="000000000000" w:firstRow="0" w:lastRow="0" w:firstColumn="0" w:lastColumn="0" w:oddVBand="0" w:evenVBand="0" w:oddHBand="0" w:evenHBand="0" w:firstRowFirstColumn="0" w:firstRowLastColumn="0" w:lastRowFirstColumn="0" w:lastRowLastColumn="0"/>
             </w:pPr>
             <w:r>
+              <w:rPr>
+                <w:color w:val="008000"/>
+              </w:rPr>
               <w:t>Group lists and radar cross-sections only (no elements since 2026-10-21)</w:t>
             </w:r>
           </w:p>
@@ -7402,6 +7754,9 @@
               </w:rPr>
             </w:pPr>
             <w:r>
+              <w:rPr>
+                <w:color w:val="008000"/>
+              </w:rPr>
               <w:t>Primary — the only orbit source; catalogue fields</w:t>
             </w:r>
           </w:p>
@@ -7486,6 +7841,9 @@
               <w:cnfStyle w:val="000000000000" w:firstRow="0" w:lastRow="0" w:firstColumn="0" w:lastColumn="0" w:oddVBand="0" w:evenVBand="0" w:oddHBand="0" w:evenHBand="0" w:firstRowFirstColumn="0" w:firstRowLastColumn="0" w:lastRowFirstColumn="0" w:lastRowLastColumn="0"/>
             </w:pPr>
             <w:r>
+              <w:rPr>
+                <w:color w:val="008000"/>
+              </w:rPr>
               <w:t>Radio transmitters; TLE feed as an ID crosswalk only</w:t>
             </w:r>
           </w:p>
@@ -7500,6 +7858,9 @@
               <w:cnfStyle w:val="000000000000" w:firstRow="0" w:lastRow="0" w:firstColumn="0" w:lastColumn="0" w:oddVBand="0" w:evenVBand="0" w:oddHBand="0" w:evenHBand="0" w:firstRowFirstColumn="0" w:firstRowLastColumn="0" w:lastRowFirstColumn="0" w:lastRowLastColumn="0"/>
             </w:pPr>
             <w:r>
+              <w:rPr>
+                <w:color w:val="008000"/>
+              </w:rPr>
               <w:t>Open data, CC BY-SA 4.0 (attribution, share-alike for derived data).</w:t>
             </w:r>
           </w:p>
@@ -7552,6 +7913,9 @@
               <w:cnfStyle w:val="000000000000" w:firstRow="0" w:lastRow="0" w:firstColumn="0" w:lastColumn="0" w:oddVBand="0" w:evenVBand="0" w:oddHBand="0" w:evenHBand="0" w:firstRowFirstColumn="0" w:firstRowLastColumn="0" w:lastRowFirstColumn="0" w:lastRowLastColumn="0"/>
             </w:pPr>
             <w:r>
+              <w:rPr>
+                <w:color w:val="008000"/>
+              </w:rPr>
               <w:t>Ownership, classification, operations-end dates; launch log</w:t>
             </w:r>
           </w:p>
@@ -7602,6 +7966,9 @@
     </w:p>
     <w:p>
       <w:r>
+        <w:rPr>
+          <w:color w:val="008000"/>
+        </w:rPr>
         <w:t>CelesTrak and Space-Track publish materially the same current on-orbit population (~33,000 objects); taking the orbits from Space-Track alone loses nothing. SatNOGS’s extra rows were duplicates under its placeholder numbers, not extra coverage.</w:t>
       </w:r>
     </w:p>
@@ -7630,6 +7997,9 @@
     </w:p>
     <w:p>
       <w:r>
+        <w:rPr>
+          <w:color w:val="008000"/>
+        </w:rPr>
         <w:t>Each source runs as its own process on its own schedule (see Scheduled Jobs), so a failure in one never takes out another, and each run publishes siteOrbital.db only if it changed something.</w:t>
       </w:r>
     </w:p>
@@ -7716,6 +8086,7 @@
               <w:rPr>
                 <w:b w:val="0"/>
                 <w:bCs w:val="0"/>
+                <w:color w:val="008000"/>
               </w:rPr>
               <w:t>Space-Track (ingestionSpaceTrack.py)</w:t>
             </w:r>
@@ -7732,6 +8103,9 @@
               <w:cnfStyle w:val="000000000000" w:firstRow="0" w:lastRow="0" w:firstColumn="0" w:lastColumn="0" w:oddVBand="0" w:evenVBand="0" w:oddHBand="0" w:evenHBand="0" w:firstRowFirstColumn="0" w:firstRowLastColumn="0" w:lastRowFirstColumn="0" w:lastRowLastColumn="0"/>
             </w:pPr>
             <w:r>
+              <w:rPr>
+                <w:color w:val="008000"/>
+              </w:rPr>
               <w:t>Every 12 h; one pass a day is the full catalogue, the others EPOCH &gt; now − 2</w:t>
             </w:r>
           </w:p>
@@ -7747,6 +8121,9 @@
               <w:cnfStyle w:val="000000000000" w:firstRow="0" w:lastRow="0" w:firstColumn="0" w:lastColumn="0" w:oddVBand="0" w:evenVBand="0" w:oddHBand="0" w:evenHBand="0" w:firstRowFirstColumn="0" w:firstRowLastColumn="0" w:lastRowFirstColumn="0" w:lastRowLastColumn="0"/>
             </w:pPr>
             <w:r>
+              <w:rPr>
+                <w:color w:val="008000"/>
+              </w:rPr>
               <w:t>Most objects don’t get a fresh element set from source more than once every 1–2 days; the daily full pass catches objects leaving the catalogue and recent decays</w:t>
             </w:r>
           </w:p>
@@ -7771,6 +8148,7 @@
               <w:rPr>
                 <w:b w:val="0"/>
                 <w:bCs w:val="0"/>
+                <w:color w:val="008000"/>
               </w:rPr>
               <w:t>SatNOGS (ingestionSatNOGS.py)</w:t>
             </w:r>
@@ -7787,6 +8165,9 @@
               <w:cnfStyle w:val="000000000000" w:firstRow="0" w:lastRow="0" w:firstColumn="0" w:lastColumn="0" w:oddVBand="0" w:evenVBand="0" w:oddHBand="0" w:evenHBand="0" w:firstRowFirstColumn="0" w:firstRowLastColumn="0" w:lastRowFirstColumn="0" w:lastRowLastColumn="0"/>
             </w:pPr>
             <w:r>
+              <w:rPr>
+                <w:color w:val="008000"/>
+              </w:rPr>
               <w:t>Every 12 h, 30 min after Space-Track</w:t>
             </w:r>
           </w:p>
@@ -7802,6 +8183,9 @@
               <w:cnfStyle w:val="000000000000" w:firstRow="0" w:lastRow="0" w:firstColumn="0" w:lastColumn="0" w:oddVBand="0" w:evenVBand="0" w:oddHBand="0" w:evenHBand="0" w:firstRowFirstColumn="0" w:firstRowLastColumn="0" w:lastRowFirstColumn="0" w:lastRowLastColumn="0"/>
             </w:pPr>
             <w:r>
+              <w:rPr>
+                <w:color w:val="008000"/>
+              </w:rPr>
               <w:t>Transmitter records and the crosswalk change slowly</w:t>
             </w:r>
           </w:p>
@@ -7826,6 +8210,7 @@
               <w:rPr>
                 <w:b w:val="0"/>
                 <w:bCs w:val="0"/>
+                <w:color w:val="008000"/>
               </w:rPr>
               <w:t>CelesTrak (ingestionCelesTrak.py)</w:t>
             </w:r>
@@ -7842,6 +8227,9 @@
               <w:cnfStyle w:val="000000000000" w:firstRow="0" w:lastRow="0" w:firstColumn="0" w:lastColumn="0" w:oddVBand="0" w:evenVBand="0" w:oddHBand="0" w:evenHBand="0" w:firstRowFirstColumn="0" w:firstRowLastColumn="0" w:lastRowFirstColumn="0" w:lastRowLastColumn="0"/>
             </w:pPr>
             <w:r>
+              <w:rPr>
+                <w:color w:val="008000"/>
+              </w:rPr>
               <w:t>Every 3 days (72 h minimum between passes); off on the live server</w:t>
             </w:r>
           </w:p>
@@ -7857,6 +8245,9 @@
               <w:cnfStyle w:val="000000000000" w:firstRow="0" w:lastRow="0" w:firstColumn="0" w:lastColumn="0" w:oddVBand="0" w:evenVBand="0" w:oddHBand="0" w:evenHBand="0" w:firstRowFirstColumn="0" w:firstRowLastColumn="0" w:lastRowFirstColumn="0" w:lastRowLastColumn="0"/>
             </w:pPr>
             <w:r>
+              <w:rPr>
+                <w:color w:val="008000"/>
+              </w:rPr>
               <w:t>Group membership changes slowly; keeps well inside CelesTrak’s etiquette after the 2026-08 block</w:t>
             </w:r>
           </w:p>
@@ -7881,6 +8272,7 @@
               <w:rPr>
                 <w:b w:val="0"/>
                 <w:bCs w:val="0"/>
+                <w:color w:val="008000"/>
               </w:rPr>
               <w:t>GCAT (ingestGcat.py)</w:t>
             </w:r>
@@ -7897,6 +8289,9 @@
               <w:cnfStyle w:val="000000000000" w:firstRow="0" w:lastRow="0" w:firstColumn="0" w:lastColumn="0" w:oddVBand="0" w:evenVBand="0" w:oddHBand="0" w:evenHBand="0" w:firstRowFirstColumn="0" w:firstRowLastColumn="0" w:lastRowFirstColumn="0" w:lastRowLastColumn="0"/>
             </w:pPr>
             <w:r>
+              <w:rPr>
+                <w:color w:val="008000"/>
+              </w:rPr>
               <w:t>Weekly, Sunday 03:00</w:t>
             </w:r>
           </w:p>
@@ -7912,6 +8307,9 @@
               <w:cnfStyle w:val="000000000000" w:firstRow="0" w:lastRow="0" w:firstColumn="0" w:lastColumn="0" w:oddVBand="0" w:evenVBand="0" w:oddHBand="0" w:evenHBand="0" w:firstRowFirstColumn="0" w:firstRowLastColumn="0" w:lastRowFirstColumn="0" w:lastRowLastColumn="0"/>
             </w:pPr>
             <w:r>
+              <w:rPr>
+                <w:color w:val="008000"/>
+              </w:rPr>
               <w:t>GCAT updates nightly, but ~30 MB is not worth fetching more often</w:t>
             </w:r>
           </w:p>
@@ -7925,6 +8323,9 @@
     </w:p>
     <w:p>
       <w:r>
+        <w:rPr>
+          <w:color w:val="008000"/>
+        </w:rPr>
         <w:t>Every source is fetched politely: one Space-Track login per run with timeouts and logout, an identifying User-Agent everywhere, 3 s between CelesTrak groups, and failures recorded as failed runs rather than retried in a loop.</w:t>
       </w:r>
     </w:p>
@@ -7938,6 +8339,9 @@
     </w:p>
     <w:p>
       <w:r>
+        <w:rPr>
+          <w:color w:val="008000"/>
+        </w:rPr>
         <w:t>The raw data is held per source (ingestionSpaceTrack.db, ingestionCelesTrak.db, ingestionSatNOGS.db, ingestionGCAT.db; SQLite, WAL mode), upserted rather than appended and keyed on the NORAD catalogue number (SatNOGS: transmitter uuid and its own number). What the website reads is orbital_objects in siteOrbital.db, rebuilt from them on every publish. Until 2026-10-21 it was a single table in ingestionDBs/orbitalObjects.db, upserted by ingestOrbitalData.py; that file is legacy and stays on the live server until the clean-up step.</w:t>
       </w:r>
     </w:p>
@@ -8010,6 +8414,9 @@
         </w:numPr>
       </w:pPr>
       <w:r>
+        <w:rPr>
+          <w:color w:val="008000"/>
+        </w:rPr>
         <w:t>Since the refactor this works in two layers: ingestionSpaceTrack.db keeps every object it has seen, with lastSeenFull showing whether the latest full pass still had it, while the publish step carries into siteOrbital.db only objects still in the catalogue with elements at most 30 days old, plus objects decayed within the last 30 days, kept with their decay date. A disappearance from the site can therefore always be checked against the ingestion database.</w:t>
       </w:r>
     </w:p>
@@ -8024,6 +8431,7 @@
     <w:p>
       <w:r>
         <w:rPr>
+          <w:color w:val="008000"/>
           <w:highlight w:val="yellow"/>
         </w:rPr>
         <w:t>The implemented API is three endpoints, not the single group-filtered one originally planned here -- the client's needs turned out to split cleanly into three different access patterns. GET /api/orbital-objects?ids=&lt;comma-separated noradIDs&gt; serves the GRD-TRACK panel's persisted plotted-objects list (batched into one request, not one per object). GET /api/orbital-objects/filter-options returns the distinct owner and group values currently in the database, read live rather than hardcoded, for the ADD OBJ search form's dropdowns. GET /api/orbital-objects/search?name=&amp;noradId=&amp;owner=&amp;objectType=&amp;group=&amp;altitudeRegime=&amp;inclinationBand= is the ADD OBJ search itself -- every filter is optional and AND-combined, group filtering joins through orbital_object_groups (see below), and results are capped at 500 (with a 4000-row pre-filter scan cap so a lightly-filtered search can't force a full-table scan on every request). The original reasoning for not implementing a full unfiltered dump still holds -- the full catalog's raw TLE text alone is about equal to the project's 5MB initial-load budget -- it's just enforced per-endpoint now rather than via a single ?group= parameter.</w:t>
@@ -8045,6 +8453,7 @@
     <w:p>
       <w:r>
         <w:rPr>
+          <w:color w:val="008000"/>
           <w:highlight w:val="yellow"/>
         </w:rPr>
         <w:t>The implemented panel goes beyond ground-track rendering alone, none of which was documented here at the time of writing: an ADD OBJ search form (name/NORAD ID/owner/object type/group/altitude regime/inclination band, against the /api/orbital-objects/search endpoint above) lets a user find and plot objects; a persisted plotted-objects list (localStorage) survives reloads; SHW FOOT renders each plotted object's sensor footprint, recomputed on a live interval rather than drawn once; and a separate observer-location feature (IP geolocation, deliberately not the browser Geolocation API, plus a manual LAT/LON/PLACE override) drives a "you are here" marker independent of the TLE data entirely.</w:t>
@@ -8078,36 +8487,57 @@
     </w:p>
     <w:p>
       <w:r>
+        <w:rPr>
+          <w:color w:val="008000"/>
+        </w:rPr>
         <w:t xml:space="preserve">    ST[Space-Track (NORAD)] --&gt;|elements + catalogue| IST[ingestionSpaceTrack.py] --&gt; DST[(ingestionSpaceTrack.db)]</w:t>
       </w:r>
     </w:p>
     <w:p>
       <w:r>
+        <w:rPr>
+          <w:color w:val="008000"/>
+        </w:rPr>
         <w:t xml:space="preserve">    CT[CelesTrak] --&gt;|group lists + RCS, every 3 days| ICT[ingestionCelesTrak.py] --&gt; DCT[(ingestionCelesTrak.db)]</w:t>
       </w:r>
     </w:p>
     <w:p>
       <w:r>
+        <w:rPr>
+          <w:color w:val="008000"/>
+        </w:rPr>
         <w:t xml:space="preserve">    SN[SatNOGS DB] --&gt;|transmitters + TLE crosswalk| ISN[ingestionSatNOGS.py] --&gt; DSN[(ingestionSatNOGS.db)]</w:t>
       </w:r>
     </w:p>
     <w:p>
       <w:r>
+        <w:rPr>
+          <w:color w:val="008000"/>
+        </w:rPr>
         <w:t xml:space="preserve">    GC[GCAT] --&gt;|weekly| IGC[ingestGcat.py] --&gt; DGC[(ingestionGCAT.db)]</w:t>
       </w:r>
     </w:p>
     <w:p>
       <w:r>
+        <w:rPr>
+          <w:color w:val="008000"/>
+        </w:rPr>
         <w:t xml:space="preserve">    DST &amp; DCT &amp; DSN &amp; DGC --&gt;|read-only, after a run with changes| PUB[publishSite.py orbital]</w:t>
       </w:r>
     </w:p>
     <w:p>
       <w:r>
+        <w:rPr>
+          <w:color w:val="008000"/>
+        </w:rPr>
         <w:t xml:space="preserve">    PUB --&gt;|checks, .prev, os.replace| SITE[(siteOrbital.db)]</w:t>
       </w:r>
     </w:p>
     <w:p>
       <w:r>
+        <w:rPr>
+          <w:color w:val="008000"/>
+        </w:rPr>
         <w:t xml:space="preserve">    SITE --&gt;|site_db orbital| API["/api/orbital-objects?ids=... | /search?..."]</w:t>
       </w:r>
     </w:p>
@@ -8153,16 +8583,25 @@
     </w:p>
     <w:p>
       <w:r>
+        <w:rPr>
+          <w:color w:val="008000"/>
+        </w:rPr>
         <w:t xml:space="preserve">        TEXT objectID</w:t>
       </w:r>
     </w:p>
     <w:p>
       <w:r>
+        <w:rPr>
+          <w:color w:val="008000"/>
+        </w:rPr>
         <w:t xml:space="preserve">        REAL meanMotion</w:t>
       </w:r>
     </w:p>
     <w:p>
       <w:r>
+        <w:rPr>
+          <w:color w:val="008000"/>
+        </w:rPr>
         <w:t xml:space="preserve">        REAL eccentricity</w:t>
       </w:r>
     </w:p>
@@ -8173,21 +8612,33 @@
     </w:p>
     <w:p>
       <w:r>
+        <w:rPr>
+          <w:color w:val="008000"/>
+        </w:rPr>
         <w:t xml:space="preserve">        REAL raOfAscNode</w:t>
       </w:r>
     </w:p>
     <w:p>
       <w:r>
+        <w:rPr>
+          <w:color w:val="008000"/>
+        </w:rPr>
         <w:t xml:space="preserve">        REAL argOfPericenter</w:t>
       </w:r>
     </w:p>
     <w:p>
       <w:r>
+        <w:rPr>
+          <w:color w:val="008000"/>
+        </w:rPr>
         <w:t xml:space="preserve">        REAL meanAnomaly</w:t>
       </w:r>
     </w:p>
     <w:p>
       <w:r>
+        <w:rPr>
+          <w:color w:val="008000"/>
+        </w:rPr>
         <w:t xml:space="preserve">        REAL bstar</w:t>
       </w:r>
     </w:p>
@@ -8263,6 +8714,9 @@
     </w:p>
     <w:p>
       <w:r>
+        <w:rPr>
+          <w:color w:val="008000"/>
+        </w:rPr>
         <w:t>Field notes (siteOrbital.db, since 2026-10-21; abridged — the full list is ORBITAL_TABLE_SQL in scripts/publishSite.py): every column comes from Space-Track except rcsSize (CelesTrak’s kept figure), the radio columns (SatNOGS, via the publish step) and the EIRP and G/T columns (enrichEirp, a publish stage). Where:-</w:t>
       </w:r>
     </w:p>
@@ -8279,6 +8733,9 @@
         <w:pStyle w:val="ListParagraph"/>
       </w:pPr>
       <w:r>
+        <w:rPr>
+          <w:color w:val="008000"/>
+        </w:rPr>
         <w:t>objectID and the element columns (meanMotion, eccentricity, inclination, raOfAscNode, argOfPericenter, meanAnomaly, bstar, meanMotionDot, meanMotionDdot) — Space-Track’s OMM fields as published; the client builds its SGP4 record from them. No TLE lines are stored. objectID (the international designator) also links SatNOGS transmitters to their object.</w:t>
       </w:r>
     </w:p>
@@ -8288,6 +8745,7 @@
       </w:pPr>
       <w:r>
         <w:rPr>
+          <w:color w:val="008000"/>
           <w:highlight w:val="yellow"/>
         </w:rPr>
         <w:t>objectType, owner, launchDate, decayDate, period, apogee, perigee, rcsCategory — from the same Space-Track record (the catalogue fields come inline with the elements), refreshed on every run.</w:t>
@@ -8306,6 +8764,9 @@
         <w:pStyle w:val="ListParagraph"/>
       </w:pPr>
       <w:r>
+        <w:rPr>
+          <w:color w:val="008000"/>
+        </w:rPr>
         <w:t>source — always space-track since the refactor (it named celestrak / space-track / satnogs before).</w:t>
       </w:r>
     </w:p>
@@ -8314,6 +8775,9 @@
         <w:pStyle w:val="ListParagraph"/>
       </w:pPr>
       <w:r>
+        <w:rPr>
+          <w:color w:val="008000"/>
+        </w:rPr>
         <w:t>fetchedAt — when the row’s Space-Track record was last fetched.</w:t>
       </w:r>
     </w:p>
@@ -8339,6 +8803,9 @@
     </w:p>
     <w:p>
       <w:r>
+        <w:rPr>
+          <w:color w:val="008000"/>
+        </w:rPr>
         <w:t>We store which groups each satellite belongs to — CelesTrak’s lists while they are available, otherwise our own rules (decision A, under ARCHITECTURE). A satellite can belong to more than one group at once. Starlink satellites sit in both "starlink" and "active." A single column cannot hold that cleanly, so we use a second table, orbital_object_groups, with one row per satellite per group.</w:t>
       </w:r>
     </w:p>
@@ -8349,6 +8816,9 @@
     </w:p>
     <w:p>
       <w:r>
+        <w:rPr>
+          <w:color w:val="008000"/>
+        </w:rPr>
         <w:t>Not every satellite has a group. CelesTrak does not sort every object into a named list: it has no general group for rocket bodies or debris, only three for specific fragmentation events, and our own rules cover only active and 13 constellations. While CelesTrak is unavailable the groups without a rule are absent altogether. A satellite with no rows in the groups table is not an error.</w:t>
       </w:r>
     </w:p>
@@ -8530,6 +9000,7 @@
             <w:r>
               <w:rPr>
                 <w:rFonts w:ascii="Segoe UI" w:hAnsi="Segoe UI" w:cs="Segoe UI"/>
+                <w:color w:val="008000"/>
                 <w:sz w:val="21"/>
                 <w:szCs w:val="21"/>
               </w:rPr>
@@ -8611,6 +9082,7 @@
             <w:r>
               <w:rPr>
                 <w:rFonts w:ascii="Segoe UI" w:hAnsi="Segoe UI" w:cs="Segoe UI"/>
+                <w:color w:val="008000"/>
                 <w:sz w:val="21"/>
                 <w:szCs w:val="21"/>
               </w:rPr>
@@ -8692,6 +9164,7 @@
             <w:r>
               <w:rPr>
                 <w:rFonts w:ascii="Segoe UI" w:hAnsi="Segoe UI" w:cs="Segoe UI"/>
+                <w:color w:val="008000"/>
                 <w:sz w:val="21"/>
                 <w:szCs w:val="21"/>
               </w:rPr>
@@ -8773,6 +9246,7 @@
             <w:r>
               <w:rPr>
                 <w:rFonts w:ascii="Segoe UI" w:hAnsi="Segoe UI" w:cs="Segoe UI"/>
+                <w:color w:val="008000"/>
                 <w:sz w:val="21"/>
                 <w:szCs w:val="21"/>
               </w:rPr>
@@ -8829,6 +9303,7 @@
             <w:r>
               <w:rPr>
                 <w:rFonts w:ascii="Segoe UI" w:hAnsi="Segoe UI" w:cs="Segoe UI"/>
+                <w:color w:val="008000"/>
                 <w:sz w:val="21"/>
                 <w:szCs w:val="21"/>
               </w:rPr>
@@ -8854,6 +9329,7 @@
             <w:r>
               <w:rPr>
                 <w:rFonts w:ascii="Segoe UI" w:hAnsi="Segoe UI" w:cs="Segoe UI"/>
+                <w:color w:val="008000"/>
                 <w:sz w:val="21"/>
                 <w:szCs w:val="21"/>
               </w:rPr>
@@ -8924,6 +9400,9 @@
     <w:p>
       <w:pPr/>
       <w:r>
+        <w:rPr>
+          <w:color w:val="008000"/>
+        </w:rPr>
         <w:t>Two sources, each used for what it is right for. GCAT (ingestionGCAT.db, written weekly by scripts/ingestGcat.py -- see the Launches section) decides which payloads are in orbit and who owns them: state, owner organisations and class (each payload’s own: A academic, B commercial, C civil government, D defence). The NORAD satellite catalogue via Space-Track (orbital_objects in siteOrbital.db) gives where each one is now -- its current perigee and apogee -- matched to GCAT by NORAD number. Active status and the stations and Starlink groups come from orbital_object_groups (decision A).</w:t>
       </w:r>
     </w:p>
@@ -8958,6 +9437,9 @@
         <w:pStyle w:val="ListParagraph"/>
       </w:pPr>
       <w:r>
+        <w:rPr>
+          <w:color w:val="008000"/>
+        </w:rPr>
         <w:t>As a stage of every orbital publish -- that is, after any Space-Track, SatNOGS, CelesTrak or GCAT run that changed something (orbitStats.refreshAll, run by scripts/publishSite.py). Ownership changes slowly; current orbit is the part that must be up to date, so recalculating after each 12-hourly Space-Track run keeps the regime figures current.</w:t>
       </w:r>
     </w:p>
@@ -8966,6 +9448,9 @@
         <w:pStyle w:val="ListParagraph"/>
       </w:pPr>
       <w:r>
+        <w:rPr>
+          <w:color w:val="008000"/>
+        </w:rPr>
         <w:t>On demand -- python scripts/publishSite.py orbital recalculates everything from the ingestion databases without re-downloading, so a change to a chart’s rules (top-N cut-off, labels, regime boundaries) takes effect at once. The same pattern as scripts/tagNews.py for news topics.</w:t>
       </w:r>
     </w:p>
@@ -8986,6 +9471,9 @@
     <w:p>
       <w:pPr/>
       <w:r>
+        <w:rPr>
+          <w:color w:val="008000"/>
+        </w:rPr>
         <w:t>Derived figures are tables in siteOrbital.db, written by the orbitStats stage of the publish step -- rebuilt on every publish and never committed to git. Until 2026-10-21 they lived in their own database, ingestionDBs/onOrbitStats.db (legacy, removed at the clean-up step).</w:t>
       </w:r>
     </w:p>
@@ -9016,6 +9504,9 @@
     <w:p>
       <w:pPr/>
       <w:r>
+        <w:rPr>
+          <w:color w:val="008000"/>
+        </w:rPr>
         <w:t>GET /api/on-orbit/nationality returns {rows: [{label, stateCode, payloads}], totalPayloads}; GET /api/on-orbit/regimes returns {rows: [{regime, all, exclSpacex}]}. Both read siteOrbital.db (stats_db()), opened only once it exists, and return empty rows rather than an error before then.</w:t>
       </w:r>
     </w:p>
@@ -9050,6 +9541,9 @@
     <w:p>
       <w:pPr/>
       <w:r>
+        <w:rPr>
+          <w:color w:val="008000"/>
+        </w:rPr>
         <w:t>Implemented (2026-10-09): the ON-ORBIT section, the payloads-by-nationality chart, the current-orbit regime table, and scripts/orbitStats.py with onOrbitStats.db (since 2026-10-21 a stage of the publish step, its tables in siteOrbital.db). To do: the sector, inclination and altitude charts; actions for the control-area buttons. GCAT’s payload date columns TLast, TOp and TDate are stored but their meanings still need confirming before any “operational vs inactive” split relies on them.</w:t>
       </w:r>
     </w:p>
@@ -9179,6 +9673,9 @@
           </w:tcPr>
           <w:p>
             <w:r>
+              <w:rPr>
+                <w:color w:val="008000"/>
+              </w:rPr>
               <w:t>Orbital catalogues - the NORAD catalogue via Space-Track (OMM elements + SATCAT, the only orbit source); CelesTrak for group lists and radar cross-sections</w:t>
             </w:r>
           </w:p>
@@ -9303,6 +9800,7 @@
       <w:r>
         <w:rPr>
           <w:b/>
+          <w:color w:val="008000"/>
         </w:rPr>
         <w:t>Downlink EIRP. Two tiers, produced by the ingestion-pipeline enrichment step. Tier 1 (filing): a curated table keyed by constellation / operator, values from FCC Schedule S, ITU filings, GNSS ICDs and published footprint contours (Starlink Ku 38 dBW, OneWeb Ku 36, Kuiper Ka 38, GNSS L 27, Iridium-NEXT L 17, Globalstar S 20, ORBCOMM VHF 12, Planet X 13, GEO comms Ku ~52), matched by group (CelesTrak’s lists when available, otherwise our rules -- decision A) with a name-prefix fallback. Tier 2 (estimated): no constellation match, so the band is inferred from the object's mission class -- from CelesTrak’s function groups and the orbit, or, only while CelesTrak is unavailable, from GCAT (enrichEirp.gcat_class; see ARCHITECTURE) -- and the EIRP read from a (band, mission-class) table. Rocket bodies and debris are tagged 'none'. About three-quarters of active payloads get a value; every figure is a boresight / filed-maximum number.</w:t>
       </w:r>
@@ -9311,6 +9809,7 @@
       <w:r>
         <w:rPr>
           <w:b/>
+          <w:color w:val="008000"/>
         </w:rPr>
         <w:t>Downlink and uplink centre frequency. The budget needs a real frequency, not a band letter - both free-space loss and rain attenuation scale with it, and X-band alone spans 8-12 GHz ~3.5 dB. Downlink: exact downlink_low / downlink_high from the SatNOGS DB where the satellite is listed (transmitters linked to the NORAD object by follow ID, then designator, then own number, and the main downlink and uplink picked by rfSelection.choose_rf, at the publish step); otherwise the mid-point of the enriched downlink band; otherwise unknown. Uplink is harder, because it is a different frequency from the downlink and usually a different band: uplink_low / uplink_high from SatNOGS (present only for transceiver / transponder records); otherwise a curated per-constellation uplink band or the standard paired Earth-to-space allocation, taken at mid-point; otherwise unknown. A satellite the station only needs to receive needs no uplink figure.</w:t>
       </w:r>
@@ -10277,6 +10776,9 @@
         <w:pStyle w:val="ListParagraph"/>
       </w:pPr>
       <w:r>
+        <w:rPr>
+          <w:color w:val="008000"/>
+        </w:rPr>
         <w:t>scripts/ingestGcat.py — Implemented 2026-10-09 (planned here as ingestGcatPayloads.py). Downloads four GCAT files weekly (satcat, psatcat, orgs, launchlog; ~30 MB, no auth, CC-BY-4.0), with If-Modified-Since so unchanged files are skipped, and replaces each table whole inside one transaction in its own database, ingestionGCAT.db (gcat.db until 2026-10-21: gcatObjects, gcatPayloads, gcatOrgs, gcatLaunches; the website reads copies of gcatLaunches, gcatOrgs and a trimmed gcatObjects in siteOrbital.db) -- a separate database because GCAT now serves two sections, Launches and the ON-ORBIT overview. Matching GCAT launches to LL2 launches by date + site, with method/confidence in launch_payloads, becomes a separate step once LL2 ingestion exists.</w:t>
       </w:r>
     </w:p>
@@ -10304,6 +10806,9 @@
     </w:p>
     <w:p>
       <w:r>
+        <w:rPr>
+          <w:color w:val="008000"/>
+        </w:rPr>
         <w:t>The data will be held in five tables in a new domain database (SQLite, WAL mode; planned as ingestionDBs/launches.db, under the 2026-10 convention databases/ingestion&lt;Source&gt;.db, published into a site file) — consistent with this project’s one-process-per-domain, one-database-per-domain principle. launches links to spacecraft and launch_vehicles by a clean foreign key (both LL2-native, no matching needed); it links to gcat_payloads only indirectly, through the fuzzy-matched launch_payloads table, since GCAT is a separate, unlinked catalogue. As built, GCAT’s own tables live in ingestionGCAT.db (see ingestGcat.py above); launches.db keeps the LL2 tables and the launch_payloads link.</w:t>
       </w:r>
     </w:p>
@@ -10692,41 +11197,65 @@
     </w:p>
     <w:p>
       <w:r>
+        <w:rPr>
+          <w:color w:val="008000"/>
+        </w:rPr>
         <w:t xml:space="preserve">        TEXT rcsCategory</w:t>
       </w:r>
     </w:p>
     <w:p>
       <w:r>
+        <w:rPr>
+          <w:color w:val="008000"/>
+        </w:rPr>
         <w:t xml:space="preserve">        TEXT downlinkBand</w:t>
       </w:r>
     </w:p>
     <w:p>
       <w:r>
+        <w:rPr>
+          <w:color w:val="008000"/>
+        </w:rPr>
         <w:t xml:space="preserve">        REAL eirpDbw</w:t>
       </w:r>
     </w:p>
     <w:p>
       <w:r>
+        <w:rPr>
+          <w:color w:val="008000"/>
+        </w:rPr>
         <w:t xml:space="preserve">        TEXT eirpSource</w:t>
       </w:r>
     </w:p>
     <w:p>
       <w:r>
+        <w:rPr>
+          <w:color w:val="008000"/>
+        </w:rPr>
         <w:t xml:space="preserve">        REAL satGtDbk</w:t>
       </w:r>
     </w:p>
     <w:p>
       <w:r>
+        <w:rPr>
+          <w:color w:val="008000"/>
+        </w:rPr>
         <w:t xml:space="preserve">        REAL dlFreqHz</w:t>
       </w:r>
     </w:p>
     <w:p>
       <w:r>
+        <w:rPr>
+          <w:color w:val="008000"/>
+        </w:rPr>
         <w:t xml:space="preserve">        REAL ulFreqHz</w:t>
       </w:r>
     </w:p>
     <w:p>
       <w:r>
+        <w:rPr>
+          <w:color w:val="008000"/>
+        </w:rPr>
         <w:t xml:space="preserve">        TEXT rfSource</w:t>
       </w:r>
     </w:p>
@@ -10907,6 +11436,9 @@
     </w:p>
     <w:p>
       <w:r>
+        <w:rPr>
+          <w:color w:val="008000"/>
+        </w:rPr>
         <w:t xml:space="preserve">    ING2 --&gt; GDB[(ingestionGCAT.db: gcatObjects, gcatPayloads, gcatOrgs, gcatLaunches)]</w:t>
       </w:r>
     </w:p>
@@ -11055,6 +11587,7 @@
     <w:p>
       <w:r>
         <w:rPr>
+          <w:color w:val="008000"/>
           <w:highlight w:val="yellow"/>
         </w:rPr>
         <w:t>Industry infrastructure asset data is held in its own SQLite database -- as implemented, databases/ingestionGroundSegment.db (groundSegmentAssets.db until 2026-10-21; never infrastructure.db), published unchanged into siteGroundSegment.db, which the website reads. Al’s grndSgmntAssets_master.xlsx (DEV/LCARS/rschGrdSgmt/) is the authoritative, hand-edited source (new categories and corrections are made directly in that spreadsheet, not via ad hoc SQL), and scripts/ingestionGroundSegment.py (moved into the repo from rschGrdSgmt/build_ground_segment_db.py) rebuilds the database from it on the laptop, reading the spreadsheet read-only; the rebuilt database is committed and carried to the server by the deploy (decision D). The original nine per-category spreadsheets under infrastructureRsch/ were the research inputs used to build the master once; they’re now historical/frozen and no longer read. The API server’s role is a read-only GET /api/ground-segment-assets endpoint (not /api/infrastructure as originally named here), matching the existing /api/news handler’s shape.</w:t>

</xml_diff>

<commit_message>
Bug 10 (.htaccess gap after DB refactor) fixed on LIVE: bug log, design doc security, plan
Co-Authored-By: Claude Opus 5.5 <noreply@anthropic.com>
</commit_message>
<xml_diff>
--- a/0_documentation/designAndArchitecture_0.4.docx
+++ b/0_documentation/designAndArchitecture_0.4.docx
@@ -5202,7 +5202,10 @@
         <w:pStyle w:val="ListParagraph"/>
       </w:pPr>
       <w:r>
-        <w:t>Web server (live only) — rewrite rules appended to the app's .htaccess, after the CloudLinux/Passenger blocks, refuse (403) the scripts/, ingestionDBs/, tmp/, __pycache__/ and public/ folders, code, script, database, backup, spreadsheet, credential, log and archive files, and dot-files. The rules exist only on the server (.htaccess is excluded from deploys, so they survive them); a copy should be kept in the repository.</w:t>
+        <w:rPr>
+          <w:color w:val="008000"/>
+        </w:rPr>
+        <w:t>Web server (live only) — rewrite rules appended to the app's .htaccess, after the CloudLinux/Passenger blocks, refuse (403) the scripts/, databases/, ingestionDBs/, tmp/, __pycache__/ and public/ folders, code, script, database, backup, spreadsheet, credential, log and archive files, and dot-files. The rules exist only on the server (.htaccess is excluded from deploys, so they survive them); a copy should be kept in the repository.</w:t>
       </w:r>
     </w:p>
     <w:p>
@@ -5213,7 +5216,18 @@
         <w:rPr>
           <w:color w:val="008000"/>
         </w:rPr>
-        <w:t>Open since the database refactor (found 2026-10-22) — the rules name the old ingestionDBs/ folder and refuse database files by extension, but not the new databases/ folder: on the live server databases/siteOrbital.db is refused (403) while databases/siteOrbital.db.prev, siteNews.db.prev and .writers.lock are served (200). The rules need databases/ added (and .prev / .tmp copies refused) on the server, and a copy kept in the repository.</w:t>
+        <w:t>Fixed 2026-10-22 (bug 10, a bug 7 regression found that day) — after the database refactor the rules still named only the old ingestionDBs/ folder and the .db extension, so on the live server databases/siteOrbital.db.prev, siteNews.db.prev and .writers.lock were served (200). The rules now also refuse the databases/ folder; the extensions prev, tmp, new, lock and objects; and every dot-file and dot-folder ((^|/)\.), which covers .writers.lock, .referenceUpload/ and .deployStage/. Checked from the server: siteOrbital.db, .db.prev, .db.tmp, .writers.lock and ingestionDBs/ all return 403, while the pages and APIs still return 200. The previous file is backed up as ~/backups/LCARS-FAS.htaccess.pre-dbRefactor-20261022-115511. Regression guard: 0_tools/liveCheck.py’s privacy section requests 15 private paths and expects each to be refused.</w:t>
+      </w:r>
+    </w:p>
+    <w:p>
+      <w:pPr>
+        <w:pStyle w:val="ListParagraph"/>
+      </w:pPr>
+      <w:r>
+        <w:rPr>
+          <w:color w:val="008000"/>
+        </w:rPr>
+        <w:t>Process — the server-only .htaccess is a block list, not an allow list: any new file type or folder under the app root must be added to it, and to liveCheck.py’s privacy list, which is the check. Run python 0_tools/liveCheck.py after any deploy that adds one.</w:t>
       </w:r>
     </w:p>
     <w:p>

</xml_diff>

<commit_message>
Rename 0_tools/liveCheck.py to checkLiveDeployment.py
Test file, User-Agent, plan and design-doc references renamed to match.

Co-Authored-By: Claude Opus 5.5 <noreply@anthropic.com>
</commit_message>
<xml_diff>
--- a/0_documentation/designAndArchitecture_0.4.docx
+++ b/0_documentation/designAndArchitecture_0.4.docx
@@ -5216,7 +5216,7 @@
         <w:rPr>
           <w:color w:val="008000"/>
         </w:rPr>
-        <w:t>Fixed 2026-10-22 (bug 10, a bug 7 regression found that day) — after the database refactor the rules still named only the old ingestionDBs/ folder and the .db extension, so on the live server databases/siteOrbital.db.prev, siteNews.db.prev and .writers.lock were served (200). The rules now also refuse the databases/ folder; the extensions prev, tmp, new, lock and objects; and every dot-file and dot-folder ((^|/)\.), which covers .writers.lock, .referenceUpload/ and .deployStage/. Checked from the server: siteOrbital.db, .db.prev, .db.tmp, .writers.lock and ingestionDBs/ all return 403, while the pages and APIs still return 200. The previous file is backed up as ~/backups/LCARS-FAS.htaccess.pre-dbRefactor-20261022-115511. Regression guard: 0_tools/liveCheck.py’s privacy section requests 15 private paths and expects each to be refused.</w:t>
+        <w:t>Fixed 2026-10-22 (bug 10, a bug 7 regression found that day) — after the database refactor the rules still named only the old ingestionDBs/ folder and the .db extension, so on the live server databases/siteOrbital.db.prev, siteNews.db.prev and .writers.lock were served (200). The rules now also refuse the databases/ folder; the extensions prev, tmp, new, lock and objects; and every dot-file and dot-folder ((^|/)\.), which covers .writers.lock, .referenceUpload/ and .deployStage/. Checked from the server: siteOrbital.db, .db.prev, .db.tmp, .writers.lock and ingestionDBs/ all return 403, while the pages and APIs still return 200. The previous file is backed up as ~/backups/LCARS-FAS.htaccess.pre-dbRefactor-20261022-115511. Regression guard: 0_tools/checkLiveDeployment.py’s privacy section requests 15 private paths and expects each to be refused.</w:t>
       </w:r>
     </w:p>
     <w:p>
@@ -5227,7 +5227,7 @@
         <w:rPr>
           <w:color w:val="008000"/>
         </w:rPr>
-        <w:t>Process — the server-only .htaccess is a block list, not an allow list: any new file type or folder under the app root must be added to it, and to liveCheck.py’s privacy list, which is the check. Run python 0_tools/liveCheck.py after any deploy that adds one.</w:t>
+        <w:t>Process — the server-only .htaccess is a block list, not an allow list: any new file type or folder under the app root must be added to it, and to checkLiveDeployment.py’s privacy list, which is the check. Run python 0_tools/checkLiveDeployment.py after any deploy that adds one.</w:t>
       </w:r>
     </w:p>
     <w:p>

</xml_diff>